<commit_message>
Add explicit link between benefits and per-team technical skills
Co-Authored-By: Claude Opus 5.5 <noreply@anthropic.com>
Claude-Session: https://claude.ai/code/session_01Bn92zzRaddwAb3gDsMK7YA
</commit_message>
<xml_diff>
--- a/entrega/Planificacion_DevOps_Dojo_Miguel_Guzman.docx
+++ b/entrega/Planificacion_DevOps_Dojo_Miguel_Guzman.docx
@@ -3346,6 +3346,15 @@
     </w:p>
     <w:p>
       <w:pPr>
+        <w:spacing w:after="120"/>
+        <w:jc w:val="both"/>
+      </w:pPr>
+      <w:r>
+        <w:t xml:space="preserve">Además, el Dojo desarrolla habilidades técnicas específicas en cada equipo (Kubernetes, optimización de MongoDB, pruebas de carga y seguridad), detalladas en la tabla 5.</w:t>
+      </w:r>
+    </w:p>
+    <w:p>
+      <w:pPr>
         <w:pStyle w:val="Heading1"/>
       </w:pPr>
       <w:r>
@@ -3386,17 +3395,17 @@
         <w:t xml:space="preserve">replica set de MongoDB</w:t>
       </w:r>
       <w:r>
-        <w:t xml:space="preserve"> (solo optimización y monitoreo) y las cinco áreas que intervienen en su ciclo de vida: Desarrollo, Operaciones, Bases de datos, Calidad y Seguridad. Las prácticas se realizan en un </w:t>
+        <w:t xml:space="preserve"> (solo optimización y monitoreo) y las cinco áreas que intervienen en su ciclo de vida: Desarrollo, Operaciones, Bases de datos, Calidad y Seguridad. Las prácticas se realizan en </w:t>
       </w:r>
       <w:r>
         <w:rPr>
           <w:b/>
           <w:bCs/>
         </w:rPr>
-        <w:t xml:space="preserve">clúster Kubernetes de pre-producción</w:t>
-      </w:r>
-      <w:r>
-        <w:t xml:space="preserve"> y en una copia del replica set con datos anonimizados.</w:t>
+        <w:t xml:space="preserve">pre-producción</w:t>
+      </w:r>
+      <w:r>
+        <w:t xml:space="preserve"> con datos anonimizados.</w:t>
       </w:r>
     </w:p>
     <w:p>
@@ -4571,7 +4580,7 @@
         <w:t xml:space="preserve">sharding</w:t>
       </w:r>
       <w:r>
-        <w:t xml:space="preserve">), reescribir la aplicación e implantar varias regiones. Si tras la optimización el primario sigue por encima del 70 % de CPU, se recomendará evaluar su escalado en la segunda fase.</w:t>
+        <w:t xml:space="preserve">) y reescribir la aplicación.</w:t>
       </w:r>
     </w:p>
     <w:p>
@@ -18078,7 +18087,7 @@
       <w:r>
         <w:t xml:space="preserve">. </w:t>
       </w:r>
-      <w:hyperlink w:history="1" r:id="rIdlj_rvvyadzosblauoqqk8">
+      <w:hyperlink w:history="1" r:id="rIdbzme-jbvoej3g9rprivis">
         <w:r>
           <w:rPr>
             <w:rStyle w:val="Hyperlink"/>
@@ -18146,7 +18155,7 @@
       <w:r>
         <w:t xml:space="preserve">. The Kubernetes Authors. </w:t>
       </w:r>
-      <w:hyperlink w:history="1" r:id="rIdwnqjc1o7xt2ybgylho9ie">
+      <w:hyperlink w:history="1" r:id="rId_x_t3ajnmlmk-_ojeaeug">
         <w:r>
           <w:rPr>
             <w:rStyle w:val="Hyperlink"/>
@@ -18174,7 +18183,7 @@
       <w:r>
         <w:t xml:space="preserve"> [Ruta de aprendizaje]. Microsoft Learn. </w:t>
       </w:r>
-      <w:hyperlink w:history="1" r:id="rIddlwh-bbfjqh1w8qa7_jox">
+      <w:hyperlink w:history="1" r:id="rIdgnd3jeqsvn2rvxjkjgzwd">
         <w:r>
           <w:rPr>
             <w:rStyle w:val="Hyperlink"/>
@@ -18202,7 +18211,7 @@
       <w:r>
         <w:t xml:space="preserve">. Azure DevOps Blog. </w:t>
       </w:r>
-      <w:hyperlink w:history="1" r:id="rIdbceb5hhnul2qh6vjg94c7">
+      <w:hyperlink w:history="1" r:id="rIdvwo3bpqo3chsfoerhej5n">
         <w:r>
           <w:rPr>
             <w:rStyle w:val="Hyperlink"/>
@@ -18230,7 +18239,7 @@
       <w:r>
         <w:t xml:space="preserve">. MongoDB Manual. </w:t>
       </w:r>
-      <w:hyperlink w:history="1" r:id="rIdvlwqqqdecuih4ylks-sso">
+      <w:hyperlink w:history="1" r:id="rIdt0rc-0su_1quokqm_f84p">
         <w:r>
           <w:rPr>
             <w:rStyle w:val="Hyperlink"/>

</xml_diff>

<commit_message>
Fix APA 7 references and replace unverifiable sources
Co-Authored-By: Claude Opus 5.5 <noreply@anthropic.com>
Claude-Session: https://claude.ai/code/session_01Bn92zzRaddwAb3gDsMK7YA
</commit_message>
<xml_diff>
--- a/entrega/Planificacion_DevOps_Dojo_Miguel_Guzman.docx
+++ b/entrega/Planificacion_DevOps_Dojo_Miguel_Guzman.docx
@@ -391,7 +391,7 @@
         <w:t xml:space="preserve">reto real de su propio producto</w:t>
       </w:r>
       <w:r>
-        <w:t xml:space="preserve">, guiados por mentores y sin poner en riesgo la producción (Microsoft, 2021, s. f.).</w:t>
+        <w:t xml:space="preserve">, guiados por mentores y sin poner en riesgo la producción (Microsoft, 2021).</w:t>
       </w:r>
     </w:p>
     <w:p>
@@ -400,7 +400,7 @@
         <w:jc w:val="both"/>
       </w:pPr>
       <w:r>
-        <w:t xml:space="preserve">Este documento planifica un Dojo de 12 semanas para una organización ficticia cuya aplicación se cae al superar los 5 000 usuarios concurrentes. No es un proyecto de migración tradicional: el equipo aprende a diagnosticar, optimizar y operar la aplicación en Kubernetes, de modo que la solución y las competencias permanezcan en la organización (DORA, s. f.; Forsgren et al., 2018).</w:t>
+        <w:t xml:space="preserve">Este documento planifica un Dojo de 12 semanas para una organización ficticia cuya aplicación se cae al superar los 5 000 usuarios concurrentes. No es un proyecto de migración tradicional: el equipo aprende a diagnosticar, optimizar y operar la aplicación en Kubernetes, de modo que la solución y las competencias permanezcan en la organización (DORA, 2024; Forsgren et al., 2018).</w:t>
       </w:r>
     </w:p>
     <w:p>
@@ -464,7 +464,7 @@
         <w:t xml:space="preserve">MongoDB en replica set</w:t>
       </w:r>
       <w:r>
-        <w:t xml:space="preserve"> de tres nodos (MongoDB, s. f.). En los picos de quincena y fin de mes el portal alcanza unos </w:t>
+        <w:t xml:space="preserve"> de tres nodos (MongoDB, Inc., s. f.). En los picos de quincena y fin de mes el portal alcanza unos </w:t>
       </w:r>
       <w:r>
         <w:rPr>
@@ -6257,7 +6257,7 @@
         <w:t xml:space="preserve">primero medir, después optimizar y por último escalar</w:t>
       </w:r>
       <w:r>
-        <w:t xml:space="preserve"> con el HPA (Kubernetes, s. f.), porque escalar una aplicación ineficiente solo multiplica las conexiones a MongoDB.</w:t>
+        <w:t xml:space="preserve"> con el HPA (The Kubernetes Authors, s. f.), porque escalar una aplicación ineficiente solo multiplica las conexiones a MongoDB.</w:t>
       </w:r>
     </w:p>
     <w:tbl>
@@ -18075,24 +18075,24 @@
         <w:jc w:val="left"/>
       </w:pPr>
       <w:r>
-        <w:t xml:space="preserve">DORA. (s. f.). </w:t>
+        <w:t xml:space="preserve">DORA. (2024). </w:t>
       </w:r>
       <w:r>
         <w:rPr>
           <w:i/>
           <w:iCs/>
         </w:rPr>
-        <w:t xml:space="preserve">How to transform your organization</w:t>
-      </w:r>
-      <w:r>
-        <w:t xml:space="preserve">. </w:t>
-      </w:r>
-      <w:hyperlink w:history="1" r:id="rIdbzme-jbvoej3g9rprivis">
+        <w:t xml:space="preserve">Accelerate State of DevOps Report 2024</w:t>
+      </w:r>
+      <w:r>
+        <w:t xml:space="preserve">. Google Cloud. </w:t>
+      </w:r>
+      <w:hyperlink w:history="1" r:id="rIdyfi_pkelrivxhyndkizyg">
         <w:r>
           <w:rPr>
             <w:rStyle w:val="Hyperlink"/>
           </w:rPr>
-          <w:t xml:space="preserve">https://dora.dev/guides/how-to-transform/</w:t>
+          <w:t xml:space="preserve">https://dora.dev/dora-report-2024</w:t>
         </w:r>
       </w:hyperlink>
     </w:p>
@@ -18110,7 +18110,7 @@
           <w:i/>
           <w:iCs/>
         </w:rPr>
-        <w:t xml:space="preserve">Accelerate: The science of lean software and DevOps. Building and scaling high performing technology organizations</w:t>
+        <w:t xml:space="preserve">Accelerate: The science of lean software and DevOps: Building and scaling high performing technology organizations</w:t>
       </w:r>
       <w:r>
         <w:t xml:space="preserve">. IT Revolution Press.</w:t>
@@ -18143,75 +18143,19 @@
         <w:jc w:val="left"/>
       </w:pPr>
       <w:r>
-        <w:t xml:space="preserve">Kubernetes. (s. f.). </w:t>
+        <w:t xml:space="preserve">Microsoft. (2021, 7 de mayo). Intro of DevOps Dojo. </w:t>
       </w:r>
       <w:r>
         <w:rPr>
           <w:i/>
           <w:iCs/>
         </w:rPr>
-        <w:t xml:space="preserve">Horizontal Pod Autoscaling</w:t>
-      </w:r>
-      <w:r>
-        <w:t xml:space="preserve">. The Kubernetes Authors. </w:t>
-      </w:r>
-      <w:hyperlink w:history="1" r:id="rId_x_t3ajnmlmk-_ojeaeug">
-        <w:r>
-          <w:rPr>
-            <w:rStyle w:val="Hyperlink"/>
-          </w:rPr>
-          <w:t xml:space="preserve">https://kubernetes.io/docs/tasks/run-application/horizontal-pod-autoscale/</w:t>
-        </w:r>
-      </w:hyperlink>
-    </w:p>
-    <w:p>
-      <w:pPr>
-        <w:spacing w:after="100" w:line="240" w:lineRule="auto"/>
-        <w:ind w:left="720" w:hanging="720"/>
-        <w:jc w:val="left"/>
-      </w:pPr>
-      <w:r>
-        <w:t xml:space="preserve">Microsoft. (s. f.). </w:t>
-      </w:r>
-      <w:r>
-        <w:rPr>
-          <w:i/>
-          <w:iCs/>
-        </w:rPr>
-        <w:t xml:space="preserve">Introduce DevOps Dojo: Create efficiencies that support your business</w:t>
-      </w:r>
-      <w:r>
-        <w:t xml:space="preserve"> [Ruta de aprendizaje]. Microsoft Learn. </w:t>
-      </w:r>
-      <w:hyperlink w:history="1" r:id="rIdgnd3jeqsvn2rvxjkjgzwd">
-        <w:r>
-          <w:rPr>
-            <w:rStyle w:val="Hyperlink"/>
-          </w:rPr>
-          <w:t xml:space="preserve">https://learn.microsoft.com/en-us/training/paths/devops-dojo-white-belt-foundation/</w:t>
-        </w:r>
-      </w:hyperlink>
-    </w:p>
-    <w:p>
-      <w:pPr>
-        <w:spacing w:after="100" w:line="240" w:lineRule="auto"/>
-        <w:ind w:left="720" w:hanging="720"/>
-        <w:jc w:val="left"/>
-      </w:pPr>
-      <w:r>
-        <w:t xml:space="preserve">Microsoft. (2021). </w:t>
-      </w:r>
-      <w:r>
-        <w:rPr>
-          <w:i/>
-          <w:iCs/>
-        </w:rPr>
-        <w:t xml:space="preserve">Intro of DevOps Dojo</w:t>
-      </w:r>
-      <w:r>
-        <w:t xml:space="preserve">. Azure DevOps Blog. </w:t>
-      </w:r>
-      <w:hyperlink w:history="1" r:id="rIdvwo3bpqo3chsfoerhej5n">
+        <w:t xml:space="preserve">Azure DevOps Blog</w:t>
+      </w:r>
+      <w:r>
+        <w:t xml:space="preserve">. </w:t>
+      </w:r>
+      <w:hyperlink w:history="1" r:id="rId5yee_iqocrkir0psh4czb">
         <w:r>
           <w:rPr>
             <w:rStyle w:val="Hyperlink"/>
@@ -18227,7 +18171,7 @@
         <w:jc w:val="left"/>
       </w:pPr>
       <w:r>
-        <w:t xml:space="preserve">MongoDB. (s. f.). </w:t>
+        <w:t xml:space="preserve">MongoDB, Inc. (s. f.). </w:t>
       </w:r>
       <w:r>
         <w:rPr>
@@ -18237,14 +18181,42 @@
         <w:t xml:space="preserve">Replication</w:t>
       </w:r>
       <w:r>
-        <w:t xml:space="preserve">. MongoDB Manual. </w:t>
-      </w:r>
-      <w:hyperlink w:history="1" r:id="rIdt0rc-0su_1quokqm_f84p">
+        <w:t xml:space="preserve">. MongoDB Manual. Recuperado el 28 de octubre de 2026, de </w:t>
+      </w:r>
+      <w:hyperlink w:history="1" r:id="rIdmnmuykpoqptbam0liv_gc">
         <w:r>
           <w:rPr>
             <w:rStyle w:val="Hyperlink"/>
           </w:rPr>
           <w:t xml:space="preserve">https://www.mongodb.com/docs/manual/replication/</w:t>
+        </w:r>
+      </w:hyperlink>
+    </w:p>
+    <w:p>
+      <w:pPr>
+        <w:spacing w:after="100" w:line="240" w:lineRule="auto"/>
+        <w:ind w:left="720" w:hanging="720"/>
+        <w:jc w:val="left"/>
+      </w:pPr>
+      <w:r>
+        <w:t xml:space="preserve">The Kubernetes Authors. (s. f.). </w:t>
+      </w:r>
+      <w:r>
+        <w:rPr>
+          <w:i/>
+          <w:iCs/>
+        </w:rPr>
+        <w:t xml:space="preserve">Horizontal Pod Autoscaling</w:t>
+      </w:r>
+      <w:r>
+        <w:t xml:space="preserve">. Kubernetes Documentation. Recuperado el 28 de octubre de 2026, de </w:t>
+      </w:r>
+      <w:hyperlink w:history="1" r:id="rIdaandxdzs9gbg-jjkgejsf">
+        <w:r>
+          <w:rPr>
+            <w:rStyle w:val="Hyperlink"/>
+          </w:rPr>
+          <w:t xml:space="preserve">https://kubernetes.io/docs/tasks/run-application/horizontal-pod-autoscale/</w:t>
         </w:r>
       </w:hyperlink>
     </w:p>

</xml_diff>

<commit_message>
Apply review fixes: unified latency target, k6 scenario, capacity sizing, competency rubric, APA captions
Co-Authored-By: Claude Opus 5.5 <noreply@anthropic.com>
Claude-Session: https://claude.ai/code/session_01Bn92zzRaddwAb3gDsMK7YA
</commit_message>
<xml_diff>
--- a/entrega/Planificacion_DevOps_Dojo_Miguel_Guzman.docx
+++ b/entrega/Planificacion_DevOps_Dojo_Miguel_Guzman.docx
@@ -351,7 +351,7 @@
       <w:pPr>
         <w:sectPr>
           <w:pgSz w:w="11906" w:h="16838" w:orient="portrait"/>
-          <w:pgMar w:top="1418" w:right="1418" w:bottom="1418" w:left="1418" w:header="708" w:footer="708" w:gutter="0"/>
+          <w:pgMar w:top="1134" w:right="1418" w:bottom="1134" w:left="1418" w:header="708" w:footer="708" w:gutter="0"/>
           <w:pgNumType/>
           <w:docGrid w:linePitch="360"/>
         </w:sectPr>
@@ -400,7 +400,7 @@
         <w:jc w:val="both"/>
       </w:pPr>
       <w:r>
-        <w:t xml:space="preserve">Este documento planifica un Dojo de 12 semanas para una organización ficticia cuya aplicación se cae al superar los 5 000 usuarios concurrentes. No es un proyecto de migración tradicional: el equipo aprende a diagnosticar, optimizar y operar la aplicación en Kubernetes, de modo que la solución y las competencias permanezcan en la organización (DORA, 2024; Forsgren et al., 2018).</w:t>
+        <w:t xml:space="preserve">Este documento planifica un Dojo de 12 semanas para una organización ficticia cuya aplicación se cae al superar los 5 000 usuarios concurrentes; el equipo aprende a diagnosticar, optimizar y operar la aplicación en Kubernetes, de modo que las competencias permanezcan en la organización (DORA, 2024; Forsgren et al., 2018).</w:t>
       </w:r>
     </w:p>
     <w:p>
@@ -485,6 +485,23 @@
       </w:r>
       <w:r>
         <w:t xml:space="preserve"> es soportar una campaña comercial que duplicará la demanda (10 000 usuarios concurrentes) con una disponibilidad del 99,9 %.</w:t>
+      </w:r>
+    </w:p>
+    <w:p>
+      <w:pPr>
+        <w:keepNext/>
+        <w:spacing w:after="60" w:before="120"/>
+        <w:jc w:val="center"/>
+      </w:pPr>
+      <w:r>
+        <w:rPr>
+          <w:i/>
+          <w:iCs/>
+          <w:color w:val="404040"/>
+          <w:sz w:val="20"/>
+          <w:szCs w:val="20"/>
+        </w:rPr>
+        <w:t xml:space="preserve">Tabla 1. Situación inicial de NovaSoft Soluciones (supuestos ficticios del caso).</w:t>
       </w:r>
     </w:p>
     <w:tbl>
@@ -609,7 +626,7 @@
                 <w:sz w:val="18"/>
                 <w:szCs w:val="18"/>
               </w:rPr>
-              <w:t xml:space="preserve">Causa probable observada</w:t>
+              <w:t xml:space="preserve">Hipótesis de causa (a verificar)</w:t>
             </w:r>
           </w:p>
         </w:tc>
@@ -1312,7 +1329,20 @@
     </w:tbl>
     <w:p>
       <w:pPr>
-        <w:spacing w:after="100" w:before="40"/>
+        <w:spacing w:after="0" w:before="0" w:line="200" w:lineRule="auto"/>
+      </w:pPr>
+      <w:r>
+        <w:rPr>
+          <w:sz w:val="10"/>
+          <w:szCs w:val="10"/>
+        </w:rPr>
+        <w:t xml:space="preserve"/>
+      </w:r>
+    </w:p>
+    <w:p>
+      <w:pPr>
+        <w:keepNext/>
+        <w:spacing w:after="60" w:before="120"/>
         <w:jc w:val="center"/>
       </w:pPr>
       <w:r>
@@ -1323,7 +1353,7 @@
           <w:sz w:val="20"/>
           <w:szCs w:val="20"/>
         </w:rPr>
-        <w:t xml:space="preserve">Tabla 1. Situación inicial de NovaSoft Soluciones (datos ficticios).</w:t>
+        <w:t xml:space="preserve">Figura 1. Arquitectura actual frente a la arquitectura objetivo que construirá el equipo durante el Dojo.</w:t>
       </w:r>
     </w:p>
     <w:p>
@@ -1375,7 +1405,100 @@
     </w:p>
     <w:p>
       <w:pPr>
-        <w:spacing w:after="100" w:before="40"/>
+        <w:spacing w:after="120"/>
+        <w:jc w:val="both"/>
+      </w:pPr>
+      <w:r>
+        <w:t xml:space="preserve">Todas las cifras del caso son </w:t>
+      </w:r>
+      <w:r>
+        <w:rPr>
+          <w:b/>
+          <w:bCs/>
+        </w:rPr>
+        <w:t xml:space="preserve">supuestos ficticios</w:t>
+      </w:r>
+      <w:r>
+        <w:t xml:space="preserve"> y las causas de la tabla 1 son hipótesis. En las semanas 1 a 3 se comprobará el origen de la saturación de MongoDB correlacionando, bajo carga, las conexiones y la memoria del primario (caché de WiredTiger), las consultas lentas del perfilador (más de 100 ms) y el consumo de CPU de PHP-FPM frente al de MongoDB.</w:t>
+      </w:r>
+    </w:p>
+    <w:p>
+      <w:pPr>
+        <w:pStyle w:val="Heading1"/>
+      </w:pPr>
+      <w:r>
+        <w:t xml:space="preserve">2. Ejercicio 1. Objetivos del DevOps Dojo</w:t>
+      </w:r>
+    </w:p>
+    <w:p>
+      <w:pPr>
+        <w:pStyle w:val="Heading2"/>
+      </w:pPr>
+      <w:r>
+        <w:t xml:space="preserve">2.1. Objetivo general</w:t>
+      </w:r>
+    </w:p>
+    <w:p>
+      <w:pPr>
+        <w:spacing w:after="120"/>
+        <w:jc w:val="both"/>
+      </w:pPr>
+      <w:r>
+        <w:t xml:space="preserve">Desarrollar, en 12 semanas, las competencias del equipo del portal para diagnosticar problemas de rendimiento, optimizar el acceso a MongoDB y operar la aplicación Laravel en Kubernetes con autoescalado, de forma que, al finalizar el programa, el entorno de pre-producción </w:t>
+      </w:r>
+      <w:r>
+        <w:rPr>
+          <w:b/>
+          <w:bCs/>
+        </w:rPr>
+        <w:t xml:space="preserve">soporte 10 000 usuarios concurrentes</w:t>
+      </w:r>
+      <w:r>
+        <w:t xml:space="preserve"> (el doble del punto de quiebre actual) con una </w:t>
+      </w:r>
+      <w:r>
+        <w:rPr>
+          <w:b/>
+          <w:bCs/>
+        </w:rPr>
+        <w:t xml:space="preserve">latencia p95 inferior a 800 ms</w:t>
+      </w:r>
+      <w:r>
+        <w:t xml:space="preserve">, </w:t>
+      </w:r>
+      <w:r>
+        <w:rPr>
+          <w:b/>
+          <w:bCs/>
+        </w:rPr>
+        <w:t xml:space="preserve">menos del 1 % de errores</w:t>
+      </w:r>
+      <w:r>
+        <w:t xml:space="preserve"> y </w:t>
+      </w:r>
+      <w:r>
+        <w:rPr>
+          <w:b/>
+          <w:bCs/>
+        </w:rPr>
+        <w:t xml:space="preserve">sin caídas del replica set</w:t>
+      </w:r>
+      <w:r>
+        <w:t xml:space="preserve">. Este objetivo responde directamente a la meta estratégica de la campaña de 2027.</w:t>
+      </w:r>
+    </w:p>
+    <w:p>
+      <w:pPr>
+        <w:pStyle w:val="Heading2"/>
+      </w:pPr>
+      <w:r>
+        <w:t xml:space="preserve">2.2. Objetivos específicos</w:t>
+      </w:r>
+    </w:p>
+    <w:p>
+      <w:pPr>
+        <w:keepNext/>
+        <w:spacing w:after="60" w:before="120"/>
         <w:jc w:val="center"/>
       </w:pPr>
       <w:r>
@@ -1386,80 +1509,7 @@
           <w:sz w:val="20"/>
           <w:szCs w:val="20"/>
         </w:rPr>
-        <w:t xml:space="preserve">Figura 1. Arquitectura actual frente a la arquitectura objetivo que construirá el equipo durante el Dojo.</w:t>
-      </w:r>
-    </w:p>
-    <w:p>
-      <w:pPr>
-        <w:pStyle w:val="Heading1"/>
-      </w:pPr>
-      <w:r>
-        <w:t xml:space="preserve">2. Ejercicio 1. Objetivos del DevOps Dojo</w:t>
-      </w:r>
-    </w:p>
-    <w:p>
-      <w:pPr>
-        <w:pStyle w:val="Heading2"/>
-      </w:pPr>
-      <w:r>
-        <w:t xml:space="preserve">2.1. Objetivo general</w:t>
-      </w:r>
-    </w:p>
-    <w:p>
-      <w:pPr>
-        <w:spacing w:after="120"/>
-        <w:jc w:val="both"/>
-      </w:pPr>
-      <w:r>
-        <w:t xml:space="preserve">Desarrollar, en 12 semanas, las competencias del equipo del portal para diagnosticar problemas de rendimiento, optimizar el acceso a MongoDB y operar la aplicación Laravel en Kubernetes con autoescalado, de forma que, al finalizar el programa, el entorno de pre-producción </w:t>
-      </w:r>
-      <w:r>
-        <w:rPr>
-          <w:b/>
-          <w:bCs/>
-        </w:rPr>
-        <w:t xml:space="preserve">soporte 10 000 usuarios concurrentes</w:t>
-      </w:r>
-      <w:r>
-        <w:t xml:space="preserve"> (el doble del punto de quiebre actual) con una </w:t>
-      </w:r>
-      <w:r>
-        <w:rPr>
-          <w:b/>
-          <w:bCs/>
-        </w:rPr>
-        <w:t xml:space="preserve">latencia p95 inferior a 800 ms</w:t>
-      </w:r>
-      <w:r>
-        <w:t xml:space="preserve">, </w:t>
-      </w:r>
-      <w:r>
-        <w:rPr>
-          <w:b/>
-          <w:bCs/>
-        </w:rPr>
-        <w:t xml:space="preserve">menos del 1 % de errores</w:t>
-      </w:r>
-      <w:r>
-        <w:t xml:space="preserve"> y </w:t>
-      </w:r>
-      <w:r>
-        <w:rPr>
-          <w:b/>
-          <w:bCs/>
-        </w:rPr>
-        <w:t xml:space="preserve">sin caídas del replica set</w:t>
-      </w:r>
-      <w:r>
-        <w:t xml:space="preserve">. Este objetivo responde directamente a la meta estratégica de la campaña de 2027.</w:t>
-      </w:r>
-    </w:p>
-    <w:p>
-      <w:pPr>
-        <w:pStyle w:val="Heading2"/>
-      </w:pPr>
-      <w:r>
-        <w:t xml:space="preserve">2.2. Objetivos específicos</w:t>
+        <w:t xml:space="preserve">Tabla 2. Objetivos específicos, indicadores y plazos.</w:t>
       </w:r>
     </w:p>
     <w:tbl>
@@ -2311,7 +2361,7 @@
                 <w:sz w:val="18"/>
                 <w:szCs w:val="18"/>
               </w:rPr>
-              <w:t xml:space="preserve">Ante la caída de un pod, un nodo o el primario de MongoDB, recuperación en &lt; 1 min con errores &lt; 1 %.</w:t>
+              <w:t xml:space="preserve">Ante la caída de un pod, un nodo o el primario de MongoDB, recuperación automática en &lt; 1 min con errores &lt; 1 %.</w:t>
             </w:r>
           </w:p>
         </w:tc>
@@ -2460,7 +2510,37 @@
     </w:tbl>
     <w:p>
       <w:pPr>
-        <w:spacing w:after="100" w:before="40"/>
+        <w:spacing w:after="0" w:before="0" w:line="200" w:lineRule="auto"/>
+      </w:pPr>
+      <w:r>
+        <w:rPr>
+          <w:sz w:val="10"/>
+          <w:szCs w:val="10"/>
+        </w:rPr>
+        <w:t xml:space="preserve"/>
+      </w:r>
+    </w:p>
+    <w:p>
+      <w:pPr>
+        <w:spacing w:after="120"/>
+        <w:jc w:val="both"/>
+      </w:pPr>
+      <w:r>
+        <w:t xml:space="preserve">Los objetivos son alcanzables porque se trabaja sobre una sola aplicación, en pre-producción y con MongoDB fuera del clúster.</w:t>
+      </w:r>
+    </w:p>
+    <w:p>
+      <w:pPr>
+        <w:pStyle w:val="Heading1"/>
+      </w:pPr>
+      <w:r>
+        <w:t xml:space="preserve">3. Ejercicio 1. Beneficios esperados</w:t>
+      </w:r>
+    </w:p>
+    <w:p>
+      <w:pPr>
+        <w:keepNext/>
+        <w:spacing w:after="60" w:before="120"/>
         <w:jc w:val="center"/>
       </w:pPr>
       <w:r>
@@ -2471,24 +2551,7 @@
           <w:sz w:val="20"/>
           <w:szCs w:val="20"/>
         </w:rPr>
-        <w:t xml:space="preserve">Tabla 2. Objetivos específicos, indicadores y plazos.</w:t>
-      </w:r>
-    </w:p>
-    <w:p>
-      <w:pPr>
-        <w:spacing w:after="120"/>
-        <w:jc w:val="both"/>
-      </w:pPr>
-      <w:r>
-        <w:t xml:space="preserve">Los objetivos son alcanzables porque se trabaja sobre una sola aplicación, en pre-producción y con MongoDB fuera del clúster. La línea base se confirmará en las semanas 1 y 2.</w:t>
-      </w:r>
-    </w:p>
-    <w:p>
-      <w:pPr>
-        <w:pStyle w:val="Heading1"/>
-      </w:pPr>
-      <w:r>
-        <w:t xml:space="preserve">3. Ejercicio 1. Beneficios esperados</w:t>
+        <w:t xml:space="preserve">Tabla 3. Beneficios esperados, justificación y evidencia.</w:t>
       </w:r>
     </w:p>
     <w:tbl>
@@ -2784,7 +2847,7 @@
                 <w:sz w:val="18"/>
                 <w:szCs w:val="18"/>
               </w:rPr>
-              <w:t xml:space="preserve">Al reducir la carga y las conexiones a MongoDB se elimina la causa de las caídas, Kubernetes reinicia los pods que fallan y las páginas responden rápido en el pico. Protege los ingresos y la reputación.</w:t>
+              <w:t xml:space="preserve">Al reducir la carga y las conexiones a MongoDB se elimina la causa de las caídas, Kubernetes reinicia los pods que fallan y las alertas permiten actuar en minutos. Protege los ingresos y la reputación.</w:t>
             </w:r>
           </w:p>
         </w:tc>
@@ -2816,7 +2879,7 @@
                 <w:sz w:val="18"/>
                 <w:szCs w:val="18"/>
               </w:rPr>
-              <w:t xml:space="preserve">Caídas al mes; errores 5xx; latencia p95.</w:t>
+              <w:t xml:space="preserve">Caídas al mes; errores 5xx; latencia p95; MTTR.</w:t>
             </w:r>
           </w:p>
         </w:tc>
@@ -3057,209 +3120,6 @@
                 <w:sz w:val="18"/>
                 <w:szCs w:val="18"/>
               </w:rPr>
-              <w:t xml:space="preserve">Recuperación más rápida</w:t>
-            </w:r>
-          </w:p>
-        </w:tc>
-        <w:tc>
-          <w:tcPr>
-            <w:tcW w:type="dxa" w:w="5070"/>
-            <w:tcBorders>
-              <w:top w:val="single" w:color="8EA9C1" w:sz="4"/>
-              <w:left w:val="single" w:color="8EA9C1" w:sz="4"/>
-              <w:bottom w:val="single" w:color="8EA9C1" w:sz="4"/>
-              <w:right w:val="single" w:color="8EA9C1" w:sz="4"/>
-            </w:tcBorders>
-            <w:tcMar>
-              <w:top w:type="dxa" w:w="50"/>
-              <w:left w:type="dxa" w:w="80"/>
-              <w:bottom w:type="dxa" w:w="50"/>
-              <w:right w:type="dxa" w:w="80"/>
-            </w:tcMar>
-            <w:vAlign w:val="top"/>
-          </w:tcPr>
-          <w:p>
-            <w:pPr>
-              <w:spacing w:after="0" w:before="0" w:line="240"/>
-              <w:jc w:val="left"/>
-            </w:pPr>
-            <w:r>
-              <w:rPr>
-                <w:sz w:val="18"/>
-                <w:szCs w:val="18"/>
-              </w:rPr>
-              <w:t xml:space="preserve">Alertas tempranas, procedimientos documentados y prácticas de caos preparan al equipo para resolver incidencias en minutos.</w:t>
-            </w:r>
-          </w:p>
-        </w:tc>
-        <w:tc>
-          <w:tcPr>
-            <w:tcW w:type="dxa" w:w="1950"/>
-            <w:tcBorders>
-              <w:top w:val="single" w:color="8EA9C1" w:sz="4"/>
-              <w:left w:val="single" w:color="8EA9C1" w:sz="4"/>
-              <w:bottom w:val="single" w:color="8EA9C1" w:sz="4"/>
-              <w:right w:val="single" w:color="8EA9C1" w:sz="4"/>
-            </w:tcBorders>
-            <w:tcMar>
-              <w:top w:type="dxa" w:w="50"/>
-              <w:left w:type="dxa" w:w="80"/>
-              <w:bottom w:type="dxa" w:w="50"/>
-              <w:right w:type="dxa" w:w="80"/>
-            </w:tcMar>
-            <w:vAlign w:val="top"/>
-          </w:tcPr>
-          <w:p>
-            <w:pPr>
-              <w:spacing w:after="0" w:before="0" w:line="240"/>
-              <w:jc w:val="left"/>
-            </w:pPr>
-            <w:r>
-              <w:rPr>
-                <w:sz w:val="18"/>
-                <w:szCs w:val="18"/>
-              </w:rPr>
-              <w:t xml:space="preserve">Tiempo de recuperación (MTTR).</w:t>
-            </w:r>
-          </w:p>
-        </w:tc>
-      </w:tr>
-      <w:tr>
-        <w:trPr>
-          <w:cantSplit/>
-        </w:trPr>
-        <w:tc>
-          <w:tcPr>
-            <w:tcW w:type="dxa" w:w="2050"/>
-            <w:tcBorders>
-              <w:top w:val="single" w:color="8EA9C1" w:sz="4"/>
-              <w:left w:val="single" w:color="8EA9C1" w:sz="4"/>
-              <w:bottom w:val="single" w:color="8EA9C1" w:sz="4"/>
-              <w:right w:val="single" w:color="8EA9C1" w:sz="4"/>
-            </w:tcBorders>
-            <w:shd w:fill="F3F7FB" w:color="auto" w:val="clear"/>
-            <w:tcMar>
-              <w:top w:type="dxa" w:w="50"/>
-              <w:left w:type="dxa" w:w="80"/>
-              <w:bottom w:type="dxa" w:w="50"/>
-              <w:right w:type="dxa" w:w="80"/>
-            </w:tcMar>
-            <w:vAlign w:val="top"/>
-          </w:tcPr>
-          <w:p>
-            <w:pPr>
-              <w:spacing w:after="0" w:before="0" w:line="240"/>
-              <w:jc w:val="left"/>
-            </w:pPr>
-            <w:r>
-              <w:rPr>
-                <w:b/>
-                <w:bCs/>
-                <w:sz w:val="18"/>
-                <w:szCs w:val="18"/>
-              </w:rPr>
-              <w:t xml:space="preserve">Competencias propias</w:t>
-            </w:r>
-          </w:p>
-        </w:tc>
-        <w:tc>
-          <w:tcPr>
-            <w:tcW w:type="dxa" w:w="5070"/>
-            <w:tcBorders>
-              <w:top w:val="single" w:color="8EA9C1" w:sz="4"/>
-              <w:left w:val="single" w:color="8EA9C1" w:sz="4"/>
-              <w:bottom w:val="single" w:color="8EA9C1" w:sz="4"/>
-              <w:right w:val="single" w:color="8EA9C1" w:sz="4"/>
-            </w:tcBorders>
-            <w:shd w:fill="F3F7FB" w:color="auto" w:val="clear"/>
-            <w:tcMar>
-              <w:top w:type="dxa" w:w="50"/>
-              <w:left w:type="dxa" w:w="80"/>
-              <w:bottom w:type="dxa" w:w="50"/>
-              <w:right w:type="dxa" w:w="80"/>
-            </w:tcMar>
-            <w:vAlign w:val="top"/>
-          </w:tcPr>
-          <w:p>
-            <w:pPr>
-              <w:spacing w:after="0" w:before="0" w:line="240"/>
-              <w:jc w:val="left"/>
-            </w:pPr>
-            <w:r>
-              <w:rPr>
-                <w:sz w:val="18"/>
-                <w:szCs w:val="18"/>
-              </w:rPr>
-              <w:t xml:space="preserve">El equipo aprende Kubernetes, rendimiento y MongoDB haciendo, lo que reduce la dependencia de consultores externos.</w:t>
-            </w:r>
-          </w:p>
-        </w:tc>
-        <w:tc>
-          <w:tcPr>
-            <w:tcW w:type="dxa" w:w="1950"/>
-            <w:tcBorders>
-              <w:top w:val="single" w:color="8EA9C1" w:sz="4"/>
-              <w:left w:val="single" w:color="8EA9C1" w:sz="4"/>
-              <w:bottom w:val="single" w:color="8EA9C1" w:sz="4"/>
-              <w:right w:val="single" w:color="8EA9C1" w:sz="4"/>
-            </w:tcBorders>
-            <w:shd w:fill="F3F7FB" w:color="auto" w:val="clear"/>
-            <w:tcMar>
-              <w:top w:type="dxa" w:w="50"/>
-              <w:left w:type="dxa" w:w="80"/>
-              <w:bottom w:type="dxa" w:w="50"/>
-              <w:right w:type="dxa" w:w="80"/>
-            </w:tcMar>
-            <w:vAlign w:val="top"/>
-          </w:tcPr>
-          <w:p>
-            <w:pPr>
-              <w:spacing w:after="0" w:before="0" w:line="240"/>
-              <w:jc w:val="left"/>
-            </w:pPr>
-            <w:r>
-              <w:rPr>
-                <w:sz w:val="18"/>
-                <w:szCs w:val="18"/>
-              </w:rPr>
-              <w:t xml:space="preserve">Evaluación técnica inicial y final.</w:t>
-            </w:r>
-          </w:p>
-        </w:tc>
-      </w:tr>
-      <w:tr>
-        <w:trPr>
-          <w:cantSplit/>
-        </w:trPr>
-        <w:tc>
-          <w:tcPr>
-            <w:tcW w:type="dxa" w:w="2050"/>
-            <w:tcBorders>
-              <w:top w:val="single" w:color="8EA9C1" w:sz="4"/>
-              <w:left w:val="single" w:color="8EA9C1" w:sz="4"/>
-              <w:bottom w:val="single" w:color="8EA9C1" w:sz="4"/>
-              <w:right w:val="single" w:color="8EA9C1" w:sz="4"/>
-            </w:tcBorders>
-            <w:tcMar>
-              <w:top w:type="dxa" w:w="50"/>
-              <w:left w:type="dxa" w:w="80"/>
-              <w:bottom w:type="dxa" w:w="50"/>
-              <w:right w:type="dxa" w:w="80"/>
-            </w:tcMar>
-            <w:vAlign w:val="top"/>
-          </w:tcPr>
-          <w:p>
-            <w:pPr>
-              <w:spacing w:after="0" w:before="0" w:line="240"/>
-              <w:jc w:val="left"/>
-            </w:pPr>
-            <w:r>
-              <w:rPr>
-                <w:b/>
-                <w:bCs/>
-                <w:sz w:val="18"/>
-                <w:szCs w:val="18"/>
-              </w:rPr>
               <w:t xml:space="preserve">Colaboración Dev-Ops-DBA</w:t>
             </w:r>
           </w:p>
@@ -3330,7 +3190,84 @@
     </w:tbl>
     <w:p>
       <w:pPr>
-        <w:spacing w:after="100" w:before="40"/>
+        <w:spacing w:after="0" w:before="0" w:line="200" w:lineRule="auto"/>
+      </w:pPr>
+      <w:r>
+        <w:rPr>
+          <w:sz w:val="10"/>
+          <w:szCs w:val="10"/>
+        </w:rPr>
+        <w:t xml:space="preserve"/>
+      </w:r>
+    </w:p>
+    <w:p>
+      <w:pPr>
+        <w:spacing w:after="120"/>
+        <w:jc w:val="both"/>
+      </w:pPr>
+      <w:r>
+        <w:t xml:space="preserve">Además, el Dojo desarrolla habilidades técnicas específicas en cada equipo (Kubernetes, optimización de MongoDB, pruebas de carga y seguridad), lo que reduce la dependencia de consultores externos; el detalle está en la tabla 5.</w:t>
+      </w:r>
+    </w:p>
+    <w:p>
+      <w:pPr>
+        <w:pStyle w:val="Heading1"/>
+      </w:pPr>
+      <w:r>
+        <w:t xml:space="preserve">4. Ejercicio 2. Alcance del DevOps Dojo</w:t>
+      </w:r>
+    </w:p>
+    <w:p>
+      <w:pPr>
+        <w:spacing w:after="120"/>
+        <w:jc w:val="both"/>
+      </w:pPr>
+      <w:r>
+        <w:t xml:space="preserve">El Dojo abarca el </w:t>
+      </w:r>
+      <w:r>
+        <w:rPr>
+          <w:b/>
+          <w:bCs/>
+        </w:rPr>
+        <w:t xml:space="preserve">portal Laravel</w:t>
+      </w:r>
+      <w:r>
+        <w:t xml:space="preserve">, su </w:t>
+      </w:r>
+      <w:r>
+        <w:rPr>
+          <w:b/>
+          <w:bCs/>
+        </w:rPr>
+        <w:t xml:space="preserve">replica set de MongoDB</w:t>
+      </w:r>
+      <w:r>
+        <w:t xml:space="preserve"> (solo optimización y monitoreo) y las cinco áreas que intervienen en su ciclo de vida: Desarrollo, Operaciones, Bases de datos, Calidad y Seguridad. Las prácticas se realizan en </w:t>
+      </w:r>
+      <w:r>
+        <w:rPr>
+          <w:b/>
+          <w:bCs/>
+        </w:rPr>
+        <w:t xml:space="preserve">pre-producción</w:t>
+      </w:r>
+      <w:r>
+        <w:t xml:space="preserve"> con datos anonimizados.</w:t>
+      </w:r>
+    </w:p>
+    <w:p>
+      <w:pPr>
+        <w:pStyle w:val="Heading2"/>
+      </w:pPr>
+      <w:r>
+        <w:t xml:space="preserve">4.1. Temas y competencias que se cubrirán</w:t>
+      </w:r>
+    </w:p>
+    <w:p>
+      <w:pPr>
+        <w:keepNext/>
+        <w:spacing w:after="60" w:before="120"/>
         <w:jc w:val="center"/>
       </w:pPr>
       <w:r>
@@ -3341,79 +3278,7 @@
           <w:sz w:val="20"/>
           <w:szCs w:val="20"/>
         </w:rPr>
-        <w:t xml:space="preserve">Tabla 3. Beneficios esperados, justificación y evidencia.</w:t>
-      </w:r>
-    </w:p>
-    <w:p>
-      <w:pPr>
-        <w:spacing w:after="120"/>
-        <w:jc w:val="both"/>
-      </w:pPr>
-      <w:r>
-        <w:t xml:space="preserve">Además, el Dojo desarrolla habilidades técnicas específicas en cada equipo (Kubernetes, optimización de MongoDB, pruebas de carga y seguridad), detalladas en la tabla 5.</w:t>
-      </w:r>
-    </w:p>
-    <w:p>
-      <w:pPr>
-        <w:pStyle w:val="Heading1"/>
-      </w:pPr>
-      <w:r>
-        <w:t xml:space="preserve">4. Ejercicio 2. Alcance del DevOps Dojo</w:t>
-      </w:r>
-    </w:p>
-    <w:p>
-      <w:pPr>
-        <w:pStyle w:val="Heading2"/>
-      </w:pPr>
-      <w:r>
-        <w:t xml:space="preserve">4.1. Áreas y sistema incluidos</w:t>
-      </w:r>
-    </w:p>
-    <w:p>
-      <w:pPr>
-        <w:spacing w:after="120"/>
-        <w:jc w:val="both"/>
-      </w:pPr>
-      <w:r>
-        <w:t xml:space="preserve">El Dojo abarca el </w:t>
-      </w:r>
-      <w:r>
-        <w:rPr>
-          <w:b/>
-          <w:bCs/>
-        </w:rPr>
-        <w:t xml:space="preserve">portal Laravel</w:t>
-      </w:r>
-      <w:r>
-        <w:t xml:space="preserve">, su </w:t>
-      </w:r>
-      <w:r>
-        <w:rPr>
-          <w:b/>
-          <w:bCs/>
-        </w:rPr>
-        <w:t xml:space="preserve">replica set de MongoDB</w:t>
-      </w:r>
-      <w:r>
-        <w:t xml:space="preserve"> (solo optimización y monitoreo) y las cinco áreas que intervienen en su ciclo de vida: Desarrollo, Operaciones, Bases de datos, Calidad y Seguridad. Las prácticas se realizan en </w:t>
-      </w:r>
-      <w:r>
-        <w:rPr>
-          <w:b/>
-          <w:bCs/>
-        </w:rPr>
-        <w:t xml:space="preserve">pre-producción</w:t>
-      </w:r>
-      <w:r>
-        <w:t xml:space="preserve"> con datos anonimizados.</w:t>
-      </w:r>
-    </w:p>
-    <w:p>
-      <w:pPr>
-        <w:pStyle w:val="Heading2"/>
-      </w:pPr>
-      <w:r>
-        <w:t xml:space="preserve">4.2. Temas y competencias que se cubrirán</w:t>
+        <w:t xml:space="preserve">Tabla 4. Plan de temas y competencias del Dojo.</w:t>
       </w:r>
     </w:p>
     <w:tbl>
@@ -4499,7 +4364,88 @@
     </w:tbl>
     <w:p>
       <w:pPr>
-        <w:spacing w:after="100" w:before="40"/>
+        <w:spacing w:after="0" w:before="0" w:line="200" w:lineRule="auto"/>
+      </w:pPr>
+      <w:r>
+        <w:rPr>
+          <w:sz w:val="10"/>
+          <w:szCs w:val="10"/>
+        </w:rPr>
+        <w:t xml:space="preserve"/>
+      </w:r>
+    </w:p>
+    <w:p>
+      <w:pPr>
+        <w:pStyle w:val="Heading2"/>
+      </w:pPr>
+      <w:r>
+        <w:t xml:space="preserve">4.2. Entregables y elementos fuera del alcance</w:t>
+      </w:r>
+    </w:p>
+    <w:p>
+      <w:pPr>
+        <w:spacing w:after="120"/>
+        <w:jc w:val="both"/>
+      </w:pPr>
+      <w:r>
+        <w:rPr>
+          <w:b/>
+          <w:bCs/>
+        </w:rPr>
+        <w:t xml:space="preserve">Entregables:</w:t>
+      </w:r>
+      <w:r>
+        <w:t xml:space="preserve"> línea base de carga; MongoDB optimizado; aplicación sin estado en contenedores; canalización CI/CD con Helm; despliegue con autoescalado; controles de seguridad; panel y alertas; procedimientos de incidencias; e informe final con un </w:t>
+      </w:r>
+      <w:r>
+        <w:rPr>
+          <w:b/>
+          <w:bCs/>
+        </w:rPr>
+        <w:t xml:space="preserve">plan de migración a producción</w:t>
+      </w:r>
+      <w:r>
+        <w:t xml:space="preserve">.</w:t>
+      </w:r>
+    </w:p>
+    <w:p>
+      <w:pPr>
+        <w:spacing w:after="120"/>
+        <w:jc w:val="both"/>
+      </w:pPr>
+      <w:r>
+        <w:rPr>
+          <w:b/>
+          <w:bCs/>
+        </w:rPr>
+        <w:t xml:space="preserve">Fuera del alcance:</w:t>
+      </w:r>
+      <w:r>
+        <w:t xml:space="preserve"> la migración a producción (segunda fase), ejecutar MongoDB dentro de Kubernetes, fragmentar la base de datos (</w:t>
+      </w:r>
+      <w:r>
+        <w:rPr>
+          <w:i/>
+          <w:iCs/>
+        </w:rPr>
+        <w:t xml:space="preserve">sharding</w:t>
+      </w:r>
+      <w:r>
+        <w:t xml:space="preserve">) y reescribir la aplicación.</w:t>
+      </w:r>
+    </w:p>
+    <w:p>
+      <w:pPr>
+        <w:pStyle w:val="Heading1"/>
+      </w:pPr>
+      <w:r>
+        <w:t xml:space="preserve">5. Ejercicio 2. Equipos de trabajo participantes</w:t>
+      </w:r>
+    </w:p>
+    <w:p>
+      <w:pPr>
+        <w:keepNext/>
+        <w:spacing w:after="60" w:before="120"/>
         <w:jc w:val="center"/>
       </w:pPr>
       <w:r>
@@ -4510,104 +4456,7 @@
           <w:sz w:val="20"/>
           <w:szCs w:val="20"/>
         </w:rPr>
-        <w:t xml:space="preserve">Tabla 4. Plan de temas y competencias del Dojo.</w:t>
-      </w:r>
-    </w:p>
-    <w:p>
-      <w:pPr>
-        <w:pStyle w:val="Heading2"/>
-      </w:pPr>
-      <w:r>
-        <w:t xml:space="preserve">4.3. Entregables y elementos fuera del alcance</w:t>
-      </w:r>
-    </w:p>
-    <w:p>
-      <w:pPr>
-        <w:spacing w:after="120"/>
-        <w:jc w:val="both"/>
-      </w:pPr>
-      <w:r>
-        <w:rPr>
-          <w:b/>
-          <w:bCs/>
-        </w:rPr>
-        <w:t xml:space="preserve">Entregables:</w:t>
-      </w:r>
-      <w:r>
-        <w:t xml:space="preserve"> diagnóstico y línea base de carga; índices y configuración optimizada de MongoDB; aplicación sin estado en contenedores; canalización CI/CD con </w:t>
-      </w:r>
-      <w:r>
-        <w:rPr>
-          <w:i/>
-          <w:iCs/>
-        </w:rPr>
-        <w:t xml:space="preserve">chart</w:t>
-      </w:r>
-      <w:r>
-        <w:t xml:space="preserve"> de Helm; despliegue en Kubernetes con autoescalado; controles de seguridad; panel y alertas; procedimientos de incidencias; e informe final con un </w:t>
-      </w:r>
-      <w:r>
-        <w:rPr>
-          <w:b/>
-          <w:bCs/>
-        </w:rPr>
-        <w:t xml:space="preserve">plan de migración a producción</w:t>
-      </w:r>
-      <w:r>
-        <w:t xml:space="preserve"> y criterios de decisión.</w:t>
-      </w:r>
-    </w:p>
-    <w:p>
-      <w:pPr>
-        <w:spacing w:after="120"/>
-        <w:jc w:val="both"/>
-      </w:pPr>
-      <w:r>
-        <w:rPr>
-          <w:b/>
-          <w:bCs/>
-        </w:rPr>
-        <w:t xml:space="preserve">Fuera del alcance:</w:t>
-      </w:r>
-      <w:r>
-        <w:t xml:space="preserve"> la migración a producción (se hará en una segunda fase con despliegue gradual), ejecutar MongoDB dentro de Kubernetes, fragmentar la base de datos (</w:t>
-      </w:r>
-      <w:r>
-        <w:rPr>
-          <w:i/>
-          <w:iCs/>
-        </w:rPr>
-        <w:t xml:space="preserve">sharding</w:t>
-      </w:r>
-      <w:r>
-        <w:t xml:space="preserve">) y reescribir la aplicación.</w:t>
-      </w:r>
-    </w:p>
-    <w:p>
-      <w:pPr>
-        <w:pStyle w:val="Heading1"/>
-      </w:pPr>
-      <w:r>
-        <w:t xml:space="preserve">5. Ejercicio 2. Equipos de trabajo participantes</w:t>
-      </w:r>
-    </w:p>
-    <w:p>
-      <w:pPr>
-        <w:spacing w:after="120"/>
-        <w:jc w:val="both"/>
-      </w:pPr>
-      <w:r>
-        <w:t xml:space="preserve">Participará un equipo multidisciplinario de </w:t>
-      </w:r>
-      <w:r>
-        <w:rPr>
-          <w:b/>
-          <w:bCs/>
-        </w:rPr>
-        <w:t xml:space="preserve">nueve personas</w:t>
-      </w:r>
-      <w:r>
-        <w:t xml:space="preserve"> y tres roles de apoyo:</w:t>
+        <w:t xml:space="preserve">Tabla 5. Equipo multidisciplinario: nueve participantes y tres roles de apoyo.</w:t>
       </w:r>
     </w:p>
     <w:tbl>
@@ -6144,7 +5993,164 @@
     </w:tbl>
     <w:p>
       <w:pPr>
-        <w:spacing w:after="100" w:before="40"/>
+        <w:spacing w:after="0" w:before="0" w:line="200" w:lineRule="auto"/>
+      </w:pPr>
+      <w:r>
+        <w:rPr>
+          <w:sz w:val="10"/>
+          <w:szCs w:val="10"/>
+        </w:rPr>
+        <w:t xml:space="preserve"/>
+      </w:r>
+    </w:p>
+    <w:p>
+      <w:pPr>
+        <w:spacing w:after="120"/>
+        <w:jc w:val="both"/>
+      </w:pPr>
+      <w:r>
+        <w:t xml:space="preserve">Se seleccionó a quienes tienen </w:t>
+      </w:r>
+      <w:r>
+        <w:rPr>
+          <w:b/>
+          <w:bCs/>
+        </w:rPr>
+        <w:t xml:space="preserve">relación directa</w:t>
+      </w:r>
+      <w:r>
+        <w:t xml:space="preserve"> con el portal o sus incidencias, combinando </w:t>
+      </w:r>
+      <w:r>
+        <w:rPr>
+          <w:b/>
+          <w:bCs/>
+        </w:rPr>
+        <w:t xml:space="preserve">perfiles júnior y sénior</w:t>
+      </w:r>
+      <w:r>
+        <w:t xml:space="preserve">, con </w:t>
+      </w:r>
+      <w:r>
+        <w:rPr>
+          <w:b/>
+          <w:bCs/>
+        </w:rPr>
+        <w:t xml:space="preserve">disponibilidad</w:t>
+      </w:r>
+      <w:r>
+        <w:t xml:space="preserve"> de 6 horas semanales acordada con cada jefe de área y </w:t>
+      </w:r>
+      <w:r>
+        <w:rPr>
+          <w:b/>
+          <w:bCs/>
+        </w:rPr>
+        <w:t xml:space="preserve">disposición para actuar como agentes de cambio</w:t>
+      </w:r>
+      <w:r>
+        <w:t xml:space="preserve"> en la segunda fase. Se trabajará en tríos mixtos, con un seguimiento de 15 minutos a mitad de semana y un tablero con responsable y fecha de cada tarea.</w:t>
+      </w:r>
+    </w:p>
+    <w:p>
+      <w:pPr>
+        <w:pStyle w:val="Heading1"/>
+      </w:pPr>
+      <w:r>
+        <w:t xml:space="preserve">6. Ejercicio 3. Cronograma, sesiones, recursos y tecnologías</w:t>
+      </w:r>
+    </w:p>
+    <w:p>
+      <w:pPr>
+        <w:pStyle w:val="Heading2"/>
+      </w:pPr>
+      <w:r>
+        <w:t xml:space="preserve">6.1. Cronograma de sesiones</w:t>
+      </w:r>
+    </w:p>
+    <w:p>
+      <w:pPr>
+        <w:spacing w:after="120"/>
+        <w:jc w:val="both"/>
+      </w:pPr>
+      <w:r>
+        <w:t xml:space="preserve">El Dojo se realizará del </w:t>
+      </w:r>
+      <w:r>
+        <w:rPr>
+          <w:b/>
+          <w:bCs/>
+        </w:rPr>
+        <w:t xml:space="preserve">12 de abril al 2 de julio de 2027</w:t>
+      </w:r>
+      <w:r>
+        <w:t xml:space="preserve">, con una sesión semanal los miércoles de 9:00 a 13:00 h (48 horas) y 2 horas semanales de práctica. Cada sesión incluye </w:t>
+      </w:r>
+      <w:r>
+        <w:rPr>
+          <w:b/>
+          <w:bCs/>
+        </w:rPr>
+        <w:t xml:space="preserve">teoría</w:t>
+      </w:r>
+      <w:r>
+        <w:t xml:space="preserve"> (30 min), </w:t>
+      </w:r>
+      <w:r>
+        <w:rPr>
+          <w:b/>
+          <w:bCs/>
+        </w:rPr>
+        <w:t xml:space="preserve">demostración</w:t>
+      </w:r>
+      <w:r>
+        <w:t xml:space="preserve"> (30 min), </w:t>
+      </w:r>
+      <w:r>
+        <w:rPr>
+          <w:b/>
+          <w:bCs/>
+        </w:rPr>
+        <w:t xml:space="preserve">ejercicio práctico</w:t>
+      </w:r>
+      <w:r>
+        <w:t xml:space="preserve"> en tríos (120 min), </w:t>
+      </w:r>
+      <w:r>
+        <w:rPr>
+          <w:b/>
+          <w:bCs/>
+        </w:rPr>
+        <w:t xml:space="preserve">revisión de entregables</w:t>
+      </w:r>
+      <w:r>
+        <w:t xml:space="preserve"> (30 min) y </w:t>
+      </w:r>
+      <w:r>
+        <w:rPr>
+          <w:b/>
+          <w:bCs/>
+        </w:rPr>
+        <w:t xml:space="preserve">retrospectiva con encuesta</w:t>
+      </w:r>
+      <w:r>
+        <w:t xml:space="preserve"> (30 min). La secuencia es deliberada: </w:t>
+      </w:r>
+      <w:r>
+        <w:rPr>
+          <w:b/>
+          <w:bCs/>
+        </w:rPr>
+        <w:t xml:space="preserve">primero medir, después optimizar y por último escalar</w:t>
+      </w:r>
+      <w:r>
+        <w:t xml:space="preserve"> con el HPA (The Kubernetes Authors, s. f.), porque escalar una aplicación ineficiente solo multiplica las conexiones a MongoDB.</w:t>
+      </w:r>
+    </w:p>
+    <w:p>
+      <w:pPr>
+        <w:keepNext/>
+        <w:spacing w:after="60" w:before="120"/>
         <w:jc w:val="center"/>
       </w:pPr>
       <w:r>
@@ -6155,109 +6161,7 @@
           <w:sz w:val="20"/>
           <w:szCs w:val="20"/>
         </w:rPr>
-        <w:t xml:space="preserve">Tabla 5. Equipos participantes, responsabilidades y justificación.</w:t>
-      </w:r>
-    </w:p>
-    <w:p>
-      <w:pPr>
-        <w:pStyle w:val="Heading2"/>
-      </w:pPr>
-      <w:r>
-        <w:t xml:space="preserve">5.1. Criterios de selección y coordinación</w:t>
-      </w:r>
-    </w:p>
-    <w:p>
-      <w:pPr>
-        <w:spacing w:after="120"/>
-        <w:jc w:val="both"/>
-      </w:pPr>
-      <w:r>
-        <w:t xml:space="preserve">Se seleccionó a quienes tienen </w:t>
-      </w:r>
-      <w:r>
-        <w:rPr>
-          <w:b/>
-          <w:bCs/>
-        </w:rPr>
-        <w:t xml:space="preserve">relación directa</w:t>
-      </w:r>
-      <w:r>
-        <w:t xml:space="preserve"> con el portal o sus incidencias, combinando </w:t>
-      </w:r>
-      <w:r>
-        <w:rPr>
-          <w:b/>
-          <w:bCs/>
-        </w:rPr>
-        <w:t xml:space="preserve">perfiles júnior y sénior</w:t>
-      </w:r>
-      <w:r>
-        <w:t xml:space="preserve">, con </w:t>
-      </w:r>
-      <w:r>
-        <w:rPr>
-          <w:b/>
-          <w:bCs/>
-        </w:rPr>
-        <w:t xml:space="preserve">disponibilidad</w:t>
-      </w:r>
-      <w:r>
-        <w:t xml:space="preserve"> de 6 horas semanales acordada con cada jefe de área y </w:t>
-      </w:r>
-      <w:r>
-        <w:rPr>
-          <w:b/>
-          <w:bCs/>
-        </w:rPr>
-        <w:t xml:space="preserve">disposición para actuar como agentes de cambio</w:t>
-      </w:r>
-      <w:r>
-        <w:t xml:space="preserve"> en la segunda fase. El equipo trabajará en tríos mixtos (desarrollo, operaciones y DBA o calidad), con una reunión de seguimiento de 15 minutos a mitad de semana y un tablero con responsable, fecha y criterio de aceptación de cada tarea. Los obstáculos que requieran recursos se escalarán al patrocinador.</w:t>
-      </w:r>
-    </w:p>
-    <w:p>
-      <w:pPr>
-        <w:pStyle w:val="Heading1"/>
-      </w:pPr>
-      <w:r>
-        <w:t xml:space="preserve">6. Ejercicio 3. Cronograma, sesiones, recursos y tecnologías</w:t>
-      </w:r>
-    </w:p>
-    <w:p>
-      <w:pPr>
-        <w:pStyle w:val="Heading2"/>
-      </w:pPr>
-      <w:r>
-        <w:t xml:space="preserve">6.1. Cronograma de sesiones</w:t>
-      </w:r>
-    </w:p>
-    <w:p>
-      <w:pPr>
-        <w:spacing w:after="120"/>
-        <w:jc w:val="both"/>
-      </w:pPr>
-      <w:r>
-        <w:t xml:space="preserve">El Dojo se realizará del </w:t>
-      </w:r>
-      <w:r>
-        <w:rPr>
-          <w:b/>
-          <w:bCs/>
-        </w:rPr>
-        <w:t xml:space="preserve">12 de abril al 2 de julio de 2027</w:t>
-      </w:r>
-      <w:r>
-        <w:t xml:space="preserve">, con una sesión semanal los miércoles de 9:00 a 13:00 h (48 horas) y 2 horas semanales de práctica. La secuencia es deliberada: </w:t>
-      </w:r>
-      <w:r>
-        <w:rPr>
-          <w:b/>
-          <w:bCs/>
-        </w:rPr>
-        <w:t xml:space="preserve">primero medir, después optimizar y por último escalar</w:t>
-      </w:r>
-      <w:r>
-        <w:t xml:space="preserve"> con el HPA (The Kubernetes Authors, s. f.), porque escalar una aplicación ineficiente solo multiplica las conexiones a MongoDB.</w:t>
+        <w:t xml:space="preserve">Tabla 6. Cronograma de sesiones del DevOps Dojo.</w:t>
       </w:r>
     </w:p>
     <w:tbl>
@@ -8568,7 +8472,20 @@
     </w:tbl>
     <w:p>
       <w:pPr>
-        <w:spacing w:after="100" w:before="40"/>
+        <w:spacing w:after="0" w:before="0" w:line="200" w:lineRule="auto"/>
+      </w:pPr>
+      <w:r>
+        <w:rPr>
+          <w:sz w:val="10"/>
+          <w:szCs w:val="10"/>
+        </w:rPr>
+        <w:t xml:space="preserve"/>
+      </w:r>
+    </w:p>
+    <w:p>
+      <w:pPr>
+        <w:keepNext/>
+        <w:spacing w:after="60" w:before="120"/>
         <w:jc w:val="center"/>
       </w:pPr>
       <w:r>
@@ -8579,7 +8496,7 @@
           <w:sz w:val="20"/>
           <w:szCs w:val="20"/>
         </w:rPr>
-        <w:t xml:space="preserve">Tabla 6. Cronograma de sesiones del DevOps Dojo.</w:t>
+        <w:t xml:space="preserve">Figura 2. Diagrama de Gantt (oscuro: bloques temáticos; claro: actividades transversales).</w:t>
       </w:r>
     </w:p>
     <w:tbl>
@@ -9740,7 +9657,7 @@
                 <w:sz w:val="18"/>
                 <w:szCs w:val="18"/>
               </w:rPr>
-              <w:t xml:space="preserve">Contenedores e integración continua</w:t>
+              <w:t xml:space="preserve">Contenedores, CI y Kubernetes</w:t>
             </w:r>
           </w:p>
         </w:tc>
@@ -9874,6 +9791,7 @@
               <w:bottom w:val="single" w:color="8EA9C1" w:sz="4"/>
               <w:right w:val="single" w:color="8EA9C1" w:sz="4"/>
             </w:tcBorders>
+            <w:shd w:fill="1F4E79" w:color="auto" w:val="clear"/>
             <w:tcMar>
               <w:top w:type="dxa" w:w="50"/>
               <w:left w:type="dxa" w:w="80"/>
@@ -9898,6 +9816,7 @@
               <w:bottom w:val="single" w:color="8EA9C1" w:sz="4"/>
               <w:right w:val="single" w:color="8EA9C1" w:sz="4"/>
             </w:tcBorders>
+            <w:shd w:fill="1F4E79" w:color="auto" w:val="clear"/>
             <w:tcMar>
               <w:top w:type="dxa" w:w="50"/>
               <w:left w:type="dxa" w:w="80"/>
@@ -10062,7 +9981,7 @@
                 <w:sz w:val="18"/>
                 <w:szCs w:val="18"/>
               </w:rPr>
-              <w:t xml:space="preserve">Kubernetes</w:t>
+              <w:t xml:space="preserve">Helm, entrega continua y autoescalado</w:t>
             </w:r>
           </w:p>
         </w:tc>
@@ -10195,6 +10114,54 @@
               <w:bottom w:val="single" w:color="8EA9C1" w:sz="4"/>
               <w:right w:val="single" w:color="8EA9C1" w:sz="4"/>
             </w:tcBorders>
+            <w:tcMar>
+              <w:top w:type="dxa" w:w="50"/>
+              <w:left w:type="dxa" w:w="80"/>
+              <w:bottom w:type="dxa" w:w="50"/>
+              <w:right w:type="dxa" w:w="80"/>
+            </w:tcMar>
+            <w:vAlign w:val="top"/>
+          </w:tcPr>
+          <w:p>
+            <w:pPr>
+              <w:spacing w:after="0" w:before="0" w:line="240"/>
+              <w:jc w:val="left"/>
+            </w:pPr>
+          </w:p>
+        </w:tc>
+        <w:tc>
+          <w:tcPr>
+            <w:tcW w:type="dxa" w:w="510"/>
+            <w:tcBorders>
+              <w:top w:val="single" w:color="8EA9C1" w:sz="4"/>
+              <w:left w:val="single" w:color="8EA9C1" w:sz="4"/>
+              <w:bottom w:val="single" w:color="8EA9C1" w:sz="4"/>
+              <w:right w:val="single" w:color="8EA9C1" w:sz="4"/>
+            </w:tcBorders>
+            <w:tcMar>
+              <w:top w:type="dxa" w:w="50"/>
+              <w:left w:type="dxa" w:w="80"/>
+              <w:bottom w:type="dxa" w:w="50"/>
+              <w:right w:type="dxa" w:w="80"/>
+            </w:tcMar>
+            <w:vAlign w:val="top"/>
+          </w:tcPr>
+          <w:p>
+            <w:pPr>
+              <w:spacing w:after="0" w:before="0" w:line="240"/>
+              <w:jc w:val="left"/>
+            </w:pPr>
+          </w:p>
+        </w:tc>
+        <w:tc>
+          <w:tcPr>
+            <w:tcW w:type="dxa" w:w="510"/>
+            <w:tcBorders>
+              <w:top w:val="single" w:color="8EA9C1" w:sz="4"/>
+              <w:left w:val="single" w:color="8EA9C1" w:sz="4"/>
+              <w:bottom w:val="single" w:color="8EA9C1" w:sz="4"/>
+              <w:right w:val="single" w:color="8EA9C1" w:sz="4"/>
+            </w:tcBorders>
             <w:shd w:fill="1F4E79" w:color="auto" w:val="clear"/>
             <w:tcMar>
               <w:top w:type="dxa" w:w="50"/>
@@ -10221,54 +10188,6 @@
               <w:right w:val="single" w:color="8EA9C1" w:sz="4"/>
             </w:tcBorders>
             <w:shd w:fill="1F4E79" w:color="auto" w:val="clear"/>
-            <w:tcMar>
-              <w:top w:type="dxa" w:w="50"/>
-              <w:left w:type="dxa" w:w="80"/>
-              <w:bottom w:type="dxa" w:w="50"/>
-              <w:right w:type="dxa" w:w="80"/>
-            </w:tcMar>
-            <w:vAlign w:val="top"/>
-          </w:tcPr>
-          <w:p>
-            <w:pPr>
-              <w:spacing w:after="0" w:before="0" w:line="240"/>
-              <w:jc w:val="left"/>
-            </w:pPr>
-          </w:p>
-        </w:tc>
-        <w:tc>
-          <w:tcPr>
-            <w:tcW w:type="dxa" w:w="510"/>
-            <w:tcBorders>
-              <w:top w:val="single" w:color="8EA9C1" w:sz="4"/>
-              <w:left w:val="single" w:color="8EA9C1" w:sz="4"/>
-              <w:bottom w:val="single" w:color="8EA9C1" w:sz="4"/>
-              <w:right w:val="single" w:color="8EA9C1" w:sz="4"/>
-            </w:tcBorders>
-            <w:tcMar>
-              <w:top w:type="dxa" w:w="50"/>
-              <w:left w:type="dxa" w:w="80"/>
-              <w:bottom w:type="dxa" w:w="50"/>
-              <w:right w:type="dxa" w:w="80"/>
-            </w:tcMar>
-            <w:vAlign w:val="top"/>
-          </w:tcPr>
-          <w:p>
-            <w:pPr>
-              <w:spacing w:after="0" w:before="0" w:line="240"/>
-              <w:jc w:val="left"/>
-            </w:pPr>
-          </w:p>
-        </w:tc>
-        <w:tc>
-          <w:tcPr>
-            <w:tcW w:type="dxa" w:w="510"/>
-            <w:tcBorders>
-              <w:top w:val="single" w:color="8EA9C1" w:sz="4"/>
-              <w:left w:val="single" w:color="8EA9C1" w:sz="4"/>
-              <w:bottom w:val="single" w:color="8EA9C1" w:sz="4"/>
-              <w:right w:val="single" w:color="8EA9C1" w:sz="4"/>
-            </w:tcBorders>
             <w:tcMar>
               <w:top w:type="dxa" w:w="50"/>
               <w:left w:type="dxa" w:w="80"/>
@@ -10385,7 +10304,7 @@
                 <w:sz w:val="18"/>
                 <w:szCs w:val="18"/>
               </w:rPr>
-              <w:t xml:space="preserve">Helm y entrega continua</w:t>
+              <w:t xml:space="preserve">DevSecOps y resiliencia</w:t>
             </w:r>
           </w:p>
         </w:tc>
@@ -10566,6 +10485,54 @@
               <w:bottom w:val="single" w:color="8EA9C1" w:sz="4"/>
               <w:right w:val="single" w:color="8EA9C1" w:sz="4"/>
             </w:tcBorders>
+            <w:tcMar>
+              <w:top w:type="dxa" w:w="50"/>
+              <w:left w:type="dxa" w:w="80"/>
+              <w:bottom w:type="dxa" w:w="50"/>
+              <w:right w:type="dxa" w:w="80"/>
+            </w:tcMar>
+            <w:vAlign w:val="top"/>
+          </w:tcPr>
+          <w:p>
+            <w:pPr>
+              <w:spacing w:after="0" w:before="0" w:line="240"/>
+              <w:jc w:val="left"/>
+            </w:pPr>
+          </w:p>
+        </w:tc>
+        <w:tc>
+          <w:tcPr>
+            <w:tcW w:type="dxa" w:w="510"/>
+            <w:tcBorders>
+              <w:top w:val="single" w:color="8EA9C1" w:sz="4"/>
+              <w:left w:val="single" w:color="8EA9C1" w:sz="4"/>
+              <w:bottom w:val="single" w:color="8EA9C1" w:sz="4"/>
+              <w:right w:val="single" w:color="8EA9C1" w:sz="4"/>
+            </w:tcBorders>
+            <w:tcMar>
+              <w:top w:type="dxa" w:w="50"/>
+              <w:left w:type="dxa" w:w="80"/>
+              <w:bottom w:type="dxa" w:w="50"/>
+              <w:right w:type="dxa" w:w="80"/>
+            </w:tcMar>
+            <w:vAlign w:val="top"/>
+          </w:tcPr>
+          <w:p>
+            <w:pPr>
+              <w:spacing w:after="0" w:before="0" w:line="240"/>
+              <w:jc w:val="left"/>
+            </w:pPr>
+          </w:p>
+        </w:tc>
+        <w:tc>
+          <w:tcPr>
+            <w:tcW w:type="dxa" w:w="510"/>
+            <w:tcBorders>
+              <w:top w:val="single" w:color="8EA9C1" w:sz="4"/>
+              <w:left w:val="single" w:color="8EA9C1" w:sz="4"/>
+              <w:bottom w:val="single" w:color="8EA9C1" w:sz="4"/>
+              <w:right w:val="single" w:color="8EA9C1" w:sz="4"/>
+            </w:tcBorders>
             <w:shd w:fill="1F4E79" w:color="auto" w:val="clear"/>
             <w:tcMar>
               <w:top w:type="dxa" w:w="50"/>
@@ -10591,54 +10558,7 @@
               <w:bottom w:val="single" w:color="8EA9C1" w:sz="4"/>
               <w:right w:val="single" w:color="8EA9C1" w:sz="4"/>
             </w:tcBorders>
-            <w:tcMar>
-              <w:top w:type="dxa" w:w="50"/>
-              <w:left w:type="dxa" w:w="80"/>
-              <w:bottom w:type="dxa" w:w="50"/>
-              <w:right w:type="dxa" w:w="80"/>
-            </w:tcMar>
-            <w:vAlign w:val="top"/>
-          </w:tcPr>
-          <w:p>
-            <w:pPr>
-              <w:spacing w:after="0" w:before="0" w:line="240"/>
-              <w:jc w:val="left"/>
-            </w:pPr>
-          </w:p>
-        </w:tc>
-        <w:tc>
-          <w:tcPr>
-            <w:tcW w:type="dxa" w:w="510"/>
-            <w:tcBorders>
-              <w:top w:val="single" w:color="8EA9C1" w:sz="4"/>
-              <w:left w:val="single" w:color="8EA9C1" w:sz="4"/>
-              <w:bottom w:val="single" w:color="8EA9C1" w:sz="4"/>
-              <w:right w:val="single" w:color="8EA9C1" w:sz="4"/>
-            </w:tcBorders>
-            <w:tcMar>
-              <w:top w:type="dxa" w:w="50"/>
-              <w:left w:type="dxa" w:w="80"/>
-              <w:bottom w:type="dxa" w:w="50"/>
-              <w:right w:type="dxa" w:w="80"/>
-            </w:tcMar>
-            <w:vAlign w:val="top"/>
-          </w:tcPr>
-          <w:p>
-            <w:pPr>
-              <w:spacing w:after="0" w:before="0" w:line="240"/>
-              <w:jc w:val="left"/>
-            </w:pPr>
-          </w:p>
-        </w:tc>
-        <w:tc>
-          <w:tcPr>
-            <w:tcW w:type="dxa" w:w="510"/>
-            <w:tcBorders>
-              <w:top w:val="single" w:color="8EA9C1" w:sz="4"/>
-              <w:left w:val="single" w:color="8EA9C1" w:sz="4"/>
-              <w:bottom w:val="single" w:color="8EA9C1" w:sz="4"/>
-              <w:right w:val="single" w:color="8EA9C1" w:sz="4"/>
-            </w:tcBorders>
+            <w:shd w:fill="1F4E79" w:color="auto" w:val="clear"/>
             <w:tcMar>
               <w:top w:type="dxa" w:w="50"/>
               <w:left w:type="dxa" w:w="80"/>
@@ -10707,7 +10627,7 @@
                 <w:sz w:val="18"/>
                 <w:szCs w:val="18"/>
               </w:rPr>
-              <w:t xml:space="preserve">Autoescalado</w:t>
+              <w:t xml:space="preserve">Evaluación final</w:t>
             </w:r>
           </w:p>
         </w:tc>
@@ -10912,79 +10832,79 @@
               <w:bottom w:val="single" w:color="8EA9C1" w:sz="4"/>
               <w:right w:val="single" w:color="8EA9C1" w:sz="4"/>
             </w:tcBorders>
+            <w:tcMar>
+              <w:top w:type="dxa" w:w="50"/>
+              <w:left w:type="dxa" w:w="80"/>
+              <w:bottom w:type="dxa" w:w="50"/>
+              <w:right w:type="dxa" w:w="80"/>
+            </w:tcMar>
+            <w:vAlign w:val="top"/>
+          </w:tcPr>
+          <w:p>
+            <w:pPr>
+              <w:spacing w:after="0" w:before="0" w:line="240"/>
+              <w:jc w:val="left"/>
+            </w:pPr>
+          </w:p>
+        </w:tc>
+        <w:tc>
+          <w:tcPr>
+            <w:tcW w:type="dxa" w:w="510"/>
+            <w:tcBorders>
+              <w:top w:val="single" w:color="8EA9C1" w:sz="4"/>
+              <w:left w:val="single" w:color="8EA9C1" w:sz="4"/>
+              <w:bottom w:val="single" w:color="8EA9C1" w:sz="4"/>
+              <w:right w:val="single" w:color="8EA9C1" w:sz="4"/>
+            </w:tcBorders>
+            <w:tcMar>
+              <w:top w:type="dxa" w:w="50"/>
+              <w:left w:type="dxa" w:w="80"/>
+              <w:bottom w:type="dxa" w:w="50"/>
+              <w:right w:type="dxa" w:w="80"/>
+            </w:tcMar>
+            <w:vAlign w:val="top"/>
+          </w:tcPr>
+          <w:p>
+            <w:pPr>
+              <w:spacing w:after="0" w:before="0" w:line="240"/>
+              <w:jc w:val="left"/>
+            </w:pPr>
+          </w:p>
+        </w:tc>
+        <w:tc>
+          <w:tcPr>
+            <w:tcW w:type="dxa" w:w="510"/>
+            <w:tcBorders>
+              <w:top w:val="single" w:color="8EA9C1" w:sz="4"/>
+              <w:left w:val="single" w:color="8EA9C1" w:sz="4"/>
+              <w:bottom w:val="single" w:color="8EA9C1" w:sz="4"/>
+              <w:right w:val="single" w:color="8EA9C1" w:sz="4"/>
+            </w:tcBorders>
+            <w:tcMar>
+              <w:top w:type="dxa" w:w="50"/>
+              <w:left w:type="dxa" w:w="80"/>
+              <w:bottom w:type="dxa" w:w="50"/>
+              <w:right w:type="dxa" w:w="80"/>
+            </w:tcMar>
+            <w:vAlign w:val="top"/>
+          </w:tcPr>
+          <w:p>
+            <w:pPr>
+              <w:spacing w:after="0" w:before="0" w:line="240"/>
+              <w:jc w:val="left"/>
+            </w:pPr>
+          </w:p>
+        </w:tc>
+        <w:tc>
+          <w:tcPr>
+            <w:tcW w:type="dxa" w:w="510"/>
+            <w:tcBorders>
+              <w:top w:val="single" w:color="8EA9C1" w:sz="4"/>
+              <w:left w:val="single" w:color="8EA9C1" w:sz="4"/>
+              <w:bottom w:val="single" w:color="8EA9C1" w:sz="4"/>
+              <w:right w:val="single" w:color="8EA9C1" w:sz="4"/>
+            </w:tcBorders>
             <w:shd w:fill="1F4E79" w:color="auto" w:val="clear"/>
-            <w:tcMar>
-              <w:top w:type="dxa" w:w="50"/>
-              <w:left w:type="dxa" w:w="80"/>
-              <w:bottom w:type="dxa" w:w="50"/>
-              <w:right w:type="dxa" w:w="80"/>
-            </w:tcMar>
-            <w:vAlign w:val="top"/>
-          </w:tcPr>
-          <w:p>
-            <w:pPr>
-              <w:spacing w:after="0" w:before="0" w:line="240"/>
-              <w:jc w:val="left"/>
-            </w:pPr>
-          </w:p>
-        </w:tc>
-        <w:tc>
-          <w:tcPr>
-            <w:tcW w:type="dxa" w:w="510"/>
-            <w:tcBorders>
-              <w:top w:val="single" w:color="8EA9C1" w:sz="4"/>
-              <w:left w:val="single" w:color="8EA9C1" w:sz="4"/>
-              <w:bottom w:val="single" w:color="8EA9C1" w:sz="4"/>
-              <w:right w:val="single" w:color="8EA9C1" w:sz="4"/>
-            </w:tcBorders>
-            <w:tcMar>
-              <w:top w:type="dxa" w:w="50"/>
-              <w:left w:type="dxa" w:w="80"/>
-              <w:bottom w:type="dxa" w:w="50"/>
-              <w:right w:type="dxa" w:w="80"/>
-            </w:tcMar>
-            <w:vAlign w:val="top"/>
-          </w:tcPr>
-          <w:p>
-            <w:pPr>
-              <w:spacing w:after="0" w:before="0" w:line="240"/>
-              <w:jc w:val="left"/>
-            </w:pPr>
-          </w:p>
-        </w:tc>
-        <w:tc>
-          <w:tcPr>
-            <w:tcW w:type="dxa" w:w="510"/>
-            <w:tcBorders>
-              <w:top w:val="single" w:color="8EA9C1" w:sz="4"/>
-              <w:left w:val="single" w:color="8EA9C1" w:sz="4"/>
-              <w:bottom w:val="single" w:color="8EA9C1" w:sz="4"/>
-              <w:right w:val="single" w:color="8EA9C1" w:sz="4"/>
-            </w:tcBorders>
-            <w:tcMar>
-              <w:top w:type="dxa" w:w="50"/>
-              <w:left w:type="dxa" w:w="80"/>
-              <w:bottom w:type="dxa" w:w="50"/>
-              <w:right w:type="dxa" w:w="80"/>
-            </w:tcMar>
-            <w:vAlign w:val="top"/>
-          </w:tcPr>
-          <w:p>
-            <w:pPr>
-              <w:spacing w:after="0" w:before="0" w:line="240"/>
-              <w:jc w:val="left"/>
-            </w:pPr>
-          </w:p>
-        </w:tc>
-        <w:tc>
-          <w:tcPr>
-            <w:tcW w:type="dxa" w:w="510"/>
-            <w:tcBorders>
-              <w:top w:val="single" w:color="8EA9C1" w:sz="4"/>
-              <w:left w:val="single" w:color="8EA9C1" w:sz="4"/>
-              <w:bottom w:val="single" w:color="8EA9C1" w:sz="4"/>
-              <w:right w:val="single" w:color="8EA9C1" w:sz="4"/>
-            </w:tcBorders>
             <w:tcMar>
               <w:top w:type="dxa" w:w="50"/>
               <w:left w:type="dxa" w:w="80"/>
@@ -11029,7 +10949,7 @@
                 <w:sz w:val="18"/>
                 <w:szCs w:val="18"/>
               </w:rPr>
-              <w:t xml:space="preserve">DevSecOps</w:t>
+              <w:t xml:space="preserve">Pruebas de carga (medición)</w:t>
             </w:r>
           </w:p>
         </w:tc>
@@ -11066,6 +10986,7 @@
               <w:bottom w:val="single" w:color="8EA9C1" w:sz="4"/>
               <w:right w:val="single" w:color="8EA9C1" w:sz="4"/>
             </w:tcBorders>
+            <w:shd w:fill="7FA7CF" w:color="auto" w:val="clear"/>
             <w:tcMar>
               <w:top w:type="dxa" w:w="50"/>
               <w:left w:type="dxa" w:w="80"/>
@@ -11114,6 +11035,7 @@
               <w:bottom w:val="single" w:color="8EA9C1" w:sz="4"/>
               <w:right w:val="single" w:color="8EA9C1" w:sz="4"/>
             </w:tcBorders>
+            <w:shd w:fill="7FA7CF" w:color="auto" w:val="clear"/>
             <w:tcMar>
               <w:top w:type="dxa" w:w="50"/>
               <w:left w:type="dxa" w:w="80"/>
@@ -11234,6 +11156,7 @@
               <w:bottom w:val="single" w:color="8EA9C1" w:sz="4"/>
               <w:right w:val="single" w:color="8EA9C1" w:sz="4"/>
             </w:tcBorders>
+            <w:shd w:fill="7FA7CF" w:color="auto" w:val="clear"/>
             <w:tcMar>
               <w:top w:type="dxa" w:w="50"/>
               <w:left w:type="dxa" w:w="80"/>
@@ -11258,7 +11181,6 @@
               <w:bottom w:val="single" w:color="8EA9C1" w:sz="4"/>
               <w:right w:val="single" w:color="8EA9C1" w:sz="4"/>
             </w:tcBorders>
-            <w:shd w:fill="1F4E79" w:color="auto" w:val="clear"/>
             <w:tcMar>
               <w:top w:type="dxa" w:w="50"/>
               <w:left w:type="dxa" w:w="80"/>
@@ -11307,6 +11229,7 @@
               <w:bottom w:val="single" w:color="8EA9C1" w:sz="4"/>
               <w:right w:val="single" w:color="8EA9C1" w:sz="4"/>
             </w:tcBorders>
+            <w:shd w:fill="7FA7CF" w:color="auto" w:val="clear"/>
             <w:tcMar>
               <w:top w:type="dxa" w:w="50"/>
               <w:left w:type="dxa" w:w="80"/>
@@ -11351,7 +11274,7 @@
                 <w:sz w:val="18"/>
                 <w:szCs w:val="18"/>
               </w:rPr>
-              <w:t xml:space="preserve">Resiliencia e incidencias</w:t>
+              <w:t xml:space="preserve">Retrospectivas y encuestas</w:t>
             </w:r>
           </w:p>
         </w:tc>
@@ -11364,6 +11287,7 @@
               <w:bottom w:val="single" w:color="8EA9C1" w:sz="4"/>
               <w:right w:val="single" w:color="8EA9C1" w:sz="4"/>
             </w:tcBorders>
+            <w:shd w:fill="7FA7CF" w:color="auto" w:val="clear"/>
             <w:tcMar>
               <w:top w:type="dxa" w:w="50"/>
               <w:left w:type="dxa" w:w="80"/>
@@ -11388,6 +11312,7 @@
               <w:bottom w:val="single" w:color="8EA9C1" w:sz="4"/>
               <w:right w:val="single" w:color="8EA9C1" w:sz="4"/>
             </w:tcBorders>
+            <w:shd w:fill="7FA7CF" w:color="auto" w:val="clear"/>
             <w:tcMar>
               <w:top w:type="dxa" w:w="50"/>
               <w:left w:type="dxa" w:w="80"/>
@@ -11412,6 +11337,7 @@
               <w:bottom w:val="single" w:color="8EA9C1" w:sz="4"/>
               <w:right w:val="single" w:color="8EA9C1" w:sz="4"/>
             </w:tcBorders>
+            <w:shd w:fill="7FA7CF" w:color="auto" w:val="clear"/>
             <w:tcMar>
               <w:top w:type="dxa" w:w="50"/>
               <w:left w:type="dxa" w:w="80"/>
@@ -11436,6 +11362,7 @@
               <w:bottom w:val="single" w:color="8EA9C1" w:sz="4"/>
               <w:right w:val="single" w:color="8EA9C1" w:sz="4"/>
             </w:tcBorders>
+            <w:shd w:fill="7FA7CF" w:color="auto" w:val="clear"/>
             <w:tcMar>
               <w:top w:type="dxa" w:w="50"/>
               <w:left w:type="dxa" w:w="80"/>
@@ -11460,6 +11387,7 @@
               <w:bottom w:val="single" w:color="8EA9C1" w:sz="4"/>
               <w:right w:val="single" w:color="8EA9C1" w:sz="4"/>
             </w:tcBorders>
+            <w:shd w:fill="7FA7CF" w:color="auto" w:val="clear"/>
             <w:tcMar>
               <w:top w:type="dxa" w:w="50"/>
               <w:left w:type="dxa" w:w="80"/>
@@ -11484,6 +11412,7 @@
               <w:bottom w:val="single" w:color="8EA9C1" w:sz="4"/>
               <w:right w:val="single" w:color="8EA9C1" w:sz="4"/>
             </w:tcBorders>
+            <w:shd w:fill="7FA7CF" w:color="auto" w:val="clear"/>
             <w:tcMar>
               <w:top w:type="dxa" w:w="50"/>
               <w:left w:type="dxa" w:w="80"/>
@@ -11508,6 +11437,7 @@
               <w:bottom w:val="single" w:color="8EA9C1" w:sz="4"/>
               <w:right w:val="single" w:color="8EA9C1" w:sz="4"/>
             </w:tcBorders>
+            <w:shd w:fill="7FA7CF" w:color="auto" w:val="clear"/>
             <w:tcMar>
               <w:top w:type="dxa" w:w="50"/>
               <w:left w:type="dxa" w:w="80"/>
@@ -11532,6 +11462,7 @@
               <w:bottom w:val="single" w:color="8EA9C1" w:sz="4"/>
               <w:right w:val="single" w:color="8EA9C1" w:sz="4"/>
             </w:tcBorders>
+            <w:shd w:fill="7FA7CF" w:color="auto" w:val="clear"/>
             <w:tcMar>
               <w:top w:type="dxa" w:w="50"/>
               <w:left w:type="dxa" w:w="80"/>
@@ -11556,6 +11487,7 @@
               <w:bottom w:val="single" w:color="8EA9C1" w:sz="4"/>
               <w:right w:val="single" w:color="8EA9C1" w:sz="4"/>
             </w:tcBorders>
+            <w:shd w:fill="7FA7CF" w:color="auto" w:val="clear"/>
             <w:tcMar>
               <w:top w:type="dxa" w:w="50"/>
               <w:left w:type="dxa" w:w="80"/>
@@ -11580,6 +11512,7 @@
               <w:bottom w:val="single" w:color="8EA9C1" w:sz="4"/>
               <w:right w:val="single" w:color="8EA9C1" w:sz="4"/>
             </w:tcBorders>
+            <w:shd w:fill="7FA7CF" w:color="auto" w:val="clear"/>
             <w:tcMar>
               <w:top w:type="dxa" w:w="50"/>
               <w:left w:type="dxa" w:w="80"/>
@@ -11604,1313 +11537,7 @@
               <w:bottom w:val="single" w:color="8EA9C1" w:sz="4"/>
               <w:right w:val="single" w:color="8EA9C1" w:sz="4"/>
             </w:tcBorders>
-            <w:shd w:fill="1F4E79" w:color="auto" w:val="clear"/>
-            <w:tcMar>
-              <w:top w:type="dxa" w:w="50"/>
-              <w:left w:type="dxa" w:w="80"/>
-              <w:bottom w:type="dxa" w:w="50"/>
-              <w:right w:type="dxa" w:w="80"/>
-            </w:tcMar>
-            <w:vAlign w:val="top"/>
-          </w:tcPr>
-          <w:p>
-            <w:pPr>
-              <w:spacing w:after="0" w:before="0" w:line="240"/>
-              <w:jc w:val="left"/>
-            </w:pPr>
-          </w:p>
-        </w:tc>
-        <w:tc>
-          <w:tcPr>
-            <w:tcW w:type="dxa" w:w="510"/>
-            <w:tcBorders>
-              <w:top w:val="single" w:color="8EA9C1" w:sz="4"/>
-              <w:left w:val="single" w:color="8EA9C1" w:sz="4"/>
-              <w:bottom w:val="single" w:color="8EA9C1" w:sz="4"/>
-              <w:right w:val="single" w:color="8EA9C1" w:sz="4"/>
-            </w:tcBorders>
-            <w:tcMar>
-              <w:top w:type="dxa" w:w="50"/>
-              <w:left w:type="dxa" w:w="80"/>
-              <w:bottom w:type="dxa" w:w="50"/>
-              <w:right w:type="dxa" w:w="80"/>
-            </w:tcMar>
-            <w:vAlign w:val="top"/>
-          </w:tcPr>
-          <w:p>
-            <w:pPr>
-              <w:spacing w:after="0" w:before="0" w:line="240"/>
-              <w:jc w:val="left"/>
-            </w:pPr>
-          </w:p>
-        </w:tc>
-      </w:tr>
-      <w:tr>
-        <w:tc>
-          <w:tcPr>
-            <w:tcW w:type="dxa" w:w="2950"/>
-            <w:tcBorders>
-              <w:top w:val="single" w:color="8EA9C1" w:sz="4"/>
-              <w:left w:val="single" w:color="8EA9C1" w:sz="4"/>
-              <w:bottom w:val="single" w:color="8EA9C1" w:sz="4"/>
-              <w:right w:val="single" w:color="8EA9C1" w:sz="4"/>
-            </w:tcBorders>
-            <w:tcMar>
-              <w:top w:type="dxa" w:w="50"/>
-              <w:left w:type="dxa" w:w="80"/>
-              <w:bottom w:type="dxa" w:w="50"/>
-              <w:right w:type="dxa" w:w="80"/>
-            </w:tcMar>
-            <w:vAlign w:val="top"/>
-          </w:tcPr>
-          <w:p>
-            <w:pPr>
-              <w:spacing w:after="0" w:before="0" w:line="240"/>
-              <w:jc w:val="left"/>
-            </w:pPr>
-            <w:r>
-              <w:rPr>
-                <w:sz w:val="18"/>
-                <w:szCs w:val="18"/>
-              </w:rPr>
-              <w:t xml:space="preserve">Evaluación final</w:t>
-            </w:r>
-          </w:p>
-        </w:tc>
-        <w:tc>
-          <w:tcPr>
-            <w:tcW w:type="dxa" w:w="510"/>
-            <w:tcBorders>
-              <w:top w:val="single" w:color="8EA9C1" w:sz="4"/>
-              <w:left w:val="single" w:color="8EA9C1" w:sz="4"/>
-              <w:bottom w:val="single" w:color="8EA9C1" w:sz="4"/>
-              <w:right w:val="single" w:color="8EA9C1" w:sz="4"/>
-            </w:tcBorders>
-            <w:tcMar>
-              <w:top w:type="dxa" w:w="50"/>
-              <w:left w:type="dxa" w:w="80"/>
-              <w:bottom w:type="dxa" w:w="50"/>
-              <w:right w:type="dxa" w:w="80"/>
-            </w:tcMar>
-            <w:vAlign w:val="top"/>
-          </w:tcPr>
-          <w:p>
-            <w:pPr>
-              <w:spacing w:after="0" w:before="0" w:line="240"/>
-              <w:jc w:val="left"/>
-            </w:pPr>
-          </w:p>
-        </w:tc>
-        <w:tc>
-          <w:tcPr>
-            <w:tcW w:type="dxa" w:w="510"/>
-            <w:tcBorders>
-              <w:top w:val="single" w:color="8EA9C1" w:sz="4"/>
-              <w:left w:val="single" w:color="8EA9C1" w:sz="4"/>
-              <w:bottom w:val="single" w:color="8EA9C1" w:sz="4"/>
-              <w:right w:val="single" w:color="8EA9C1" w:sz="4"/>
-            </w:tcBorders>
-            <w:tcMar>
-              <w:top w:type="dxa" w:w="50"/>
-              <w:left w:type="dxa" w:w="80"/>
-              <w:bottom w:type="dxa" w:w="50"/>
-              <w:right w:type="dxa" w:w="80"/>
-            </w:tcMar>
-            <w:vAlign w:val="top"/>
-          </w:tcPr>
-          <w:p>
-            <w:pPr>
-              <w:spacing w:after="0" w:before="0" w:line="240"/>
-              <w:jc w:val="left"/>
-            </w:pPr>
-          </w:p>
-        </w:tc>
-        <w:tc>
-          <w:tcPr>
-            <w:tcW w:type="dxa" w:w="510"/>
-            <w:tcBorders>
-              <w:top w:val="single" w:color="8EA9C1" w:sz="4"/>
-              <w:left w:val="single" w:color="8EA9C1" w:sz="4"/>
-              <w:bottom w:val="single" w:color="8EA9C1" w:sz="4"/>
-              <w:right w:val="single" w:color="8EA9C1" w:sz="4"/>
-            </w:tcBorders>
-            <w:tcMar>
-              <w:top w:type="dxa" w:w="50"/>
-              <w:left w:type="dxa" w:w="80"/>
-              <w:bottom w:type="dxa" w:w="50"/>
-              <w:right w:type="dxa" w:w="80"/>
-            </w:tcMar>
-            <w:vAlign w:val="top"/>
-          </w:tcPr>
-          <w:p>
-            <w:pPr>
-              <w:spacing w:after="0" w:before="0" w:line="240"/>
-              <w:jc w:val="left"/>
-            </w:pPr>
-          </w:p>
-        </w:tc>
-        <w:tc>
-          <w:tcPr>
-            <w:tcW w:type="dxa" w:w="510"/>
-            <w:tcBorders>
-              <w:top w:val="single" w:color="8EA9C1" w:sz="4"/>
-              <w:left w:val="single" w:color="8EA9C1" w:sz="4"/>
-              <w:bottom w:val="single" w:color="8EA9C1" w:sz="4"/>
-              <w:right w:val="single" w:color="8EA9C1" w:sz="4"/>
-            </w:tcBorders>
-            <w:tcMar>
-              <w:top w:type="dxa" w:w="50"/>
-              <w:left w:type="dxa" w:w="80"/>
-              <w:bottom w:type="dxa" w:w="50"/>
-              <w:right w:type="dxa" w:w="80"/>
-            </w:tcMar>
-            <w:vAlign w:val="top"/>
-          </w:tcPr>
-          <w:p>
-            <w:pPr>
-              <w:spacing w:after="0" w:before="0" w:line="240"/>
-              <w:jc w:val="left"/>
-            </w:pPr>
-          </w:p>
-        </w:tc>
-        <w:tc>
-          <w:tcPr>
-            <w:tcW w:type="dxa" w:w="510"/>
-            <w:tcBorders>
-              <w:top w:val="single" w:color="8EA9C1" w:sz="4"/>
-              <w:left w:val="single" w:color="8EA9C1" w:sz="4"/>
-              <w:bottom w:val="single" w:color="8EA9C1" w:sz="4"/>
-              <w:right w:val="single" w:color="8EA9C1" w:sz="4"/>
-            </w:tcBorders>
-            <w:tcMar>
-              <w:top w:type="dxa" w:w="50"/>
-              <w:left w:type="dxa" w:w="80"/>
-              <w:bottom w:type="dxa" w:w="50"/>
-              <w:right w:type="dxa" w:w="80"/>
-            </w:tcMar>
-            <w:vAlign w:val="top"/>
-          </w:tcPr>
-          <w:p>
-            <w:pPr>
-              <w:spacing w:after="0" w:before="0" w:line="240"/>
-              <w:jc w:val="left"/>
-            </w:pPr>
-          </w:p>
-        </w:tc>
-        <w:tc>
-          <w:tcPr>
-            <w:tcW w:type="dxa" w:w="510"/>
-            <w:tcBorders>
-              <w:top w:val="single" w:color="8EA9C1" w:sz="4"/>
-              <w:left w:val="single" w:color="8EA9C1" w:sz="4"/>
-              <w:bottom w:val="single" w:color="8EA9C1" w:sz="4"/>
-              <w:right w:val="single" w:color="8EA9C1" w:sz="4"/>
-            </w:tcBorders>
-            <w:tcMar>
-              <w:top w:type="dxa" w:w="50"/>
-              <w:left w:type="dxa" w:w="80"/>
-              <w:bottom w:type="dxa" w:w="50"/>
-              <w:right w:type="dxa" w:w="80"/>
-            </w:tcMar>
-            <w:vAlign w:val="top"/>
-          </w:tcPr>
-          <w:p>
-            <w:pPr>
-              <w:spacing w:after="0" w:before="0" w:line="240"/>
-              <w:jc w:val="left"/>
-            </w:pPr>
-          </w:p>
-        </w:tc>
-        <w:tc>
-          <w:tcPr>
-            <w:tcW w:type="dxa" w:w="510"/>
-            <w:tcBorders>
-              <w:top w:val="single" w:color="8EA9C1" w:sz="4"/>
-              <w:left w:val="single" w:color="8EA9C1" w:sz="4"/>
-              <w:bottom w:val="single" w:color="8EA9C1" w:sz="4"/>
-              <w:right w:val="single" w:color="8EA9C1" w:sz="4"/>
-            </w:tcBorders>
-            <w:tcMar>
-              <w:top w:type="dxa" w:w="50"/>
-              <w:left w:type="dxa" w:w="80"/>
-              <w:bottom w:type="dxa" w:w="50"/>
-              <w:right w:type="dxa" w:w="80"/>
-            </w:tcMar>
-            <w:vAlign w:val="top"/>
-          </w:tcPr>
-          <w:p>
-            <w:pPr>
-              <w:spacing w:after="0" w:before="0" w:line="240"/>
-              <w:jc w:val="left"/>
-            </w:pPr>
-          </w:p>
-        </w:tc>
-        <w:tc>
-          <w:tcPr>
-            <w:tcW w:type="dxa" w:w="510"/>
-            <w:tcBorders>
-              <w:top w:val="single" w:color="8EA9C1" w:sz="4"/>
-              <w:left w:val="single" w:color="8EA9C1" w:sz="4"/>
-              <w:bottom w:val="single" w:color="8EA9C1" w:sz="4"/>
-              <w:right w:val="single" w:color="8EA9C1" w:sz="4"/>
-            </w:tcBorders>
-            <w:tcMar>
-              <w:top w:type="dxa" w:w="50"/>
-              <w:left w:type="dxa" w:w="80"/>
-              <w:bottom w:type="dxa" w:w="50"/>
-              <w:right w:type="dxa" w:w="80"/>
-            </w:tcMar>
-            <w:vAlign w:val="top"/>
-          </w:tcPr>
-          <w:p>
-            <w:pPr>
-              <w:spacing w:after="0" w:before="0" w:line="240"/>
-              <w:jc w:val="left"/>
-            </w:pPr>
-          </w:p>
-        </w:tc>
-        <w:tc>
-          <w:tcPr>
-            <w:tcW w:type="dxa" w:w="510"/>
-            <w:tcBorders>
-              <w:top w:val="single" w:color="8EA9C1" w:sz="4"/>
-              <w:left w:val="single" w:color="8EA9C1" w:sz="4"/>
-              <w:bottom w:val="single" w:color="8EA9C1" w:sz="4"/>
-              <w:right w:val="single" w:color="8EA9C1" w:sz="4"/>
-            </w:tcBorders>
-            <w:tcMar>
-              <w:top w:type="dxa" w:w="50"/>
-              <w:left w:type="dxa" w:w="80"/>
-              <w:bottom w:type="dxa" w:w="50"/>
-              <w:right w:type="dxa" w:w="80"/>
-            </w:tcMar>
-            <w:vAlign w:val="top"/>
-          </w:tcPr>
-          <w:p>
-            <w:pPr>
-              <w:spacing w:after="0" w:before="0" w:line="240"/>
-              <w:jc w:val="left"/>
-            </w:pPr>
-          </w:p>
-        </w:tc>
-        <w:tc>
-          <w:tcPr>
-            <w:tcW w:type="dxa" w:w="510"/>
-            <w:tcBorders>
-              <w:top w:val="single" w:color="8EA9C1" w:sz="4"/>
-              <w:left w:val="single" w:color="8EA9C1" w:sz="4"/>
-              <w:bottom w:val="single" w:color="8EA9C1" w:sz="4"/>
-              <w:right w:val="single" w:color="8EA9C1" w:sz="4"/>
-            </w:tcBorders>
-            <w:tcMar>
-              <w:top w:type="dxa" w:w="50"/>
-              <w:left w:type="dxa" w:w="80"/>
-              <w:bottom w:type="dxa" w:w="50"/>
-              <w:right w:type="dxa" w:w="80"/>
-            </w:tcMar>
-            <w:vAlign w:val="top"/>
-          </w:tcPr>
-          <w:p>
-            <w:pPr>
-              <w:spacing w:after="0" w:before="0" w:line="240"/>
-              <w:jc w:val="left"/>
-            </w:pPr>
-          </w:p>
-        </w:tc>
-        <w:tc>
-          <w:tcPr>
-            <w:tcW w:type="dxa" w:w="510"/>
-            <w:tcBorders>
-              <w:top w:val="single" w:color="8EA9C1" w:sz="4"/>
-              <w:left w:val="single" w:color="8EA9C1" w:sz="4"/>
-              <w:bottom w:val="single" w:color="8EA9C1" w:sz="4"/>
-              <w:right w:val="single" w:color="8EA9C1" w:sz="4"/>
-            </w:tcBorders>
-            <w:tcMar>
-              <w:top w:type="dxa" w:w="50"/>
-              <w:left w:type="dxa" w:w="80"/>
-              <w:bottom w:type="dxa" w:w="50"/>
-              <w:right w:type="dxa" w:w="80"/>
-            </w:tcMar>
-            <w:vAlign w:val="top"/>
-          </w:tcPr>
-          <w:p>
-            <w:pPr>
-              <w:spacing w:after="0" w:before="0" w:line="240"/>
-              <w:jc w:val="left"/>
-            </w:pPr>
-          </w:p>
-        </w:tc>
-        <w:tc>
-          <w:tcPr>
-            <w:tcW w:type="dxa" w:w="510"/>
-            <w:tcBorders>
-              <w:top w:val="single" w:color="8EA9C1" w:sz="4"/>
-              <w:left w:val="single" w:color="8EA9C1" w:sz="4"/>
-              <w:bottom w:val="single" w:color="8EA9C1" w:sz="4"/>
-              <w:right w:val="single" w:color="8EA9C1" w:sz="4"/>
-            </w:tcBorders>
-            <w:shd w:fill="1F4E79" w:color="auto" w:val="clear"/>
-            <w:tcMar>
-              <w:top w:type="dxa" w:w="50"/>
-              <w:left w:type="dxa" w:w="80"/>
-              <w:bottom w:type="dxa" w:w="50"/>
-              <w:right w:type="dxa" w:w="80"/>
-            </w:tcMar>
-            <w:vAlign w:val="top"/>
-          </w:tcPr>
-          <w:p>
-            <w:pPr>
-              <w:spacing w:after="0" w:before="0" w:line="240"/>
-              <w:jc w:val="left"/>
-            </w:pPr>
-          </w:p>
-        </w:tc>
-      </w:tr>
-      <w:tr>
-        <w:tc>
-          <w:tcPr>
-            <w:tcW w:type="dxa" w:w="2950"/>
-            <w:tcBorders>
-              <w:top w:val="single" w:color="8EA9C1" w:sz="4"/>
-              <w:left w:val="single" w:color="8EA9C1" w:sz="4"/>
-              <w:bottom w:val="single" w:color="8EA9C1" w:sz="4"/>
-              <w:right w:val="single" w:color="8EA9C1" w:sz="4"/>
-            </w:tcBorders>
-            <w:tcMar>
-              <w:top w:type="dxa" w:w="50"/>
-              <w:left w:type="dxa" w:w="80"/>
-              <w:bottom w:type="dxa" w:w="50"/>
-              <w:right w:type="dxa" w:w="80"/>
-            </w:tcMar>
-            <w:vAlign w:val="top"/>
-          </w:tcPr>
-          <w:p>
-            <w:pPr>
-              <w:spacing w:after="0" w:before="0" w:line="240"/>
-              <w:jc w:val="left"/>
-            </w:pPr>
-            <w:r>
-              <w:rPr>
-                <w:sz w:val="18"/>
-                <w:szCs w:val="18"/>
-              </w:rPr>
-              <w:t xml:space="preserve">Pruebas de carga (medición)</w:t>
-            </w:r>
-          </w:p>
-        </w:tc>
-        <w:tc>
-          <w:tcPr>
-            <w:tcW w:type="dxa" w:w="510"/>
-            <w:tcBorders>
-              <w:top w:val="single" w:color="8EA9C1" w:sz="4"/>
-              <w:left w:val="single" w:color="8EA9C1" w:sz="4"/>
-              <w:bottom w:val="single" w:color="8EA9C1" w:sz="4"/>
-              <w:right w:val="single" w:color="8EA9C1" w:sz="4"/>
-            </w:tcBorders>
-            <w:tcMar>
-              <w:top w:type="dxa" w:w="50"/>
-              <w:left w:type="dxa" w:w="80"/>
-              <w:bottom w:type="dxa" w:w="50"/>
-              <w:right w:type="dxa" w:w="80"/>
-            </w:tcMar>
-            <w:vAlign w:val="top"/>
-          </w:tcPr>
-          <w:p>
-            <w:pPr>
-              <w:spacing w:after="0" w:before="0" w:line="240"/>
-              <w:jc w:val="left"/>
-            </w:pPr>
-          </w:p>
-        </w:tc>
-        <w:tc>
-          <w:tcPr>
-            <w:tcW w:type="dxa" w:w="510"/>
-            <w:tcBorders>
-              <w:top w:val="single" w:color="8EA9C1" w:sz="4"/>
-              <w:left w:val="single" w:color="8EA9C1" w:sz="4"/>
-              <w:bottom w:val="single" w:color="8EA9C1" w:sz="4"/>
-              <w:right w:val="single" w:color="8EA9C1" w:sz="4"/>
-            </w:tcBorders>
             <w:shd w:fill="7FA7CF" w:color="auto" w:val="clear"/>
-            <w:tcMar>
-              <w:top w:type="dxa" w:w="50"/>
-              <w:left w:type="dxa" w:w="80"/>
-              <w:bottom w:type="dxa" w:w="50"/>
-              <w:right w:type="dxa" w:w="80"/>
-            </w:tcMar>
-            <w:vAlign w:val="top"/>
-          </w:tcPr>
-          <w:p>
-            <w:pPr>
-              <w:spacing w:after="0" w:before="0" w:line="240"/>
-              <w:jc w:val="left"/>
-            </w:pPr>
-          </w:p>
-        </w:tc>
-        <w:tc>
-          <w:tcPr>
-            <w:tcW w:type="dxa" w:w="510"/>
-            <w:tcBorders>
-              <w:top w:val="single" w:color="8EA9C1" w:sz="4"/>
-              <w:left w:val="single" w:color="8EA9C1" w:sz="4"/>
-              <w:bottom w:val="single" w:color="8EA9C1" w:sz="4"/>
-              <w:right w:val="single" w:color="8EA9C1" w:sz="4"/>
-            </w:tcBorders>
-            <w:tcMar>
-              <w:top w:type="dxa" w:w="50"/>
-              <w:left w:type="dxa" w:w="80"/>
-              <w:bottom w:type="dxa" w:w="50"/>
-              <w:right w:type="dxa" w:w="80"/>
-            </w:tcMar>
-            <w:vAlign w:val="top"/>
-          </w:tcPr>
-          <w:p>
-            <w:pPr>
-              <w:spacing w:after="0" w:before="0" w:line="240"/>
-              <w:jc w:val="left"/>
-            </w:pPr>
-          </w:p>
-        </w:tc>
-        <w:tc>
-          <w:tcPr>
-            <w:tcW w:type="dxa" w:w="510"/>
-            <w:tcBorders>
-              <w:top w:val="single" w:color="8EA9C1" w:sz="4"/>
-              <w:left w:val="single" w:color="8EA9C1" w:sz="4"/>
-              <w:bottom w:val="single" w:color="8EA9C1" w:sz="4"/>
-              <w:right w:val="single" w:color="8EA9C1" w:sz="4"/>
-            </w:tcBorders>
-            <w:shd w:fill="7FA7CF" w:color="auto" w:val="clear"/>
-            <w:tcMar>
-              <w:top w:type="dxa" w:w="50"/>
-              <w:left w:type="dxa" w:w="80"/>
-              <w:bottom w:type="dxa" w:w="50"/>
-              <w:right w:type="dxa" w:w="80"/>
-            </w:tcMar>
-            <w:vAlign w:val="top"/>
-          </w:tcPr>
-          <w:p>
-            <w:pPr>
-              <w:spacing w:after="0" w:before="0" w:line="240"/>
-              <w:jc w:val="left"/>
-            </w:pPr>
-          </w:p>
-        </w:tc>
-        <w:tc>
-          <w:tcPr>
-            <w:tcW w:type="dxa" w:w="510"/>
-            <w:tcBorders>
-              <w:top w:val="single" w:color="8EA9C1" w:sz="4"/>
-              <w:left w:val="single" w:color="8EA9C1" w:sz="4"/>
-              <w:bottom w:val="single" w:color="8EA9C1" w:sz="4"/>
-              <w:right w:val="single" w:color="8EA9C1" w:sz="4"/>
-            </w:tcBorders>
-            <w:tcMar>
-              <w:top w:type="dxa" w:w="50"/>
-              <w:left w:type="dxa" w:w="80"/>
-              <w:bottom w:type="dxa" w:w="50"/>
-              <w:right w:type="dxa" w:w="80"/>
-            </w:tcMar>
-            <w:vAlign w:val="top"/>
-          </w:tcPr>
-          <w:p>
-            <w:pPr>
-              <w:spacing w:after="0" w:before="0" w:line="240"/>
-              <w:jc w:val="left"/>
-            </w:pPr>
-          </w:p>
-        </w:tc>
-        <w:tc>
-          <w:tcPr>
-            <w:tcW w:type="dxa" w:w="510"/>
-            <w:tcBorders>
-              <w:top w:val="single" w:color="8EA9C1" w:sz="4"/>
-              <w:left w:val="single" w:color="8EA9C1" w:sz="4"/>
-              <w:bottom w:val="single" w:color="8EA9C1" w:sz="4"/>
-              <w:right w:val="single" w:color="8EA9C1" w:sz="4"/>
-            </w:tcBorders>
-            <w:tcMar>
-              <w:top w:type="dxa" w:w="50"/>
-              <w:left w:type="dxa" w:w="80"/>
-              <w:bottom w:type="dxa" w:w="50"/>
-              <w:right w:type="dxa" w:w="80"/>
-            </w:tcMar>
-            <w:vAlign w:val="top"/>
-          </w:tcPr>
-          <w:p>
-            <w:pPr>
-              <w:spacing w:after="0" w:before="0" w:line="240"/>
-              <w:jc w:val="left"/>
-            </w:pPr>
-          </w:p>
-        </w:tc>
-        <w:tc>
-          <w:tcPr>
-            <w:tcW w:type="dxa" w:w="510"/>
-            <w:tcBorders>
-              <w:top w:val="single" w:color="8EA9C1" w:sz="4"/>
-              <w:left w:val="single" w:color="8EA9C1" w:sz="4"/>
-              <w:bottom w:val="single" w:color="8EA9C1" w:sz="4"/>
-              <w:right w:val="single" w:color="8EA9C1" w:sz="4"/>
-            </w:tcBorders>
-            <w:tcMar>
-              <w:top w:type="dxa" w:w="50"/>
-              <w:left w:type="dxa" w:w="80"/>
-              <w:bottom w:type="dxa" w:w="50"/>
-              <w:right w:type="dxa" w:w="80"/>
-            </w:tcMar>
-            <w:vAlign w:val="top"/>
-          </w:tcPr>
-          <w:p>
-            <w:pPr>
-              <w:spacing w:after="0" w:before="0" w:line="240"/>
-              <w:jc w:val="left"/>
-            </w:pPr>
-          </w:p>
-        </w:tc>
-        <w:tc>
-          <w:tcPr>
-            <w:tcW w:type="dxa" w:w="510"/>
-            <w:tcBorders>
-              <w:top w:val="single" w:color="8EA9C1" w:sz="4"/>
-              <w:left w:val="single" w:color="8EA9C1" w:sz="4"/>
-              <w:bottom w:val="single" w:color="8EA9C1" w:sz="4"/>
-              <w:right w:val="single" w:color="8EA9C1" w:sz="4"/>
-            </w:tcBorders>
-            <w:tcMar>
-              <w:top w:type="dxa" w:w="50"/>
-              <w:left w:type="dxa" w:w="80"/>
-              <w:bottom w:type="dxa" w:w="50"/>
-              <w:right w:type="dxa" w:w="80"/>
-            </w:tcMar>
-            <w:vAlign w:val="top"/>
-          </w:tcPr>
-          <w:p>
-            <w:pPr>
-              <w:spacing w:after="0" w:before="0" w:line="240"/>
-              <w:jc w:val="left"/>
-            </w:pPr>
-          </w:p>
-        </w:tc>
-        <w:tc>
-          <w:tcPr>
-            <w:tcW w:type="dxa" w:w="510"/>
-            <w:tcBorders>
-              <w:top w:val="single" w:color="8EA9C1" w:sz="4"/>
-              <w:left w:val="single" w:color="8EA9C1" w:sz="4"/>
-              <w:bottom w:val="single" w:color="8EA9C1" w:sz="4"/>
-              <w:right w:val="single" w:color="8EA9C1" w:sz="4"/>
-            </w:tcBorders>
-            <w:shd w:fill="7FA7CF" w:color="auto" w:val="clear"/>
-            <w:tcMar>
-              <w:top w:type="dxa" w:w="50"/>
-              <w:left w:type="dxa" w:w="80"/>
-              <w:bottom w:type="dxa" w:w="50"/>
-              <w:right w:type="dxa" w:w="80"/>
-            </w:tcMar>
-            <w:vAlign w:val="top"/>
-          </w:tcPr>
-          <w:p>
-            <w:pPr>
-              <w:spacing w:after="0" w:before="0" w:line="240"/>
-              <w:jc w:val="left"/>
-            </w:pPr>
-          </w:p>
-        </w:tc>
-        <w:tc>
-          <w:tcPr>
-            <w:tcW w:type="dxa" w:w="510"/>
-            <w:tcBorders>
-              <w:top w:val="single" w:color="8EA9C1" w:sz="4"/>
-              <w:left w:val="single" w:color="8EA9C1" w:sz="4"/>
-              <w:bottom w:val="single" w:color="8EA9C1" w:sz="4"/>
-              <w:right w:val="single" w:color="8EA9C1" w:sz="4"/>
-            </w:tcBorders>
-            <w:tcMar>
-              <w:top w:type="dxa" w:w="50"/>
-              <w:left w:type="dxa" w:w="80"/>
-              <w:bottom w:type="dxa" w:w="50"/>
-              <w:right w:type="dxa" w:w="80"/>
-            </w:tcMar>
-            <w:vAlign w:val="top"/>
-          </w:tcPr>
-          <w:p>
-            <w:pPr>
-              <w:spacing w:after="0" w:before="0" w:line="240"/>
-              <w:jc w:val="left"/>
-            </w:pPr>
-          </w:p>
-        </w:tc>
-        <w:tc>
-          <w:tcPr>
-            <w:tcW w:type="dxa" w:w="510"/>
-            <w:tcBorders>
-              <w:top w:val="single" w:color="8EA9C1" w:sz="4"/>
-              <w:left w:val="single" w:color="8EA9C1" w:sz="4"/>
-              <w:bottom w:val="single" w:color="8EA9C1" w:sz="4"/>
-              <w:right w:val="single" w:color="8EA9C1" w:sz="4"/>
-            </w:tcBorders>
-            <w:tcMar>
-              <w:top w:type="dxa" w:w="50"/>
-              <w:left w:type="dxa" w:w="80"/>
-              <w:bottom w:type="dxa" w:w="50"/>
-              <w:right w:type="dxa" w:w="80"/>
-            </w:tcMar>
-            <w:vAlign w:val="top"/>
-          </w:tcPr>
-          <w:p>
-            <w:pPr>
-              <w:spacing w:after="0" w:before="0" w:line="240"/>
-              <w:jc w:val="left"/>
-            </w:pPr>
-          </w:p>
-        </w:tc>
-        <w:tc>
-          <w:tcPr>
-            <w:tcW w:type="dxa" w:w="510"/>
-            <w:tcBorders>
-              <w:top w:val="single" w:color="8EA9C1" w:sz="4"/>
-              <w:left w:val="single" w:color="8EA9C1" w:sz="4"/>
-              <w:bottom w:val="single" w:color="8EA9C1" w:sz="4"/>
-              <w:right w:val="single" w:color="8EA9C1" w:sz="4"/>
-            </w:tcBorders>
-            <w:shd w:fill="7FA7CF" w:color="auto" w:val="clear"/>
-            <w:tcMar>
-              <w:top w:type="dxa" w:w="50"/>
-              <w:left w:type="dxa" w:w="80"/>
-              <w:bottom w:type="dxa" w:w="50"/>
-              <w:right w:type="dxa" w:w="80"/>
-            </w:tcMar>
-            <w:vAlign w:val="top"/>
-          </w:tcPr>
-          <w:p>
-            <w:pPr>
-              <w:spacing w:after="0" w:before="0" w:line="240"/>
-              <w:jc w:val="left"/>
-            </w:pPr>
-          </w:p>
-        </w:tc>
-      </w:tr>
-      <w:tr>
-        <w:tc>
-          <w:tcPr>
-            <w:tcW w:type="dxa" w:w="2950"/>
-            <w:tcBorders>
-              <w:top w:val="single" w:color="8EA9C1" w:sz="4"/>
-              <w:left w:val="single" w:color="8EA9C1" w:sz="4"/>
-              <w:bottom w:val="single" w:color="8EA9C1" w:sz="4"/>
-              <w:right w:val="single" w:color="8EA9C1" w:sz="4"/>
-            </w:tcBorders>
-            <w:tcMar>
-              <w:top w:type="dxa" w:w="50"/>
-              <w:left w:type="dxa" w:w="80"/>
-              <w:bottom w:type="dxa" w:w="50"/>
-              <w:right w:type="dxa" w:w="80"/>
-            </w:tcMar>
-            <w:vAlign w:val="top"/>
-          </w:tcPr>
-          <w:p>
-            <w:pPr>
-              <w:spacing w:after="0" w:before="0" w:line="240"/>
-              <w:jc w:val="left"/>
-            </w:pPr>
-            <w:r>
-              <w:rPr>
-                <w:sz w:val="18"/>
-                <w:szCs w:val="18"/>
-              </w:rPr>
-              <w:t xml:space="preserve">Retrospectivas y encuestas</w:t>
-            </w:r>
-          </w:p>
-        </w:tc>
-        <w:tc>
-          <w:tcPr>
-            <w:tcW w:type="dxa" w:w="510"/>
-            <w:tcBorders>
-              <w:top w:val="single" w:color="8EA9C1" w:sz="4"/>
-              <w:left w:val="single" w:color="8EA9C1" w:sz="4"/>
-              <w:bottom w:val="single" w:color="8EA9C1" w:sz="4"/>
-              <w:right w:val="single" w:color="8EA9C1" w:sz="4"/>
-            </w:tcBorders>
-            <w:shd w:fill="7FA7CF" w:color="auto" w:val="clear"/>
-            <w:tcMar>
-              <w:top w:type="dxa" w:w="50"/>
-              <w:left w:type="dxa" w:w="80"/>
-              <w:bottom w:type="dxa" w:w="50"/>
-              <w:right w:type="dxa" w:w="80"/>
-            </w:tcMar>
-            <w:vAlign w:val="top"/>
-          </w:tcPr>
-          <w:p>
-            <w:pPr>
-              <w:spacing w:after="0" w:before="0" w:line="240"/>
-              <w:jc w:val="left"/>
-            </w:pPr>
-          </w:p>
-        </w:tc>
-        <w:tc>
-          <w:tcPr>
-            <w:tcW w:type="dxa" w:w="510"/>
-            <w:tcBorders>
-              <w:top w:val="single" w:color="8EA9C1" w:sz="4"/>
-              <w:left w:val="single" w:color="8EA9C1" w:sz="4"/>
-              <w:bottom w:val="single" w:color="8EA9C1" w:sz="4"/>
-              <w:right w:val="single" w:color="8EA9C1" w:sz="4"/>
-            </w:tcBorders>
-            <w:shd w:fill="7FA7CF" w:color="auto" w:val="clear"/>
-            <w:tcMar>
-              <w:top w:type="dxa" w:w="50"/>
-              <w:left w:type="dxa" w:w="80"/>
-              <w:bottom w:type="dxa" w:w="50"/>
-              <w:right w:type="dxa" w:w="80"/>
-            </w:tcMar>
-            <w:vAlign w:val="top"/>
-          </w:tcPr>
-          <w:p>
-            <w:pPr>
-              <w:spacing w:after="0" w:before="0" w:line="240"/>
-              <w:jc w:val="left"/>
-            </w:pPr>
-          </w:p>
-        </w:tc>
-        <w:tc>
-          <w:tcPr>
-            <w:tcW w:type="dxa" w:w="510"/>
-            <w:tcBorders>
-              <w:top w:val="single" w:color="8EA9C1" w:sz="4"/>
-              <w:left w:val="single" w:color="8EA9C1" w:sz="4"/>
-              <w:bottom w:val="single" w:color="8EA9C1" w:sz="4"/>
-              <w:right w:val="single" w:color="8EA9C1" w:sz="4"/>
-            </w:tcBorders>
-            <w:shd w:fill="7FA7CF" w:color="auto" w:val="clear"/>
-            <w:tcMar>
-              <w:top w:type="dxa" w:w="50"/>
-              <w:left w:type="dxa" w:w="80"/>
-              <w:bottom w:type="dxa" w:w="50"/>
-              <w:right w:type="dxa" w:w="80"/>
-            </w:tcMar>
-            <w:vAlign w:val="top"/>
-          </w:tcPr>
-          <w:p>
-            <w:pPr>
-              <w:spacing w:after="0" w:before="0" w:line="240"/>
-              <w:jc w:val="left"/>
-            </w:pPr>
-          </w:p>
-        </w:tc>
-        <w:tc>
-          <w:tcPr>
-            <w:tcW w:type="dxa" w:w="510"/>
-            <w:tcBorders>
-              <w:top w:val="single" w:color="8EA9C1" w:sz="4"/>
-              <w:left w:val="single" w:color="8EA9C1" w:sz="4"/>
-              <w:bottom w:val="single" w:color="8EA9C1" w:sz="4"/>
-              <w:right w:val="single" w:color="8EA9C1" w:sz="4"/>
-            </w:tcBorders>
-            <w:shd w:fill="7FA7CF" w:color="auto" w:val="clear"/>
-            <w:tcMar>
-              <w:top w:type="dxa" w:w="50"/>
-              <w:left w:type="dxa" w:w="80"/>
-              <w:bottom w:type="dxa" w:w="50"/>
-              <w:right w:type="dxa" w:w="80"/>
-            </w:tcMar>
-            <w:vAlign w:val="top"/>
-          </w:tcPr>
-          <w:p>
-            <w:pPr>
-              <w:spacing w:after="0" w:before="0" w:line="240"/>
-              <w:jc w:val="left"/>
-            </w:pPr>
-          </w:p>
-        </w:tc>
-        <w:tc>
-          <w:tcPr>
-            <w:tcW w:type="dxa" w:w="510"/>
-            <w:tcBorders>
-              <w:top w:val="single" w:color="8EA9C1" w:sz="4"/>
-              <w:left w:val="single" w:color="8EA9C1" w:sz="4"/>
-              <w:bottom w:val="single" w:color="8EA9C1" w:sz="4"/>
-              <w:right w:val="single" w:color="8EA9C1" w:sz="4"/>
-            </w:tcBorders>
-            <w:shd w:fill="7FA7CF" w:color="auto" w:val="clear"/>
-            <w:tcMar>
-              <w:top w:type="dxa" w:w="50"/>
-              <w:left w:type="dxa" w:w="80"/>
-              <w:bottom w:type="dxa" w:w="50"/>
-              <w:right w:type="dxa" w:w="80"/>
-            </w:tcMar>
-            <w:vAlign w:val="top"/>
-          </w:tcPr>
-          <w:p>
-            <w:pPr>
-              <w:spacing w:after="0" w:before="0" w:line="240"/>
-              <w:jc w:val="left"/>
-            </w:pPr>
-          </w:p>
-        </w:tc>
-        <w:tc>
-          <w:tcPr>
-            <w:tcW w:type="dxa" w:w="510"/>
-            <w:tcBorders>
-              <w:top w:val="single" w:color="8EA9C1" w:sz="4"/>
-              <w:left w:val="single" w:color="8EA9C1" w:sz="4"/>
-              <w:bottom w:val="single" w:color="8EA9C1" w:sz="4"/>
-              <w:right w:val="single" w:color="8EA9C1" w:sz="4"/>
-            </w:tcBorders>
-            <w:shd w:fill="7FA7CF" w:color="auto" w:val="clear"/>
-            <w:tcMar>
-              <w:top w:type="dxa" w:w="50"/>
-              <w:left w:type="dxa" w:w="80"/>
-              <w:bottom w:type="dxa" w:w="50"/>
-              <w:right w:type="dxa" w:w="80"/>
-            </w:tcMar>
-            <w:vAlign w:val="top"/>
-          </w:tcPr>
-          <w:p>
-            <w:pPr>
-              <w:spacing w:after="0" w:before="0" w:line="240"/>
-              <w:jc w:val="left"/>
-            </w:pPr>
-          </w:p>
-        </w:tc>
-        <w:tc>
-          <w:tcPr>
-            <w:tcW w:type="dxa" w:w="510"/>
-            <w:tcBorders>
-              <w:top w:val="single" w:color="8EA9C1" w:sz="4"/>
-              <w:left w:val="single" w:color="8EA9C1" w:sz="4"/>
-              <w:bottom w:val="single" w:color="8EA9C1" w:sz="4"/>
-              <w:right w:val="single" w:color="8EA9C1" w:sz="4"/>
-            </w:tcBorders>
-            <w:shd w:fill="7FA7CF" w:color="auto" w:val="clear"/>
-            <w:tcMar>
-              <w:top w:type="dxa" w:w="50"/>
-              <w:left w:type="dxa" w:w="80"/>
-              <w:bottom w:type="dxa" w:w="50"/>
-              <w:right w:type="dxa" w:w="80"/>
-            </w:tcMar>
-            <w:vAlign w:val="top"/>
-          </w:tcPr>
-          <w:p>
-            <w:pPr>
-              <w:spacing w:after="0" w:before="0" w:line="240"/>
-              <w:jc w:val="left"/>
-            </w:pPr>
-          </w:p>
-        </w:tc>
-        <w:tc>
-          <w:tcPr>
-            <w:tcW w:type="dxa" w:w="510"/>
-            <w:tcBorders>
-              <w:top w:val="single" w:color="8EA9C1" w:sz="4"/>
-              <w:left w:val="single" w:color="8EA9C1" w:sz="4"/>
-              <w:bottom w:val="single" w:color="8EA9C1" w:sz="4"/>
-              <w:right w:val="single" w:color="8EA9C1" w:sz="4"/>
-            </w:tcBorders>
-            <w:shd w:fill="7FA7CF" w:color="auto" w:val="clear"/>
-            <w:tcMar>
-              <w:top w:type="dxa" w:w="50"/>
-              <w:left w:type="dxa" w:w="80"/>
-              <w:bottom w:type="dxa" w:w="50"/>
-              <w:right w:type="dxa" w:w="80"/>
-            </w:tcMar>
-            <w:vAlign w:val="top"/>
-          </w:tcPr>
-          <w:p>
-            <w:pPr>
-              <w:spacing w:after="0" w:before="0" w:line="240"/>
-              <w:jc w:val="left"/>
-            </w:pPr>
-          </w:p>
-        </w:tc>
-        <w:tc>
-          <w:tcPr>
-            <w:tcW w:type="dxa" w:w="510"/>
-            <w:tcBorders>
-              <w:top w:val="single" w:color="8EA9C1" w:sz="4"/>
-              <w:left w:val="single" w:color="8EA9C1" w:sz="4"/>
-              <w:bottom w:val="single" w:color="8EA9C1" w:sz="4"/>
-              <w:right w:val="single" w:color="8EA9C1" w:sz="4"/>
-            </w:tcBorders>
-            <w:shd w:fill="7FA7CF" w:color="auto" w:val="clear"/>
-            <w:tcMar>
-              <w:top w:type="dxa" w:w="50"/>
-              <w:left w:type="dxa" w:w="80"/>
-              <w:bottom w:type="dxa" w:w="50"/>
-              <w:right w:type="dxa" w:w="80"/>
-            </w:tcMar>
-            <w:vAlign w:val="top"/>
-          </w:tcPr>
-          <w:p>
-            <w:pPr>
-              <w:spacing w:after="0" w:before="0" w:line="240"/>
-              <w:jc w:val="left"/>
-            </w:pPr>
-          </w:p>
-        </w:tc>
-        <w:tc>
-          <w:tcPr>
-            <w:tcW w:type="dxa" w:w="510"/>
-            <w:tcBorders>
-              <w:top w:val="single" w:color="8EA9C1" w:sz="4"/>
-              <w:left w:val="single" w:color="8EA9C1" w:sz="4"/>
-              <w:bottom w:val="single" w:color="8EA9C1" w:sz="4"/>
-              <w:right w:val="single" w:color="8EA9C1" w:sz="4"/>
-            </w:tcBorders>
-            <w:shd w:fill="7FA7CF" w:color="auto" w:val="clear"/>
-            <w:tcMar>
-              <w:top w:type="dxa" w:w="50"/>
-              <w:left w:type="dxa" w:w="80"/>
-              <w:bottom w:type="dxa" w:w="50"/>
-              <w:right w:type="dxa" w:w="80"/>
-            </w:tcMar>
-            <w:vAlign w:val="top"/>
-          </w:tcPr>
-          <w:p>
-            <w:pPr>
-              <w:spacing w:after="0" w:before="0" w:line="240"/>
-              <w:jc w:val="left"/>
-            </w:pPr>
-          </w:p>
-        </w:tc>
-        <w:tc>
-          <w:tcPr>
-            <w:tcW w:type="dxa" w:w="510"/>
-            <w:tcBorders>
-              <w:top w:val="single" w:color="8EA9C1" w:sz="4"/>
-              <w:left w:val="single" w:color="8EA9C1" w:sz="4"/>
-              <w:bottom w:val="single" w:color="8EA9C1" w:sz="4"/>
-              <w:right w:val="single" w:color="8EA9C1" w:sz="4"/>
-            </w:tcBorders>
-            <w:shd w:fill="7FA7CF" w:color="auto" w:val="clear"/>
-            <w:tcMar>
-              <w:top w:type="dxa" w:w="50"/>
-              <w:left w:type="dxa" w:w="80"/>
-              <w:bottom w:type="dxa" w:w="50"/>
-              <w:right w:type="dxa" w:w="80"/>
-            </w:tcMar>
-            <w:vAlign w:val="top"/>
-          </w:tcPr>
-          <w:p>
-            <w:pPr>
-              <w:spacing w:after="0" w:before="0" w:line="240"/>
-              <w:jc w:val="left"/>
-            </w:pPr>
-          </w:p>
-        </w:tc>
-        <w:tc>
-          <w:tcPr>
-            <w:tcW w:type="dxa" w:w="510"/>
-            <w:tcBorders>
-              <w:top w:val="single" w:color="8EA9C1" w:sz="4"/>
-              <w:left w:val="single" w:color="8EA9C1" w:sz="4"/>
-              <w:bottom w:val="single" w:color="8EA9C1" w:sz="4"/>
-              <w:right w:val="single" w:color="8EA9C1" w:sz="4"/>
-            </w:tcBorders>
-            <w:shd w:fill="7FA7CF" w:color="auto" w:val="clear"/>
-            <w:tcMar>
-              <w:top w:type="dxa" w:w="50"/>
-              <w:left w:type="dxa" w:w="80"/>
-              <w:bottom w:type="dxa" w:w="50"/>
-              <w:right w:type="dxa" w:w="80"/>
-            </w:tcMar>
-            <w:vAlign w:val="top"/>
-          </w:tcPr>
-          <w:p>
-            <w:pPr>
-              <w:spacing w:after="0" w:before="0" w:line="240"/>
-              <w:jc w:val="left"/>
-            </w:pPr>
-          </w:p>
-        </w:tc>
-      </w:tr>
-      <w:tr>
-        <w:tc>
-          <w:tcPr>
-            <w:tcW w:type="dxa" w:w="2950"/>
-            <w:tcBorders>
-              <w:top w:val="single" w:color="8EA9C1" w:sz="4"/>
-              <w:left w:val="single" w:color="8EA9C1" w:sz="4"/>
-              <w:bottom w:val="single" w:color="8EA9C1" w:sz="4"/>
-              <w:right w:val="single" w:color="8EA9C1" w:sz="4"/>
-            </w:tcBorders>
-            <w:tcMar>
-              <w:top w:type="dxa" w:w="50"/>
-              <w:left w:type="dxa" w:w="80"/>
-              <w:bottom w:type="dxa" w:w="50"/>
-              <w:right w:type="dxa" w:w="80"/>
-            </w:tcMar>
-            <w:vAlign w:val="top"/>
-          </w:tcPr>
-          <w:p>
-            <w:pPr>
-              <w:spacing w:after="0" w:before="0" w:line="240"/>
-              <w:jc w:val="left"/>
-            </w:pPr>
-            <w:r>
-              <w:rPr>
-                <w:sz w:val="18"/>
-                <w:szCs w:val="18"/>
-              </w:rPr>
-              <w:t xml:space="preserve">Informe al patrocinador</w:t>
-            </w:r>
-          </w:p>
-        </w:tc>
-        <w:tc>
-          <w:tcPr>
-            <w:tcW w:type="dxa" w:w="510"/>
-            <w:tcBorders>
-              <w:top w:val="single" w:color="8EA9C1" w:sz="4"/>
-              <w:left w:val="single" w:color="8EA9C1" w:sz="4"/>
-              <w:bottom w:val="single" w:color="8EA9C1" w:sz="4"/>
-              <w:right w:val="single" w:color="8EA9C1" w:sz="4"/>
-            </w:tcBorders>
-            <w:tcMar>
-              <w:top w:type="dxa" w:w="50"/>
-              <w:left w:type="dxa" w:w="80"/>
-              <w:bottom w:type="dxa" w:w="50"/>
-              <w:right w:type="dxa" w:w="80"/>
-            </w:tcMar>
-            <w:vAlign w:val="top"/>
-          </w:tcPr>
-          <w:p>
-            <w:pPr>
-              <w:spacing w:after="0" w:before="0" w:line="240"/>
-              <w:jc w:val="left"/>
-            </w:pPr>
-          </w:p>
-        </w:tc>
-        <w:tc>
-          <w:tcPr>
-            <w:tcW w:type="dxa" w:w="510"/>
-            <w:tcBorders>
-              <w:top w:val="single" w:color="8EA9C1" w:sz="4"/>
-              <w:left w:val="single" w:color="8EA9C1" w:sz="4"/>
-              <w:bottom w:val="single" w:color="8EA9C1" w:sz="4"/>
-              <w:right w:val="single" w:color="8EA9C1" w:sz="4"/>
-            </w:tcBorders>
-            <w:shd w:fill="7FA7CF" w:color="auto" w:val="clear"/>
-            <w:tcMar>
-              <w:top w:type="dxa" w:w="50"/>
-              <w:left w:type="dxa" w:w="80"/>
-              <w:bottom w:type="dxa" w:w="50"/>
-              <w:right w:type="dxa" w:w="80"/>
-            </w:tcMar>
-            <w:vAlign w:val="top"/>
-          </w:tcPr>
-          <w:p>
-            <w:pPr>
-              <w:spacing w:after="0" w:before="0" w:line="240"/>
-              <w:jc w:val="left"/>
-            </w:pPr>
-          </w:p>
-        </w:tc>
-        <w:tc>
-          <w:tcPr>
-            <w:tcW w:type="dxa" w:w="510"/>
-            <w:tcBorders>
-              <w:top w:val="single" w:color="8EA9C1" w:sz="4"/>
-              <w:left w:val="single" w:color="8EA9C1" w:sz="4"/>
-              <w:bottom w:val="single" w:color="8EA9C1" w:sz="4"/>
-              <w:right w:val="single" w:color="8EA9C1" w:sz="4"/>
-            </w:tcBorders>
-            <w:tcMar>
-              <w:top w:type="dxa" w:w="50"/>
-              <w:left w:type="dxa" w:w="80"/>
-              <w:bottom w:type="dxa" w:w="50"/>
-              <w:right w:type="dxa" w:w="80"/>
-            </w:tcMar>
-            <w:vAlign w:val="top"/>
-          </w:tcPr>
-          <w:p>
-            <w:pPr>
-              <w:spacing w:after="0" w:before="0" w:line="240"/>
-              <w:jc w:val="left"/>
-            </w:pPr>
-          </w:p>
-        </w:tc>
-        <w:tc>
-          <w:tcPr>
-            <w:tcW w:type="dxa" w:w="510"/>
-            <w:tcBorders>
-              <w:top w:val="single" w:color="8EA9C1" w:sz="4"/>
-              <w:left w:val="single" w:color="8EA9C1" w:sz="4"/>
-              <w:bottom w:val="single" w:color="8EA9C1" w:sz="4"/>
-              <w:right w:val="single" w:color="8EA9C1" w:sz="4"/>
-            </w:tcBorders>
-            <w:shd w:fill="7FA7CF" w:color="auto" w:val="clear"/>
-            <w:tcMar>
-              <w:top w:type="dxa" w:w="50"/>
-              <w:left w:type="dxa" w:w="80"/>
-              <w:bottom w:type="dxa" w:w="50"/>
-              <w:right w:type="dxa" w:w="80"/>
-            </w:tcMar>
-            <w:vAlign w:val="top"/>
-          </w:tcPr>
-          <w:p>
-            <w:pPr>
-              <w:spacing w:after="0" w:before="0" w:line="240"/>
-              <w:jc w:val="left"/>
-            </w:pPr>
-          </w:p>
-        </w:tc>
-        <w:tc>
-          <w:tcPr>
-            <w:tcW w:type="dxa" w:w="510"/>
-            <w:tcBorders>
-              <w:top w:val="single" w:color="8EA9C1" w:sz="4"/>
-              <w:left w:val="single" w:color="8EA9C1" w:sz="4"/>
-              <w:bottom w:val="single" w:color="8EA9C1" w:sz="4"/>
-              <w:right w:val="single" w:color="8EA9C1" w:sz="4"/>
-            </w:tcBorders>
-            <w:tcMar>
-              <w:top w:type="dxa" w:w="50"/>
-              <w:left w:type="dxa" w:w="80"/>
-              <w:bottom w:type="dxa" w:w="50"/>
-              <w:right w:type="dxa" w:w="80"/>
-            </w:tcMar>
-            <w:vAlign w:val="top"/>
-          </w:tcPr>
-          <w:p>
-            <w:pPr>
-              <w:spacing w:after="0" w:before="0" w:line="240"/>
-              <w:jc w:val="left"/>
-            </w:pPr>
-          </w:p>
-        </w:tc>
-        <w:tc>
-          <w:tcPr>
-            <w:tcW w:type="dxa" w:w="510"/>
-            <w:tcBorders>
-              <w:top w:val="single" w:color="8EA9C1" w:sz="4"/>
-              <w:left w:val="single" w:color="8EA9C1" w:sz="4"/>
-              <w:bottom w:val="single" w:color="8EA9C1" w:sz="4"/>
-              <w:right w:val="single" w:color="8EA9C1" w:sz="4"/>
-            </w:tcBorders>
-            <w:shd w:fill="7FA7CF" w:color="auto" w:val="clear"/>
-            <w:tcMar>
-              <w:top w:type="dxa" w:w="50"/>
-              <w:left w:type="dxa" w:w="80"/>
-              <w:bottom w:type="dxa" w:w="50"/>
-              <w:right w:type="dxa" w:w="80"/>
-            </w:tcMar>
-            <w:vAlign w:val="top"/>
-          </w:tcPr>
-          <w:p>
-            <w:pPr>
-              <w:spacing w:after="0" w:before="0" w:line="240"/>
-              <w:jc w:val="left"/>
-            </w:pPr>
-          </w:p>
-        </w:tc>
-        <w:tc>
-          <w:tcPr>
-            <w:tcW w:type="dxa" w:w="510"/>
-            <w:tcBorders>
-              <w:top w:val="single" w:color="8EA9C1" w:sz="4"/>
-              <w:left w:val="single" w:color="8EA9C1" w:sz="4"/>
-              <w:bottom w:val="single" w:color="8EA9C1" w:sz="4"/>
-              <w:right w:val="single" w:color="8EA9C1" w:sz="4"/>
-            </w:tcBorders>
-            <w:tcMar>
-              <w:top w:type="dxa" w:w="50"/>
-              <w:left w:type="dxa" w:w="80"/>
-              <w:bottom w:type="dxa" w:w="50"/>
-              <w:right w:type="dxa" w:w="80"/>
-            </w:tcMar>
-            <w:vAlign w:val="top"/>
-          </w:tcPr>
-          <w:p>
-            <w:pPr>
-              <w:spacing w:after="0" w:before="0" w:line="240"/>
-              <w:jc w:val="left"/>
-            </w:pPr>
-          </w:p>
-        </w:tc>
-        <w:tc>
-          <w:tcPr>
-            <w:tcW w:type="dxa" w:w="510"/>
-            <w:tcBorders>
-              <w:top w:val="single" w:color="8EA9C1" w:sz="4"/>
-              <w:left w:val="single" w:color="8EA9C1" w:sz="4"/>
-              <w:bottom w:val="single" w:color="8EA9C1" w:sz="4"/>
-              <w:right w:val="single" w:color="8EA9C1" w:sz="4"/>
-            </w:tcBorders>
-            <w:shd w:fill="7FA7CF" w:color="auto" w:val="clear"/>
-            <w:tcMar>
-              <w:top w:type="dxa" w:w="50"/>
-              <w:left w:type="dxa" w:w="80"/>
-              <w:bottom w:type="dxa" w:w="50"/>
-              <w:right w:type="dxa" w:w="80"/>
-            </w:tcMar>
-            <w:vAlign w:val="top"/>
-          </w:tcPr>
-          <w:p>
-            <w:pPr>
-              <w:spacing w:after="0" w:before="0" w:line="240"/>
-              <w:jc w:val="left"/>
-            </w:pPr>
-          </w:p>
-        </w:tc>
-        <w:tc>
-          <w:tcPr>
-            <w:tcW w:type="dxa" w:w="510"/>
-            <w:tcBorders>
-              <w:top w:val="single" w:color="8EA9C1" w:sz="4"/>
-              <w:left w:val="single" w:color="8EA9C1" w:sz="4"/>
-              <w:bottom w:val="single" w:color="8EA9C1" w:sz="4"/>
-              <w:right w:val="single" w:color="8EA9C1" w:sz="4"/>
-            </w:tcBorders>
-            <w:tcMar>
-              <w:top w:type="dxa" w:w="50"/>
-              <w:left w:type="dxa" w:w="80"/>
-              <w:bottom w:type="dxa" w:w="50"/>
-              <w:right w:type="dxa" w:w="80"/>
-            </w:tcMar>
-            <w:vAlign w:val="top"/>
-          </w:tcPr>
-          <w:p>
-            <w:pPr>
-              <w:spacing w:after="0" w:before="0" w:line="240"/>
-              <w:jc w:val="left"/>
-            </w:pPr>
-          </w:p>
-        </w:tc>
-        <w:tc>
-          <w:tcPr>
-            <w:tcW w:type="dxa" w:w="510"/>
-            <w:tcBorders>
-              <w:top w:val="single" w:color="8EA9C1" w:sz="4"/>
-              <w:left w:val="single" w:color="8EA9C1" w:sz="4"/>
-              <w:bottom w:val="single" w:color="8EA9C1" w:sz="4"/>
-              <w:right w:val="single" w:color="8EA9C1" w:sz="4"/>
-            </w:tcBorders>
-            <w:shd w:fill="7FA7CF" w:color="auto" w:val="clear"/>
-            <w:tcMar>
-              <w:top w:type="dxa" w:w="50"/>
-              <w:left w:type="dxa" w:w="80"/>
-              <w:bottom w:type="dxa" w:w="50"/>
-              <w:right w:type="dxa" w:w="80"/>
-            </w:tcMar>
-            <w:vAlign w:val="top"/>
-          </w:tcPr>
-          <w:p>
-            <w:pPr>
-              <w:spacing w:after="0" w:before="0" w:line="240"/>
-              <w:jc w:val="left"/>
-            </w:pPr>
-          </w:p>
-        </w:tc>
-        <w:tc>
-          <w:tcPr>
-            <w:tcW w:type="dxa" w:w="510"/>
-            <w:tcBorders>
-              <w:top w:val="single" w:color="8EA9C1" w:sz="4"/>
-              <w:left w:val="single" w:color="8EA9C1" w:sz="4"/>
-              <w:bottom w:val="single" w:color="8EA9C1" w:sz="4"/>
-              <w:right w:val="single" w:color="8EA9C1" w:sz="4"/>
-            </w:tcBorders>
             <w:tcMar>
               <w:top w:type="dxa" w:w="50"/>
               <w:left w:type="dxa" w:w="80"/>
@@ -12955,7 +11582,28 @@
     </w:tbl>
     <w:p>
       <w:pPr>
-        <w:spacing w:after="100" w:before="40"/>
+        <w:spacing w:after="0" w:before="0" w:line="200" w:lineRule="auto"/>
+      </w:pPr>
+      <w:r>
+        <w:rPr>
+          <w:sz w:val="10"/>
+          <w:szCs w:val="10"/>
+        </w:rPr>
+        <w:t xml:space="preserve"/>
+      </w:r>
+    </w:p>
+    <w:p>
+      <w:pPr>
+        <w:pStyle w:val="Heading2"/>
+      </w:pPr>
+      <w:r>
+        <w:t xml:space="preserve">6.2. Recursos y tecnologías</w:t>
+      </w:r>
+    </w:p>
+    <w:p>
+      <w:pPr>
+        <w:keepNext/>
+        <w:spacing w:after="60" w:before="120"/>
         <w:jc w:val="center"/>
       </w:pPr>
       <w:r>
@@ -12966,82 +11614,7 @@
           <w:sz w:val="20"/>
           <w:szCs w:val="20"/>
         </w:rPr>
-        <w:t xml:space="preserve">Figura 2. Diagrama de Gantt del DevOps Dojo.</w:t>
-      </w:r>
-    </w:p>
-    <w:p>
-      <w:pPr>
-        <w:pStyle w:val="Heading2"/>
-      </w:pPr>
-      <w:r>
-        <w:t xml:space="preserve">6.2. Estructura de cada sesión</w:t>
-      </w:r>
-    </w:p>
-    <w:p>
-      <w:pPr>
-        <w:spacing w:after="120"/>
-        <w:jc w:val="both"/>
-      </w:pPr>
-      <w:r>
-        <w:t xml:space="preserve">Cada sesión sigue la secuencia: </w:t>
-      </w:r>
-      <w:r>
-        <w:rPr>
-          <w:b/>
-          <w:bCs/>
-        </w:rPr>
-        <w:t xml:space="preserve">teoría</w:t>
-      </w:r>
-      <w:r>
-        <w:t xml:space="preserve"> (30 min), </w:t>
-      </w:r>
-      <w:r>
-        <w:rPr>
-          <w:b/>
-          <w:bCs/>
-        </w:rPr>
-        <w:t xml:space="preserve">demostración</w:t>
-      </w:r>
-      <w:r>
-        <w:t xml:space="preserve"> (30 min), </w:t>
-      </w:r>
-      <w:r>
-        <w:rPr>
-          <w:b/>
-          <w:bCs/>
-        </w:rPr>
-        <w:t xml:space="preserve">ejercicio práctico</w:t>
-      </w:r>
-      <w:r>
-        <w:t xml:space="preserve"> en tríos (120 min), </w:t>
-      </w:r>
-      <w:r>
-        <w:rPr>
-          <w:b/>
-          <w:bCs/>
-        </w:rPr>
-        <w:t xml:space="preserve">revisión de entregables</w:t>
-      </w:r>
-      <w:r>
-        <w:t xml:space="preserve"> (30 min) y </w:t>
-      </w:r>
-      <w:r>
-        <w:rPr>
-          <w:b/>
-          <w:bCs/>
-        </w:rPr>
-        <w:t xml:space="preserve">retrospectiva con encuesta</w:t>
-      </w:r>
-      <w:r>
-        <w:t xml:space="preserve"> (30 min).</w:t>
-      </w:r>
-    </w:p>
-    <w:p>
-      <w:pPr>
-        <w:pStyle w:val="Heading2"/>
-      </w:pPr>
-      <w:r>
-        <w:t xml:space="preserve">6.3. Recursos y tecnologías</w:t>
+        <w:t xml:space="preserve">Tabla 7. Recursos del Dojo.</w:t>
       </w:r>
     </w:p>
     <w:tbl>
@@ -13270,7 +11843,23 @@
                 <w:sz w:val="18"/>
                 <w:szCs w:val="18"/>
               </w:rPr>
-              <w:t xml:space="preserve">Clúster Kubernetes de pre-producción (3 nodos de control y 6 de trabajo de 8 vCPU y 16 GB), copia del replica set de MongoDB con datos anonimizados, servidor Redis y 2 máquinas generadoras de carga.</w:t>
+              <w:t xml:space="preserve">Clúster de pre-producción con 3 nodos de control (4 vCPU y 8 GB), que mantienen el quórum si falla uno, y 6 de trabajo (8 vCPU y 16 GB). Con 1 vCPU reservada por pod, el máximo del HPA (30 pods) más Redis, </w:t>
+            </w:r>
+            <w:r>
+              <w:rPr>
+                <w:i/>
+                <w:iCs/>
+                <w:sz w:val="18"/>
+                <w:szCs w:val="18"/>
+              </w:rPr>
+              <w:t xml:space="preserve">workers</w:t>
+            </w:r>
+            <w:r>
+              <w:rPr>
+                <w:sz w:val="18"/>
+                <w:szCs w:val="18"/>
+              </w:rPr>
+              <w:t xml:space="preserve"> y monitoreo requiere unos 34 vCPU, y los nodos ofrecen unos 44 asignables (37 con un nodo drenado), así que siempre hay capacidad para los pods nuevos. Además: copia del replica set con datos anonimizados, Redis y 2 máquinas generadoras de carga.</w:t>
             </w:r>
           </w:p>
         </w:tc>
@@ -13347,7 +11936,20 @@
     </w:tbl>
     <w:p>
       <w:pPr>
-        <w:spacing w:after="100" w:before="40"/>
+        <w:spacing w:after="0" w:before="0" w:line="200" w:lineRule="auto"/>
+      </w:pPr>
+      <w:r>
+        <w:rPr>
+          <w:sz w:val="10"/>
+          <w:szCs w:val="10"/>
+        </w:rPr>
+        <w:t xml:space="preserve"/>
+      </w:r>
+    </w:p>
+    <w:p>
+      <w:pPr>
+        <w:keepNext/>
+        <w:spacing w:after="60" w:before="120"/>
         <w:jc w:val="center"/>
       </w:pPr>
       <w:r>
@@ -13358,7 +11960,7 @@
           <w:sz w:val="20"/>
           <w:szCs w:val="20"/>
         </w:rPr>
-        <w:t xml:space="preserve">Tabla 7. Recursos del Dojo.</w:t>
+        <w:t xml:space="preserve">Tabla 8. Tecnologías del Dojo.</w:t>
       </w:r>
     </w:p>
     <w:tbl>
@@ -13521,7 +12123,7 @@
                 <w:sz w:val="18"/>
                 <w:szCs w:val="18"/>
               </w:rPr>
-              <w:t xml:space="preserve">Código y CI/CD</w:t>
+              <w:t xml:space="preserve">Código, calidad y CI/CD</w:t>
             </w:r>
           </w:p>
         </w:tc>
@@ -13552,7 +12154,7 @@
                 <w:sz w:val="18"/>
                 <w:szCs w:val="18"/>
               </w:rPr>
-              <w:t xml:space="preserve">GitLab y GitLab CI/CD</w:t>
+              <w:t xml:space="preserve">GitLab CI/CD, PHPUnit, Larastan y Docker</w:t>
             </w:r>
           </w:p>
         </w:tc>
@@ -13583,7 +12185,7 @@
                 <w:sz w:val="18"/>
                 <w:szCs w:val="18"/>
               </w:rPr>
-              <w:t xml:space="preserve">Repositorio, revisiones, canalizaciones y registro de imágenes.</w:t>
+              <w:t xml:space="preserve">Canalizaciones, pruebas, análisis estático e imagen PHP-FPM y Nginx.</w:t>
             </w:r>
           </w:p>
         </w:tc>
@@ -13622,7 +12224,7 @@
                 <w:sz w:val="18"/>
                 <w:szCs w:val="18"/>
               </w:rPr>
-              <w:t xml:space="preserve">Calidad</w:t>
+              <w:t xml:space="preserve">Orquestación y escalado</w:t>
             </w:r>
           </w:p>
         </w:tc>
@@ -13654,7 +12256,7 @@
                 <w:sz w:val="18"/>
                 <w:szCs w:val="18"/>
               </w:rPr>
-              <w:t xml:space="preserve">PHPUnit y Larastan</w:t>
+              <w:t xml:space="preserve">Kubernetes (RKE2; kind en local), Helm, Gateway API, HPA y metrics-server</w:t>
             </w:r>
           </w:p>
         </w:tc>
@@ -13686,7 +12288,7 @@
                 <w:sz w:val="18"/>
                 <w:szCs w:val="18"/>
               </w:rPr>
-              <w:t xml:space="preserve">Pruebas automatizadas y análisis estático de Laravel.</w:t>
+              <w:t xml:space="preserve">Despliegue, entrada de tráfico y ajuste automático de pods según la CPU.</w:t>
             </w:r>
           </w:p>
         </w:tc>
@@ -13724,7 +12326,7 @@
                 <w:sz w:val="18"/>
                 <w:szCs w:val="18"/>
               </w:rPr>
-              <w:t xml:space="preserve">Contenedores</w:t>
+              <w:t xml:space="preserve">Datos</w:t>
             </w:r>
           </w:p>
         </w:tc>
@@ -13755,7 +12357,7 @@
                 <w:sz w:val="18"/>
                 <w:szCs w:val="18"/>
               </w:rPr>
-              <w:t xml:space="preserve">Docker (kind para prácticas locales)</w:t>
+              <w:t xml:space="preserve">MongoDB 7 (replica set) y Redis</w:t>
             </w:r>
           </w:p>
         </w:tc>
@@ -13786,7 +12388,7 @@
                 <w:sz w:val="18"/>
                 <w:szCs w:val="18"/>
               </w:rPr>
-              <w:t xml:space="preserve">Imagen PHP-FPM y Nginx reproducible.</w:t>
+              <w:t xml:space="preserve">Base de datos optimizada; sesiones, caché y colas.</w:t>
             </w:r>
           </w:p>
         </w:tc>
@@ -13825,7 +12427,7 @@
                 <w:sz w:val="18"/>
                 <w:szCs w:val="18"/>
               </w:rPr>
-              <w:t xml:space="preserve">Orquestación</w:t>
+              <w:t xml:space="preserve">Pruebas de carga</w:t>
             </w:r>
           </w:p>
         </w:tc>
@@ -13857,7 +12459,7 @@
                 <w:sz w:val="18"/>
                 <w:szCs w:val="18"/>
               </w:rPr>
-              <w:t xml:space="preserve">Kubernetes (RKE2), Helm y Gateway API</w:t>
+              <w:t xml:space="preserve">k6</w:t>
             </w:r>
           </w:p>
         </w:tc>
@@ -13889,7 +12491,7 @@
                 <w:sz w:val="18"/>
                 <w:szCs w:val="18"/>
               </w:rPr>
-              <w:t xml:space="preserve">Despliegue, entrada de tráfico y versionado de la configuración.</w:t>
+              <w:t xml:space="preserve">Simulación de 5 000 a 10 000 usuarios concurrentes.</w:t>
             </w:r>
           </w:p>
         </w:tc>
@@ -13927,7 +12529,7 @@
                 <w:sz w:val="18"/>
                 <w:szCs w:val="18"/>
               </w:rPr>
-              <w:t xml:space="preserve">Escalado</w:t>
+              <w:t xml:space="preserve">Observabilidad</w:t>
             </w:r>
           </w:p>
         </w:tc>
@@ -13958,7 +12560,7 @@
                 <w:sz w:val="18"/>
                 <w:szCs w:val="18"/>
               </w:rPr>
-              <w:t xml:space="preserve">HPA y metrics-server</w:t>
+              <w:t xml:space="preserve">Prometheus, Grafana, Loki y MongoDB Exporter</w:t>
             </w:r>
           </w:p>
         </w:tc>
@@ -13989,7 +12591,7 @@
                 <w:sz w:val="18"/>
                 <w:szCs w:val="18"/>
               </w:rPr>
-              <w:t xml:space="preserve">Ajuste automático del número de pods según la CPU.</w:t>
+              <w:t xml:space="preserve">Métricas, registros, paneles y alertas.</w:t>
             </w:r>
           </w:p>
         </w:tc>
@@ -14028,7 +12630,7 @@
                 <w:sz w:val="18"/>
                 <w:szCs w:val="18"/>
               </w:rPr>
-              <w:t xml:space="preserve">Datos</w:t>
+              <w:t xml:space="preserve">Seguridad</w:t>
             </w:r>
           </w:p>
         </w:tc>
@@ -14060,7 +12662,7 @@
                 <w:sz w:val="18"/>
                 <w:szCs w:val="18"/>
               </w:rPr>
-              <w:t xml:space="preserve">MongoDB 7 (replica set) y Redis</w:t>
+              <w:t xml:space="preserve">Trivy, Sealed Secrets y NetworkPolicies</w:t>
             </w:r>
           </w:p>
         </w:tc>
@@ -14074,309 +12676,6 @@
               <w:right w:val="single" w:color="8EA9C1" w:sz="4"/>
             </w:tcBorders>
             <w:shd w:fill="F3F7FB" w:color="auto" w:val="clear"/>
-            <w:tcMar>
-              <w:top w:type="dxa" w:w="50"/>
-              <w:left w:type="dxa" w:w="80"/>
-              <w:bottom w:type="dxa" w:w="50"/>
-              <w:right w:type="dxa" w:w="80"/>
-            </w:tcMar>
-            <w:vAlign w:val="top"/>
-          </w:tcPr>
-          <w:p>
-            <w:pPr>
-              <w:spacing w:after="0" w:before="0" w:line="240"/>
-              <w:jc w:val="left"/>
-            </w:pPr>
-            <w:r>
-              <w:rPr>
-                <w:sz w:val="18"/>
-                <w:szCs w:val="18"/>
-              </w:rPr>
-              <w:t xml:space="preserve">Base de datos optimizada; sesiones, caché y colas.</w:t>
-            </w:r>
-          </w:p>
-        </w:tc>
-      </w:tr>
-      <w:tr>
-        <w:trPr>
-          <w:cantSplit/>
-        </w:trPr>
-        <w:tc>
-          <w:tcPr>
-            <w:tcW w:type="dxa" w:w="2000"/>
-            <w:tcBorders>
-              <w:top w:val="single" w:color="8EA9C1" w:sz="4"/>
-              <w:left w:val="single" w:color="8EA9C1" w:sz="4"/>
-              <w:bottom w:val="single" w:color="8EA9C1" w:sz="4"/>
-              <w:right w:val="single" w:color="8EA9C1" w:sz="4"/>
-            </w:tcBorders>
-            <w:tcMar>
-              <w:top w:type="dxa" w:w="50"/>
-              <w:left w:type="dxa" w:w="80"/>
-              <w:bottom w:type="dxa" w:w="50"/>
-              <w:right w:type="dxa" w:w="80"/>
-            </w:tcMar>
-            <w:vAlign w:val="top"/>
-          </w:tcPr>
-          <w:p>
-            <w:pPr>
-              <w:spacing w:after="0" w:before="0" w:line="240"/>
-              <w:jc w:val="left"/>
-            </w:pPr>
-            <w:r>
-              <w:rPr>
-                <w:b/>
-                <w:bCs/>
-                <w:sz w:val="18"/>
-                <w:szCs w:val="18"/>
-              </w:rPr>
-              <w:t xml:space="preserve">Pruebas de carga</w:t>
-            </w:r>
-          </w:p>
-        </w:tc>
-        <w:tc>
-          <w:tcPr>
-            <w:tcW w:type="dxa" w:w="3270"/>
-            <w:tcBorders>
-              <w:top w:val="single" w:color="8EA9C1" w:sz="4"/>
-              <w:left w:val="single" w:color="8EA9C1" w:sz="4"/>
-              <w:bottom w:val="single" w:color="8EA9C1" w:sz="4"/>
-              <w:right w:val="single" w:color="8EA9C1" w:sz="4"/>
-            </w:tcBorders>
-            <w:tcMar>
-              <w:top w:type="dxa" w:w="50"/>
-              <w:left w:type="dxa" w:w="80"/>
-              <w:bottom w:type="dxa" w:w="50"/>
-              <w:right w:type="dxa" w:w="80"/>
-            </w:tcMar>
-            <w:vAlign w:val="top"/>
-          </w:tcPr>
-          <w:p>
-            <w:pPr>
-              <w:spacing w:after="0" w:before="0" w:line="240"/>
-              <w:jc w:val="left"/>
-            </w:pPr>
-            <w:r>
-              <w:rPr>
-                <w:sz w:val="18"/>
-                <w:szCs w:val="18"/>
-              </w:rPr>
-              <w:t xml:space="preserve">k6</w:t>
-            </w:r>
-          </w:p>
-        </w:tc>
-        <w:tc>
-          <w:tcPr>
-            <w:tcW w:type="dxa" w:w="3800"/>
-            <w:tcBorders>
-              <w:top w:val="single" w:color="8EA9C1" w:sz="4"/>
-              <w:left w:val="single" w:color="8EA9C1" w:sz="4"/>
-              <w:bottom w:val="single" w:color="8EA9C1" w:sz="4"/>
-              <w:right w:val="single" w:color="8EA9C1" w:sz="4"/>
-            </w:tcBorders>
-            <w:tcMar>
-              <w:top w:type="dxa" w:w="50"/>
-              <w:left w:type="dxa" w:w="80"/>
-              <w:bottom w:type="dxa" w:w="50"/>
-              <w:right w:type="dxa" w:w="80"/>
-            </w:tcMar>
-            <w:vAlign w:val="top"/>
-          </w:tcPr>
-          <w:p>
-            <w:pPr>
-              <w:spacing w:after="0" w:before="0" w:line="240"/>
-              <w:jc w:val="left"/>
-            </w:pPr>
-            <w:r>
-              <w:rPr>
-                <w:sz w:val="18"/>
-                <w:szCs w:val="18"/>
-              </w:rPr>
-              <w:t xml:space="preserve">Simulación de 5 000 a 10 000 usuarios concurrentes.</w:t>
-            </w:r>
-          </w:p>
-        </w:tc>
-      </w:tr>
-      <w:tr>
-        <w:trPr>
-          <w:cantSplit/>
-        </w:trPr>
-        <w:tc>
-          <w:tcPr>
-            <w:tcW w:type="dxa" w:w="2000"/>
-            <w:tcBorders>
-              <w:top w:val="single" w:color="8EA9C1" w:sz="4"/>
-              <w:left w:val="single" w:color="8EA9C1" w:sz="4"/>
-              <w:bottom w:val="single" w:color="8EA9C1" w:sz="4"/>
-              <w:right w:val="single" w:color="8EA9C1" w:sz="4"/>
-            </w:tcBorders>
-            <w:shd w:fill="F3F7FB" w:color="auto" w:val="clear"/>
-            <w:tcMar>
-              <w:top w:type="dxa" w:w="50"/>
-              <w:left w:type="dxa" w:w="80"/>
-              <w:bottom w:type="dxa" w:w="50"/>
-              <w:right w:type="dxa" w:w="80"/>
-            </w:tcMar>
-            <w:vAlign w:val="top"/>
-          </w:tcPr>
-          <w:p>
-            <w:pPr>
-              <w:spacing w:after="0" w:before="0" w:line="240"/>
-              <w:jc w:val="left"/>
-            </w:pPr>
-            <w:r>
-              <w:rPr>
-                <w:b/>
-                <w:bCs/>
-                <w:sz w:val="18"/>
-                <w:szCs w:val="18"/>
-              </w:rPr>
-              <w:t xml:space="preserve">Observabilidad</w:t>
-            </w:r>
-          </w:p>
-        </w:tc>
-        <w:tc>
-          <w:tcPr>
-            <w:tcW w:type="dxa" w:w="3270"/>
-            <w:tcBorders>
-              <w:top w:val="single" w:color="8EA9C1" w:sz="4"/>
-              <w:left w:val="single" w:color="8EA9C1" w:sz="4"/>
-              <w:bottom w:val="single" w:color="8EA9C1" w:sz="4"/>
-              <w:right w:val="single" w:color="8EA9C1" w:sz="4"/>
-            </w:tcBorders>
-            <w:shd w:fill="F3F7FB" w:color="auto" w:val="clear"/>
-            <w:tcMar>
-              <w:top w:type="dxa" w:w="50"/>
-              <w:left w:type="dxa" w:w="80"/>
-              <w:bottom w:type="dxa" w:w="50"/>
-              <w:right w:type="dxa" w:w="80"/>
-            </w:tcMar>
-            <w:vAlign w:val="top"/>
-          </w:tcPr>
-          <w:p>
-            <w:pPr>
-              <w:spacing w:after="0" w:before="0" w:line="240"/>
-              <w:jc w:val="left"/>
-            </w:pPr>
-            <w:r>
-              <w:rPr>
-                <w:sz w:val="18"/>
-                <w:szCs w:val="18"/>
-              </w:rPr>
-              <w:t xml:space="preserve">Prometheus, Grafana, Loki y MongoDB Exporter</w:t>
-            </w:r>
-          </w:p>
-        </w:tc>
-        <w:tc>
-          <w:tcPr>
-            <w:tcW w:type="dxa" w:w="3800"/>
-            <w:tcBorders>
-              <w:top w:val="single" w:color="8EA9C1" w:sz="4"/>
-              <w:left w:val="single" w:color="8EA9C1" w:sz="4"/>
-              <w:bottom w:val="single" w:color="8EA9C1" w:sz="4"/>
-              <w:right w:val="single" w:color="8EA9C1" w:sz="4"/>
-            </w:tcBorders>
-            <w:shd w:fill="F3F7FB" w:color="auto" w:val="clear"/>
-            <w:tcMar>
-              <w:top w:type="dxa" w:w="50"/>
-              <w:left w:type="dxa" w:w="80"/>
-              <w:bottom w:type="dxa" w:w="50"/>
-              <w:right w:type="dxa" w:w="80"/>
-            </w:tcMar>
-            <w:vAlign w:val="top"/>
-          </w:tcPr>
-          <w:p>
-            <w:pPr>
-              <w:spacing w:after="0" w:before="0" w:line="240"/>
-              <w:jc w:val="left"/>
-            </w:pPr>
-            <w:r>
-              <w:rPr>
-                <w:sz w:val="18"/>
-                <w:szCs w:val="18"/>
-              </w:rPr>
-              <w:t xml:space="preserve">Métricas, registros, paneles y alertas.</w:t>
-            </w:r>
-          </w:p>
-        </w:tc>
-      </w:tr>
-      <w:tr>
-        <w:trPr>
-          <w:cantSplit/>
-        </w:trPr>
-        <w:tc>
-          <w:tcPr>
-            <w:tcW w:type="dxa" w:w="2000"/>
-            <w:tcBorders>
-              <w:top w:val="single" w:color="8EA9C1" w:sz="4"/>
-              <w:left w:val="single" w:color="8EA9C1" w:sz="4"/>
-              <w:bottom w:val="single" w:color="8EA9C1" w:sz="4"/>
-              <w:right w:val="single" w:color="8EA9C1" w:sz="4"/>
-            </w:tcBorders>
-            <w:tcMar>
-              <w:top w:type="dxa" w:w="50"/>
-              <w:left w:type="dxa" w:w="80"/>
-              <w:bottom w:type="dxa" w:w="50"/>
-              <w:right w:type="dxa" w:w="80"/>
-            </w:tcMar>
-            <w:vAlign w:val="top"/>
-          </w:tcPr>
-          <w:p>
-            <w:pPr>
-              <w:spacing w:after="0" w:before="0" w:line="240"/>
-              <w:jc w:val="left"/>
-            </w:pPr>
-            <w:r>
-              <w:rPr>
-                <w:b/>
-                <w:bCs/>
-                <w:sz w:val="18"/>
-                <w:szCs w:val="18"/>
-              </w:rPr>
-              <w:t xml:space="preserve">Seguridad</w:t>
-            </w:r>
-          </w:p>
-        </w:tc>
-        <w:tc>
-          <w:tcPr>
-            <w:tcW w:type="dxa" w:w="3270"/>
-            <w:tcBorders>
-              <w:top w:val="single" w:color="8EA9C1" w:sz="4"/>
-              <w:left w:val="single" w:color="8EA9C1" w:sz="4"/>
-              <w:bottom w:val="single" w:color="8EA9C1" w:sz="4"/>
-              <w:right w:val="single" w:color="8EA9C1" w:sz="4"/>
-            </w:tcBorders>
-            <w:tcMar>
-              <w:top w:type="dxa" w:w="50"/>
-              <w:left w:type="dxa" w:w="80"/>
-              <w:bottom w:type="dxa" w:w="50"/>
-              <w:right w:type="dxa" w:w="80"/>
-            </w:tcMar>
-            <w:vAlign w:val="top"/>
-          </w:tcPr>
-          <w:p>
-            <w:pPr>
-              <w:spacing w:after="0" w:before="0" w:line="240"/>
-              <w:jc w:val="left"/>
-            </w:pPr>
-            <w:r>
-              <w:rPr>
-                <w:sz w:val="18"/>
-                <w:szCs w:val="18"/>
-              </w:rPr>
-              <w:t xml:space="preserve">Trivy, Sealed Secrets y NetworkPolicies</w:t>
-            </w:r>
-          </w:p>
-        </w:tc>
-        <w:tc>
-          <w:tcPr>
-            <w:tcW w:type="dxa" w:w="3800"/>
-            <w:tcBorders>
-              <w:top w:val="single" w:color="8EA9C1" w:sz="4"/>
-              <w:left w:val="single" w:color="8EA9C1" w:sz="4"/>
-              <w:bottom w:val="single" w:color="8EA9C1" w:sz="4"/>
-              <w:right w:val="single" w:color="8EA9C1" w:sz="4"/>
-            </w:tcBorders>
             <w:tcMar>
               <w:top w:type="dxa" w:w="50"/>
               <w:left w:type="dxa" w:w="80"/>
@@ -14403,7 +12702,77 @@
     </w:tbl>
     <w:p>
       <w:pPr>
-        <w:spacing w:after="100" w:before="40"/>
+        <w:spacing w:after="0" w:before="0" w:line="200" w:lineRule="auto"/>
+      </w:pPr>
+      <w:r>
+        <w:rPr>
+          <w:sz w:val="10"/>
+          <w:szCs w:val="10"/>
+        </w:rPr>
+        <w:t xml:space="preserve"/>
+      </w:r>
+    </w:p>
+    <w:p>
+      <w:pPr>
+        <w:pStyle w:val="Heading1"/>
+      </w:pPr>
+      <w:r>
+        <w:t xml:space="preserve">7. Ejercicio 4. Métricas de desempeño</w:t>
+      </w:r>
+    </w:p>
+    <w:p>
+      <w:pPr>
+        <w:spacing w:after="120"/>
+        <w:jc w:val="both"/>
+      </w:pPr>
+      <w:r>
+        <w:t xml:space="preserve">Las métricas combinan indicadores de </w:t>
+      </w:r>
+      <w:r>
+        <w:rPr>
+          <w:b/>
+          <w:bCs/>
+        </w:rPr>
+        <w:t xml:space="preserve">capacidad y confiabilidad</w:t>
+      </w:r>
+      <w:r>
+        <w:t xml:space="preserve"> del portal, las </w:t>
+      </w:r>
+      <w:r>
+        <w:rPr>
+          <w:b/>
+          <w:bCs/>
+        </w:rPr>
+        <w:t xml:space="preserve">métricas DORA</w:t>
+      </w:r>
+      <w:r>
+        <w:t xml:space="preserve"> de entrega de software (Forsgren et al., 2018) y los indicadores de </w:t>
+      </w:r>
+      <w:r>
+        <w:rPr>
+          <w:b/>
+          <w:bCs/>
+        </w:rPr>
+        <w:t xml:space="preserve">aprendizaje</w:t>
+      </w:r>
+      <w:r>
+        <w:t xml:space="preserve">. Para que los resultados sean comparables, todas las pruebas usan el mismo </w:t>
+      </w:r>
+      <w:r>
+        <w:rPr>
+          <w:b/>
+          <w:bCs/>
+        </w:rPr>
+        <w:t xml:space="preserve">escenario k6</w:t>
+      </w:r>
+      <w:r>
+        <w:t xml:space="preserve">: 70 % de consultas de estado de cuenta, 20 % de navegación y 10 % de operaciones de escritura (inicio de sesión y pagos), subiendo 1 000 usuarios cada 5 minutos hasta una meseta de 15 minutos. Se acepta si en la meseta la latencia p95 es inferior a 800 ms, los errores no llegan al 1 % y no cambia el primario de MongoDB.</w:t>
+      </w:r>
+    </w:p>
+    <w:p>
+      <w:pPr>
+        <w:keepNext/>
+        <w:spacing w:after="60" w:before="120"/>
         <w:jc w:val="center"/>
       </w:pPr>
       <w:r>
@@ -14414,54 +12783,7 @@
           <w:sz w:val="20"/>
           <w:szCs w:val="20"/>
         </w:rPr>
-        <w:t xml:space="preserve">Tabla 8. Tecnologías del Dojo.</w:t>
-      </w:r>
-    </w:p>
-    <w:p>
-      <w:pPr>
-        <w:pStyle w:val="Heading1"/>
-      </w:pPr>
-      <w:r>
-        <w:t xml:space="preserve">7. Ejercicio 4. Métricas de desempeño</w:t>
-      </w:r>
-    </w:p>
-    <w:p>
-      <w:pPr>
-        <w:spacing w:after="120"/>
-        <w:jc w:val="both"/>
-      </w:pPr>
-      <w:r>
-        <w:t xml:space="preserve">Las métricas combinan indicadores de </w:t>
-      </w:r>
-      <w:r>
-        <w:rPr>
-          <w:b/>
-          <w:bCs/>
-        </w:rPr>
-        <w:t xml:space="preserve">capacidad y confiabilidad</w:t>
-      </w:r>
-      <w:r>
-        <w:t xml:space="preserve"> del portal, las </w:t>
-      </w:r>
-      <w:r>
-        <w:rPr>
-          <w:b/>
-          <w:bCs/>
-        </w:rPr>
-        <w:t xml:space="preserve">métricas DORA</w:t>
-      </w:r>
-      <w:r>
-        <w:t xml:space="preserve"> de entrega de software (Forsgren et al., 2018) y los indicadores de </w:t>
-      </w:r>
-      <w:r>
-        <w:rPr>
-          <w:b/>
-          <w:bCs/>
-        </w:rPr>
-        <w:t xml:space="preserve">aprendizaje</w:t>
-      </w:r>
-      <w:r>
-        <w:t xml:space="preserve">. Todas las pruebas de carga se ejecutan con el mismo escenario k6 para que los resultados sean comparables:</w:t>
+        <w:t xml:space="preserve">Tabla 9. Métricas de desempeño del DevOps Dojo.</w:t>
       </w:r>
     </w:p>
     <w:tbl>
@@ -14922,7 +13244,7 @@
                 <w:sz w:val="18"/>
                 <w:szCs w:val="18"/>
               </w:rPr>
-              <w:t xml:space="preserve">Latencia p95 en el pico (OG)</w:t>
+              <w:t xml:space="preserve">Latencia p95 (OG)</w:t>
             </w:r>
           </w:p>
         </w:tc>
@@ -14954,7 +13276,7 @@
                 <w:sz w:val="18"/>
                 <w:szCs w:val="18"/>
               </w:rPr>
-              <w:t xml:space="preserve">Percentil 95 del tiempo de respuesta con 5 000 usuarios.</w:t>
+              <w:t xml:space="preserve">Percentil 95 del tiempo de respuesta durante la meseta de la prueba.</w:t>
             </w:r>
           </w:p>
         </w:tc>
@@ -14986,7 +13308,7 @@
                 <w:sz w:val="18"/>
                 <w:szCs w:val="18"/>
               </w:rPr>
-              <w:t xml:space="preserve">1 900 ms</w:t>
+              <w:t xml:space="preserve">1 900 ms con 5 000</w:t>
             </w:r>
           </w:p>
         </w:tc>
@@ -15018,7 +13340,7 @@
                 <w:sz w:val="18"/>
                 <w:szCs w:val="18"/>
               </w:rPr>
-              <w:t xml:space="preserve">&lt; 500 ms</w:t>
+              <w:t xml:space="preserve">&lt; 800 ms con 10 000</w:t>
             </w:r>
           </w:p>
         </w:tc>
@@ -16086,7 +14408,7 @@
                 <w:sz w:val="18"/>
                 <w:szCs w:val="18"/>
               </w:rPr>
-              <w:t xml:space="preserve">Tiempo de recuperación (OE7)</w:t>
+              <w:t xml:space="preserve">Tiempo de recuperación automática (OE7)</w:t>
             </w:r>
           </w:p>
         </w:tc>
@@ -16118,7 +14440,7 @@
                 <w:sz w:val="18"/>
                 <w:szCs w:val="18"/>
               </w:rPr>
-              <w:t xml:space="preserve">Mediana desde el fallo inyectado hasta el servicio normal.</w:t>
+              <w:t xml:space="preserve">Mediana desde el fallo inyectado hasta el servicio normal, sin intervención manual.</w:t>
             </w:r>
           </w:p>
         </w:tc>
@@ -16150,7 +14472,7 @@
                 <w:sz w:val="18"/>
                 <w:szCs w:val="18"/>
               </w:rPr>
-              <w:t xml:space="preserve">95 min</w:t>
+              <w:t xml:space="preserve">95 min (manual)</w:t>
             </w:r>
           </w:p>
         </w:tc>
@@ -16506,7 +14828,7 @@
                 <w:sz w:val="18"/>
                 <w:szCs w:val="18"/>
               </w:rPr>
-              <w:t xml:space="preserve">Prueba práctica final frente a inicial; asistencia; acciones a tiempo.</w:t>
+              <w:t xml:space="preserve">Puntuación de la prueba práctica (sección 7.1); asistencia; acciones a tiempo.</w:t>
             </w:r>
           </w:p>
         </w:tc>
@@ -16642,18 +14964,14 @@
     </w:tbl>
     <w:p>
       <w:pPr>
-        <w:spacing w:after="100" w:before="40"/>
-        <w:jc w:val="center"/>
+        <w:spacing w:after="0" w:before="0" w:line="200" w:lineRule="auto"/>
       </w:pPr>
       <w:r>
         <w:rPr>
-          <w:i/>
-          <w:iCs/>
-          <w:color w:val="404040"/>
-          <w:sz w:val="20"/>
-          <w:szCs w:val="20"/>
+          <w:sz w:val="10"/>
+          <w:szCs w:val="10"/>
         </w:rPr>
-        <w:t xml:space="preserve">Tabla 9. Métricas de desempeño del DevOps Dojo.</w:t>
+        <w:t xml:space="preserve"/>
       </w:r>
     </w:p>
     <w:p>
@@ -16670,78 +14988,37 @@
         <w:jc w:val="both"/>
       </w:pPr>
       <w:r>
-        <w:t xml:space="preserve">Los datos se extraerán automáticamente de k6, Prometheus, GitLab y Trivy hacia un panel compartido de Grafana; en la semana 1 se documentará la fórmula, la fuente y el responsable de cada indicador. El análisis se hará en tres niveles:</w:t>
-      </w:r>
-    </w:p>
-    <w:p>
-      <w:pPr>
-        <w:pStyle w:val="ListParagraph"/>
-        <w:numPr>
-          <w:ilvl w:val="0"/>
-          <w:numId w:val="2"/>
-        </w:numPr>
-        <w:spacing w:after="40"/>
-        <w:jc w:val="both"/>
-      </w:pPr>
+        <w:t xml:space="preserve">Los datos se extraerán automáticamente de k6, Prometheus, GitLab y Trivy hacia un panel de Grafana, y en la semana 1 se documentará la fórmula y el responsable de cada indicador. El análisis será </w:t>
+      </w:r>
       <w:r>
         <w:rPr>
           <w:b/>
           <w:bCs/>
         </w:rPr>
-        <w:t xml:space="preserve">Operativo (semanal):</w:t>
-      </w:r>
-      <w:r>
-        <w:t xml:space="preserve"> el equipo revisa los resultados de las pruebas y los fallos de la canalización en la retrospectiva.</w:t>
-      </w:r>
-    </w:p>
-    <w:p>
-      <w:pPr>
-        <w:pStyle w:val="ListParagraph"/>
-        <w:numPr>
-          <w:ilvl w:val="0"/>
-          <w:numId w:val="2"/>
-        </w:numPr>
-        <w:spacing w:after="40"/>
-        <w:jc w:val="both"/>
-      </w:pPr>
+        <w:t xml:space="preserve">semanal</w:t>
+      </w:r>
+      <w:r>
+        <w:t xml:space="preserve"> (el equipo revisa pruebas y fallos en la retrospectiva), </w:t>
+      </w:r>
       <w:r>
         <w:rPr>
           <w:b/>
           <w:bCs/>
         </w:rPr>
-        <w:t xml:space="preserve">Táctico (quincenal):</w:t>
-      </w:r>
-      <w:r>
-        <w:t xml:space="preserve"> el coordinador compara cada prueba de carga con la anterior; si un indicador no mejora, se analiza la causa antes de avanzar al siguiente bloque.</w:t>
-      </w:r>
-    </w:p>
-    <w:p>
-      <w:pPr>
-        <w:pStyle w:val="ListParagraph"/>
-        <w:numPr>
-          <w:ilvl w:val="0"/>
-          <w:numId w:val="2"/>
-        </w:numPr>
-        <w:spacing w:after="40"/>
-        <w:jc w:val="both"/>
-      </w:pPr>
+        <w:t xml:space="preserve">quincenal</w:t>
+      </w:r>
+      <w:r>
+        <w:t xml:space="preserve"> (el coordinador compara cada prueba con la anterior y, si un indicador no mejora, se analiza la causa antes de avanzar) y </w:t>
+      </w:r>
       <w:r>
         <w:rPr>
           <w:b/>
           <w:bCs/>
         </w:rPr>
-        <w:t xml:space="preserve">Estratégico (semana 12):</w:t>
-      </w:r>
-      <w:r>
-        <w:t xml:space="preserve"> el patrocinador decide la migración a producción si se cumplen las metas de usuarios, latencia, errores y recuperación.</w:t>
-      </w:r>
-    </w:p>
-    <w:p>
-      <w:pPr>
-        <w:pStyle w:val="Heading1"/>
-      </w:pPr>
-      <w:r>
-        <w:t xml:space="preserve">8. Ejercicio 4. Sistema de retroalimentación</w:t>
+        <w:t xml:space="preserve">final</w:t>
+      </w:r>
+      <w:r>
+        <w:t xml:space="preserve"> (el patrocinador decide la migración si se cumplen las metas).</w:t>
       </w:r>
     </w:p>
     <w:p>
@@ -16750,320 +15027,59 @@
         <w:jc w:val="both"/>
       </w:pPr>
       <w:r>
-        <w:t xml:space="preserve">El sistema sigue un ciclo de cinco pasos que se repite al terminar cada sesión:</w:t>
+        <w:t xml:space="preserve">La meta de recuperación inferior a un minuto se refiere a fallos que el sistema resuelve solo: las sondas retiran el pod fallido y las demás réplicas atienden el tráfico, y una elección de primario en MongoDB suele tardar unos 12 segundos (MongoDB, Inc., s. f.). Los fallos que requieren intervención humana se registran aparte.</w:t>
       </w:r>
     </w:p>
-    <w:tbl>
-      <w:tblPr>
-        <w:tblW w:type="dxa" w:w="9070"/>
-        <w:tblBorders>
-          <w:top w:val="single" w:color="auto" w:sz="4"/>
-          <w:left w:val="single" w:color="auto" w:sz="4"/>
-          <w:bottom w:val="single" w:color="auto" w:sz="4"/>
-          <w:right w:val="single" w:color="auto" w:sz="4"/>
-          <w:insideH w:val="single" w:color="auto" w:sz="4"/>
-          <w:insideV w:val="single" w:color="auto" w:sz="4"/>
-        </w:tblBorders>
-      </w:tblPr>
-      <w:tblGrid>
-        <w:gridCol w:w="1490"/>
-        <w:gridCol w:w="405"/>
-        <w:gridCol w:w="1490"/>
-        <w:gridCol w:w="405"/>
-        <w:gridCol w:w="1490"/>
-        <w:gridCol w:w="405"/>
-        <w:gridCol w:w="1490"/>
-        <w:gridCol w:w="405"/>
-        <w:gridCol w:w="1490"/>
-      </w:tblGrid>
-      <w:tr>
-        <w:tc>
-          <w:tcPr>
-            <w:tcW w:type="dxa" w:w="1490"/>
-            <w:tcBorders>
-              <w:top w:val="single" w:color="8EA9C1" w:sz="4"/>
-              <w:left w:val="single" w:color="8EA9C1" w:sz="4"/>
-              <w:bottom w:val="single" w:color="8EA9C1" w:sz="4"/>
-              <w:right w:val="single" w:color="8EA9C1" w:sz="4"/>
-            </w:tcBorders>
-            <w:shd w:fill="DCE6F1" w:color="auto" w:val="clear"/>
-            <w:tcMar>
-              <w:top w:type="dxa" w:w="50"/>
-              <w:left w:type="dxa" w:w="80"/>
-              <w:bottom w:type="dxa" w:w="50"/>
-              <w:right w:type="dxa" w:w="80"/>
-            </w:tcMar>
-            <w:vAlign w:val="center"/>
-          </w:tcPr>
-          <w:p>
-            <w:pPr>
-              <w:spacing w:after="0" w:before="0" w:line="240"/>
-              <w:jc w:val="center"/>
-            </w:pPr>
-            <w:r>
-              <w:rPr>
-                <w:b/>
-                <w:bCs/>
-                <w:sz w:val="18"/>
-                <w:szCs w:val="18"/>
-              </w:rPr>
-              <w:t xml:space="preserve">1. Recolectar</w:t>
-            </w:r>
-          </w:p>
-        </w:tc>
-        <w:tc>
-          <w:tcPr>
-            <w:tcW w:type="dxa" w:w="405"/>
-            <w:tcBorders>
-              <w:top w:val="none"/>
-              <w:left w:val="single" w:color="8EA9C1" w:sz="4"/>
-              <w:bottom w:val="none"/>
-              <w:right w:val="single" w:color="8EA9C1" w:sz="4"/>
-            </w:tcBorders>
-            <w:vAlign w:val="center"/>
-          </w:tcPr>
-          <w:p>
-            <w:pPr>
-              <w:spacing w:after="0" w:before="0" w:line="240"/>
-              <w:jc w:val="center"/>
-            </w:pPr>
-            <w:r>
-              <w:rPr>
-                <w:b/>
-                <w:bCs/>
-                <w:color w:val="1F4E79"/>
-                <w:sz w:val="28"/>
-                <w:szCs w:val="28"/>
-              </w:rPr>
-              <w:t xml:space="preserve">→</w:t>
-            </w:r>
-          </w:p>
-        </w:tc>
-        <w:tc>
-          <w:tcPr>
-            <w:tcW w:type="dxa" w:w="1490"/>
-            <w:tcBorders>
-              <w:top w:val="single" w:color="8EA9C1" w:sz="4"/>
-              <w:left w:val="single" w:color="8EA9C1" w:sz="4"/>
-              <w:bottom w:val="single" w:color="8EA9C1" w:sz="4"/>
-              <w:right w:val="single" w:color="8EA9C1" w:sz="4"/>
-            </w:tcBorders>
-            <w:shd w:fill="DCE6F1" w:color="auto" w:val="clear"/>
-            <w:tcMar>
-              <w:top w:type="dxa" w:w="50"/>
-              <w:left w:type="dxa" w:w="80"/>
-              <w:bottom w:type="dxa" w:w="50"/>
-              <w:right w:type="dxa" w:w="80"/>
-            </w:tcMar>
-            <w:vAlign w:val="center"/>
-          </w:tcPr>
-          <w:p>
-            <w:pPr>
-              <w:spacing w:after="0" w:before="0" w:line="240"/>
-              <w:jc w:val="center"/>
-            </w:pPr>
-            <w:r>
-              <w:rPr>
-                <w:b/>
-                <w:bCs/>
-                <w:sz w:val="18"/>
-                <w:szCs w:val="18"/>
-              </w:rPr>
-              <w:t xml:space="preserve">2. Consolidar</w:t>
-            </w:r>
-          </w:p>
-        </w:tc>
-        <w:tc>
-          <w:tcPr>
-            <w:tcW w:type="dxa" w:w="405"/>
-            <w:tcBorders>
-              <w:top w:val="none"/>
-              <w:left w:val="single" w:color="8EA9C1" w:sz="4"/>
-              <w:bottom w:val="none"/>
-              <w:right w:val="single" w:color="8EA9C1" w:sz="4"/>
-            </w:tcBorders>
-            <w:vAlign w:val="center"/>
-          </w:tcPr>
-          <w:p>
-            <w:pPr>
-              <w:spacing w:after="0" w:before="0" w:line="240"/>
-              <w:jc w:val="center"/>
-            </w:pPr>
-            <w:r>
-              <w:rPr>
-                <w:b/>
-                <w:bCs/>
-                <w:color w:val="1F4E79"/>
-                <w:sz w:val="28"/>
-                <w:szCs w:val="28"/>
-              </w:rPr>
-              <w:t xml:space="preserve">→</w:t>
-            </w:r>
-          </w:p>
-        </w:tc>
-        <w:tc>
-          <w:tcPr>
-            <w:tcW w:type="dxa" w:w="1490"/>
-            <w:tcBorders>
-              <w:top w:val="single" w:color="8EA9C1" w:sz="4"/>
-              <w:left w:val="single" w:color="8EA9C1" w:sz="4"/>
-              <w:bottom w:val="single" w:color="8EA9C1" w:sz="4"/>
-              <w:right w:val="single" w:color="8EA9C1" w:sz="4"/>
-            </w:tcBorders>
-            <w:shd w:fill="DCE6F1" w:color="auto" w:val="clear"/>
-            <w:tcMar>
-              <w:top w:type="dxa" w:w="50"/>
-              <w:left w:type="dxa" w:w="80"/>
-              <w:bottom w:type="dxa" w:w="50"/>
-              <w:right w:type="dxa" w:w="80"/>
-            </w:tcMar>
-            <w:vAlign w:val="center"/>
-          </w:tcPr>
-          <w:p>
-            <w:pPr>
-              <w:spacing w:after="0" w:before="0" w:line="240"/>
-              <w:jc w:val="center"/>
-            </w:pPr>
-            <w:r>
-              <w:rPr>
-                <w:b/>
-                <w:bCs/>
-                <w:sz w:val="18"/>
-                <w:szCs w:val="18"/>
-              </w:rPr>
-              <w:t xml:space="preserve">3. Analizar y priorizar</w:t>
-            </w:r>
-          </w:p>
-        </w:tc>
-        <w:tc>
-          <w:tcPr>
-            <w:tcW w:type="dxa" w:w="405"/>
-            <w:tcBorders>
-              <w:top w:val="none"/>
-              <w:left w:val="single" w:color="8EA9C1" w:sz="4"/>
-              <w:bottom w:val="none"/>
-              <w:right w:val="single" w:color="8EA9C1" w:sz="4"/>
-            </w:tcBorders>
-            <w:vAlign w:val="center"/>
-          </w:tcPr>
-          <w:p>
-            <w:pPr>
-              <w:spacing w:after="0" w:before="0" w:line="240"/>
-              <w:jc w:val="center"/>
-            </w:pPr>
-            <w:r>
-              <w:rPr>
-                <w:b/>
-                <w:bCs/>
-                <w:color w:val="1F4E79"/>
-                <w:sz w:val="28"/>
-                <w:szCs w:val="28"/>
-              </w:rPr>
-              <w:t xml:space="preserve">→</w:t>
-            </w:r>
-          </w:p>
-        </w:tc>
-        <w:tc>
-          <w:tcPr>
-            <w:tcW w:type="dxa" w:w="1490"/>
-            <w:tcBorders>
-              <w:top w:val="single" w:color="8EA9C1" w:sz="4"/>
-              <w:left w:val="single" w:color="8EA9C1" w:sz="4"/>
-              <w:bottom w:val="single" w:color="8EA9C1" w:sz="4"/>
-              <w:right w:val="single" w:color="8EA9C1" w:sz="4"/>
-            </w:tcBorders>
-            <w:shd w:fill="DCE6F1" w:color="auto" w:val="clear"/>
-            <w:tcMar>
-              <w:top w:type="dxa" w:w="50"/>
-              <w:left w:type="dxa" w:w="80"/>
-              <w:bottom w:type="dxa" w:w="50"/>
-              <w:right w:type="dxa" w:w="80"/>
-            </w:tcMar>
-            <w:vAlign w:val="center"/>
-          </w:tcPr>
-          <w:p>
-            <w:pPr>
-              <w:spacing w:after="0" w:before="0" w:line="240"/>
-              <w:jc w:val="center"/>
-            </w:pPr>
-            <w:r>
-              <w:rPr>
-                <w:b/>
-                <w:bCs/>
-                <w:sz w:val="18"/>
-                <w:szCs w:val="18"/>
-              </w:rPr>
-              <w:t xml:space="preserve">4. Aplicar</w:t>
-            </w:r>
-          </w:p>
-        </w:tc>
-        <w:tc>
-          <w:tcPr>
-            <w:tcW w:type="dxa" w:w="405"/>
-            <w:tcBorders>
-              <w:top w:val="none"/>
-              <w:left w:val="single" w:color="8EA9C1" w:sz="4"/>
-              <w:bottom w:val="none"/>
-              <w:right w:val="single" w:color="8EA9C1" w:sz="4"/>
-            </w:tcBorders>
-            <w:vAlign w:val="center"/>
-          </w:tcPr>
-          <w:p>
-            <w:pPr>
-              <w:spacing w:after="0" w:before="0" w:line="240"/>
-              <w:jc w:val="center"/>
-            </w:pPr>
-            <w:r>
-              <w:rPr>
-                <w:b/>
-                <w:bCs/>
-                <w:color w:val="1F4E79"/>
-                <w:sz w:val="28"/>
-                <w:szCs w:val="28"/>
-              </w:rPr>
-              <w:t xml:space="preserve">→</w:t>
-            </w:r>
-          </w:p>
-        </w:tc>
-        <w:tc>
-          <w:tcPr>
-            <w:tcW w:type="dxa" w:w="1490"/>
-            <w:tcBorders>
-              <w:top w:val="single" w:color="8EA9C1" w:sz="4"/>
-              <w:left w:val="single" w:color="8EA9C1" w:sz="4"/>
-              <w:bottom w:val="single" w:color="8EA9C1" w:sz="4"/>
-              <w:right w:val="single" w:color="8EA9C1" w:sz="4"/>
-            </w:tcBorders>
-            <w:shd w:fill="DCE6F1" w:color="auto" w:val="clear"/>
-            <w:tcMar>
-              <w:top w:type="dxa" w:w="50"/>
-              <w:left w:type="dxa" w:w="80"/>
-              <w:bottom w:type="dxa" w:w="50"/>
-              <w:right w:type="dxa" w:w="80"/>
-            </w:tcMar>
-            <w:vAlign w:val="center"/>
-          </w:tcPr>
-          <w:p>
-            <w:pPr>
-              <w:spacing w:after="0" w:before="0" w:line="240"/>
-              <w:jc w:val="center"/>
-            </w:pPr>
-            <w:r>
-              <w:rPr>
-                <w:b/>
-                <w:bCs/>
-                <w:sz w:val="18"/>
-                <w:szCs w:val="18"/>
-              </w:rPr>
-              <w:t xml:space="preserve">5. Verificar</w:t>
-            </w:r>
-          </w:p>
-        </w:tc>
-      </w:tr>
-    </w:tbl>
     <w:p>
       <w:pPr>
-        <w:spacing w:after="100" w:before="40"/>
+        <w:spacing w:after="120"/>
+        <w:jc w:val="both"/>
+      </w:pPr>
+      <w:r>
+        <w:t xml:space="preserve">Las competencias se miden con una </w:t>
+      </w:r>
+      <w:r>
+        <w:rPr>
+          <w:b/>
+          <w:bCs/>
+        </w:rPr>
+        <w:t xml:space="preserve">prueba práctica de 2 horas</w:t>
+      </w:r>
+      <w:r>
+        <w:t xml:space="preserve"> en las semanas 1 y 12, con cinco tareas equivalentes: diagnosticar un cuello de botella, optimizar una consulta con </w:t>
+      </w:r>
+      <w:r>
+        <w:rPr>
+          <w:i/>
+          <w:iCs/>
+        </w:rPr>
+        <w:t xml:space="preserve">explain()</w:t>
+      </w:r>
+      <w:r>
+        <w:t xml:space="preserve">, desplegar y revertir con Helm, configurar el HPA y resolver una incidencia. Cada tarea se califica de 0 a 4 (0: no la resuelve; 1: con ayuda constante; 2: con ayuda puntual; 3: sin ayuda; 4: sin ayuda y justificando sus decisiones). El mentor y el coordinador califican juntos; la meta es que la media del grupo suba al menos un 25 %.</w:t>
+      </w:r>
+    </w:p>
+    <w:p>
+      <w:pPr>
+        <w:pStyle w:val="Heading1"/>
+      </w:pPr>
+      <w:r>
+        <w:t xml:space="preserve">8. Ejercicio 4. Sistema de retroalimentación</w:t>
+      </w:r>
+    </w:p>
+    <w:p>
+      <w:pPr>
+        <w:spacing w:after="120"/>
+        <w:jc w:val="both"/>
+      </w:pPr>
+      <w:r>
+        <w:t xml:space="preserve">El sistema sigue un ciclo de cinco pasos que se repite al terminar cada sesión:</w:t>
+      </w:r>
+    </w:p>
+    <w:p>
+      <w:pPr>
+        <w:keepNext/>
+        <w:spacing w:after="60" w:before="120"/>
         <w:jc w:val="center"/>
       </w:pPr>
       <w:r>
@@ -17079,6 +15095,53 @@
     </w:p>
     <w:p>
       <w:pPr>
+        <w:keepNext/>
+        <w:spacing w:after="0" w:before="60" w:line="240" w:lineRule="auto"/>
+        <w:jc w:val="center"/>
+      </w:pPr>
+      <w:r>
+        <w:drawing>
+          <wp:inline distT="0" distB="0" distL="0" distR="0">
+            <wp:extent cx="5143500" cy="857250"/>
+            <wp:effectExtent t="0" r="0" b="0" l="0"/>
+            <wp:docPr id="1" name="" descr="" title=""/>
+            <wp:cNvGraphicFramePr>
+              <a:graphicFrameLocks xmlns:a="http://schemas.openxmlformats.org/drawingml/2006/main" noChangeAspect="1"/>
+            </wp:cNvGraphicFramePr>
+            <a:graphic xmlns:a="http://schemas.openxmlformats.org/drawingml/2006/main">
+              <a:graphicData uri="http://schemas.openxmlformats.org/drawingml/2006/picture">
+                <pic:pic xmlns:pic="http://schemas.openxmlformats.org/drawingml/2006/picture">
+                  <pic:nvPicPr>
+                    <pic:cNvPr id="0" name="" descr=""/>
+                    <pic:cNvPicPr>
+                      <a:picLocks noChangeAspect="1" noChangeArrowheads="1"/>
+                    </pic:cNvPicPr>
+                  </pic:nvPicPr>
+                  <pic:blipFill>
+                    <a:blip r:embed="rId9" cstate="none"/>
+                    <a:srcRect/>
+                    <a:stretch>
+                      <a:fillRect/>
+                    </a:stretch>
+                  </pic:blipFill>
+                  <pic:spPr bwMode="auto">
+                    <a:xfrm>
+                      <a:off x="0" y="0"/>
+                      <a:ext cx="5143500" cy="857250"/>
+                    </a:xfrm>
+                    <a:prstGeom prst="rect">
+                      <a:avLst/>
+                    </a:prstGeom>
+                  </pic:spPr>
+                </pic:pic>
+              </a:graphicData>
+            </a:graphic>
+          </wp:inline>
+        </w:drawing>
+      </w:r>
+    </w:p>
+    <w:p>
+      <w:pPr>
         <w:pStyle w:val="Heading2"/>
       </w:pPr>
       <w:r>
@@ -17091,7 +15154,17 @@
         <w:jc w:val="both"/>
       </w:pPr>
       <w:r>
-        <w:t xml:space="preserve">Al cierre de cada sesión, los participantes responden una </w:t>
+        <w:t xml:space="preserve">Al cierre de cada sesión se hace una </w:t>
+      </w:r>
+      <w:r>
+        <w:rPr>
+          <w:b/>
+          <w:bCs/>
+        </w:rPr>
+        <w:t xml:space="preserve">retrospectiva</w:t>
+      </w:r>
+      <w:r>
+        <w:t xml:space="preserve"> (¿qué funcionó?, ¿qué nos dificultó? y ¿qué cambiamos?) y cada participante responde una </w:t>
       </w:r>
       <w:r>
         <w:rPr>
@@ -17101,7 +15174,24 @@
         <w:t xml:space="preserve">encuesta anónima de 3 minutos</w:t>
       </w:r>
       <w:r>
-        <w:t xml:space="preserve"> con una escala del 1 (muy en desacuerdo) al 5 (muy de acuerdo):</w:t>
+        <w:t xml:space="preserve">, con escala del 1 (muy en desacuerdo) al 5 (muy de acuerdo):</w:t>
+      </w:r>
+    </w:p>
+    <w:p>
+      <w:pPr>
+        <w:keepNext/>
+        <w:spacing w:after="60" w:before="120"/>
+        <w:jc w:val="center"/>
+      </w:pPr>
+      <w:r>
+        <w:rPr>
+          <w:i/>
+          <w:iCs/>
+          <w:color w:val="404040"/>
+          <w:sz w:val="20"/>
+          <w:szCs w:val="20"/>
+        </w:rPr>
+        <w:t xml:space="preserve">Tabla 10. Encuesta de cierre de sesión.</w:t>
       </w:r>
     </w:p>
     <w:tbl>
@@ -17831,18 +15921,22 @@
     </w:tbl>
     <w:p>
       <w:pPr>
-        <w:spacing w:after="100" w:before="40"/>
-        <w:jc w:val="center"/>
+        <w:spacing w:after="0" w:before="0" w:line="200" w:lineRule="auto"/>
       </w:pPr>
       <w:r>
         <w:rPr>
-          <w:i/>
-          <w:iCs/>
-          <w:color w:val="404040"/>
-          <w:sz w:val="20"/>
-          <w:szCs w:val="20"/>
+          <w:sz w:val="10"/>
+          <w:szCs w:val="10"/>
         </w:rPr>
-        <w:t xml:space="preserve">Tabla 10. Encuesta de cierre de sesión.</w:t>
+        <w:t xml:space="preserve"/>
+      </w:r>
+    </w:p>
+    <w:p>
+      <w:pPr>
+        <w:pStyle w:val="Heading2"/>
+      </w:pPr>
+      <w:r>
+        <w:t xml:space="preserve">8.2. Análisis y reglas de ajuste</w:t>
       </w:r>
     </w:p>
     <w:p>
@@ -17851,54 +15945,7 @@
         <w:jc w:val="both"/>
       </w:pPr>
       <w:r>
-        <w:t xml:space="preserve">Se complementa con la </w:t>
-      </w:r>
-      <w:r>
-        <w:rPr>
-          <w:b/>
-          <w:bCs/>
-        </w:rPr>
-        <w:t xml:space="preserve">retrospectiva</w:t>
-      </w:r>
-      <w:r>
-        <w:t xml:space="preserve"> (¿qué funcionó?, ¿qué nos dificultó? y ¿qué cambiamos?), el registro de obstáculos del </w:t>
-      </w:r>
-      <w:r>
-        <w:rPr>
-          <w:b/>
-          <w:bCs/>
-        </w:rPr>
-        <w:t xml:space="preserve">tablero</w:t>
-      </w:r>
-      <w:r>
-        <w:t xml:space="preserve"> y la </w:t>
-      </w:r>
-      <w:r>
-        <w:rPr>
-          <w:b/>
-          <w:bCs/>
-        </w:rPr>
-        <w:t xml:space="preserve">revisión de entregables</w:t>
-      </w:r>
-      <w:r>
-        <w:t xml:space="preserve">.</w:t>
-      </w:r>
-    </w:p>
-    <w:p>
-      <w:pPr>
-        <w:pStyle w:val="Heading2"/>
-      </w:pPr>
-      <w:r>
-        <w:t xml:space="preserve">8.2. Análisis y reglas de ajuste</w:t>
-      </w:r>
-    </w:p>
-    <w:p>
-      <w:pPr>
-        <w:spacing w:after="120"/>
-        <w:jc w:val="both"/>
-      </w:pPr>
-      <w:r>
-        <w:t xml:space="preserve">El coordinador consolida los resultados en 24 horas, calcula la media de cada pregunta y agrupa los comentarios por categoría. Se aplican estas reglas:</w:t>
+        <w:t xml:space="preserve">El coordinador consolida los resultados en 24 horas y aplica estas reglas:</w:t>
       </w:r>
     </w:p>
     <w:p>
@@ -18021,7 +16068,7 @@
         <w:t xml:space="preserve">un máximo de tres acciones</w:t>
       </w:r>
       <w:r>
-        <w:t xml:space="preserve"> (problema, acción, responsable, fecha y evidencia), que se verifican al inicio de la sesión siguiente. El patrocinador recibe un informe quincenal. El sistema será eficaz si el 80 % responde cada encuesta, el 80 % de las acciones se completa a tiempo y la media de la encuesta aumenta a lo largo del programa.</w:t>
+        <w:t xml:space="preserve"> (problema, acción, responsable, fecha y evidencia), que se verifican al inicio de la sesión siguiente. El sistema será eficaz si el 80 % responde cada encuesta, el 80 % de las acciones se cumple a tiempo y la media de la encuesta sube a lo largo del programa.</w:t>
       </w:r>
     </w:p>
     <w:p>
@@ -18038,7 +16085,7 @@
         <w:jc w:val="both"/>
       </w:pPr>
       <w:r>
-        <w:t xml:space="preserve">Organizar el Dojo alrededor de un reto real, la caída del portal por encima de los 5 000 usuarios, hace que cada sesión produzca un avance medible sobre un problema del negocio. La propuesta parte de una idea central: </w:t>
+        <w:t xml:space="preserve">Organizar el Dojo alrededor de un reto real hace que cada sesión produzca un avance medible sobre un problema del negocio. La idea central es que </w:t>
       </w:r>
       <w:r>
         <w:rPr>
@@ -18048,7 +16095,7 @@
         <w:t xml:space="preserve">Kubernetes por sí solo no resuelve el problema</w:t>
       </w:r>
       <w:r>
-        <w:t xml:space="preserve">. Si se escalara la aplicación sin optimizar MongoDB, el aumento de pods multiplicaría las conexiones y la base de datos caería antes. Por eso el cronograma avanza de forma progresiva: medir, optimizar, contenerizar, orquestar, escalar y comprobar la resiliencia, con objetivos SMART, un equipo multidisciplinario que incluye al DBA y un alcance delimitado a pre-producción.</w:t>
+        <w:t xml:space="preserve">: sin optimizar MongoDB, más pods solo significarían más conexiones y caídas más rápidas. Por eso el cronograma avanza de medir a optimizar, orquestar, escalar y comprobar la resiliencia.</w:t>
       </w:r>
     </w:p>
     <w:p>
@@ -18057,7 +16104,7 @@
         <w:jc w:val="both"/>
       </w:pPr>
       <w:r>
-        <w:t xml:space="preserve">Las métricas permitirán demostrar con datos si se alcanzan los 10 000 usuarios, y la retroalimentación corregirá el programa cada semana. Se recomienda aprobar la migración a producción solo si se cumplen las metas, y realizarla de forma gradual.</w:t>
+        <w:t xml:space="preserve">Las métricas permitirán demostrar si se alcanzan los 10 000 usuarios y la retroalimentación corregirá el programa cada semana; la migración a producción solo debería aprobarse si se cumplen las metas.</w:t>
       </w:r>
     </w:p>
     <w:p>
@@ -18070,7 +16117,7 @@
     </w:p>
     <w:p>
       <w:pPr>
-        <w:spacing w:after="100" w:line="240" w:lineRule="auto"/>
+        <w:spacing w:after="60" w:line="240" w:lineRule="auto"/>
         <w:ind w:left="720" w:hanging="720"/>
         <w:jc w:val="left"/>
       </w:pPr>
@@ -18087,7 +16134,7 @@
       <w:r>
         <w:t xml:space="preserve">. Google Cloud. </w:t>
       </w:r>
-      <w:hyperlink w:history="1" r:id="rIdyfi_pkelrivxhyndkizyg">
+      <w:hyperlink w:history="1" r:id="rIdws0la80kycv3xew168whx">
         <w:r>
           <w:rPr>
             <w:rStyle w:val="Hyperlink"/>
@@ -18098,7 +16145,7 @@
     </w:p>
     <w:p>
       <w:pPr>
-        <w:spacing w:after="100" w:line="240" w:lineRule="auto"/>
+        <w:spacing w:after="60" w:line="240" w:lineRule="auto"/>
         <w:ind w:left="720" w:hanging="720"/>
         <w:jc w:val="left"/>
       </w:pPr>
@@ -18118,7 +16165,7 @@
     </w:p>
     <w:p>
       <w:pPr>
-        <w:spacing w:after="100" w:line="240" w:lineRule="auto"/>
+        <w:spacing w:after="60" w:line="240" w:lineRule="auto"/>
         <w:ind w:left="720" w:hanging="720"/>
         <w:jc w:val="left"/>
       </w:pPr>
@@ -18138,7 +16185,7 @@
     </w:p>
     <w:p>
       <w:pPr>
-        <w:spacing w:after="100" w:line="240" w:lineRule="auto"/>
+        <w:spacing w:after="60" w:line="240" w:lineRule="auto"/>
         <w:ind w:left="720" w:hanging="720"/>
         <w:jc w:val="left"/>
       </w:pPr>
@@ -18155,7 +16202,7 @@
       <w:r>
         <w:t xml:space="preserve">. </w:t>
       </w:r>
-      <w:hyperlink w:history="1" r:id="rId5yee_iqocrkir0psh4czb">
+      <w:hyperlink w:history="1" r:id="rId8zsoftas3hz2w_lgcddoz">
         <w:r>
           <w:rPr>
             <w:rStyle w:val="Hyperlink"/>
@@ -18166,7 +16213,7 @@
     </w:p>
     <w:p>
       <w:pPr>
-        <w:spacing w:after="100" w:line="240" w:lineRule="auto"/>
+        <w:spacing w:after="60" w:line="240" w:lineRule="auto"/>
         <w:ind w:left="720" w:hanging="720"/>
         <w:jc w:val="left"/>
       </w:pPr>
@@ -18183,7 +16230,7 @@
       <w:r>
         <w:t xml:space="preserve">. MongoDB Manual. Recuperado el 28 de octubre de 2026, de </w:t>
       </w:r>
-      <w:hyperlink w:history="1" r:id="rIdmnmuykpoqptbam0liv_gc">
+      <w:hyperlink w:history="1" r:id="rIdt7qz5akp4zvpfsx34xlfw">
         <w:r>
           <w:rPr>
             <w:rStyle w:val="Hyperlink"/>
@@ -18194,7 +16241,7 @@
     </w:p>
     <w:p>
       <w:pPr>
-        <w:spacing w:after="100" w:line="240" w:lineRule="auto"/>
+        <w:spacing w:after="60" w:line="240" w:lineRule="auto"/>
         <w:ind w:left="720" w:hanging="720"/>
         <w:jc w:val="left"/>
       </w:pPr>
@@ -18211,7 +16258,7 @@
       <w:r>
         <w:t xml:space="preserve">. Kubernetes Documentation. Recuperado el 28 de octubre de 2026, de </w:t>
       </w:r>
-      <w:hyperlink w:history="1" r:id="rIdaandxdzs9gbg-jjkgejsf">
+      <w:hyperlink w:history="1" r:id="rIdvcujtbhaxt3d2mnao4s3g">
         <w:r>
           <w:rPr>
             <w:rStyle w:val="Hyperlink"/>
@@ -18223,7 +16270,7 @@
     <w:sectPr>
       <w:footerReference w:type="default" r:id="rId7"/>
       <w:pgSz w:w="11906" w:h="16838" w:orient="portrait"/>
-      <w:pgMar w:top="1418" w:right="1418" w:bottom="1418" w:left="1418" w:header="708" w:footer="708" w:gutter="0"/>
+      <w:pgMar w:top="1134" w:right="1418" w:bottom="1134" w:left="1418" w:header="708" w:footer="708" w:gutter="0"/>
       <w:pgNumType w:start="1"/>
       <w:docGrid w:linePitch="360"/>
     </w:sectPr>

</xml_diff>